<commit_message>
Deploy: install dependencies with npm install instead of npm ci
deploy/remote.sh now runs npm install --omit=dev before npm run build,
matching the company_profiles repo's deploy.yml. The Word guides say
so, and the English overview diagram no longer wraps.

Co-Authored-By: Claude Opus 5.5 <noreply@anthropic.com>
</commit_message>
<xml_diff>
--- a/docs/Deployment_Guide_en.docx
+++ b/docs/Deployment_Guide_en.docx
@@ -125,7 +125,7 @@
           <w:sz w:val="18"/>
           <w:szCs w:val="18"/>
         </w:rPr>
-        <w:t xml:space="preserve">deploy/setup-server.sh  --ssh--&gt;  one-time: installs Node, creates the user, dirs and systemd service</w:t>
+        <w:t xml:space="preserve">deploy/setup-server.sh  --ssh--&gt;  one-time: Node, service user, dirs, systemd unit</w:t>
       </w:r>
     </w:p>
     <w:p>
@@ -271,22 +271,37 @@
         <w:rPr>
           <w:rFonts w:ascii="Calibri" w:cs="Calibri" w:eastAsia="Microsoft JhengHei" w:hAnsi="Calibri"/>
         </w:rPr>
-        <w:t xml:space="preserve">Each deploy creates a new release directory, and the </w:t>
-      </w:r>
-      <w:r>
-        <w:rPr>
-          <w:rFonts w:ascii="Consolas" w:cs="Consolas" w:eastAsia="Microsoft JhengHei" w:hAnsi="Consolas"/>
-          <w:color w:val="7A2E0E"/>
-          <w:sz w:val="19"/>
-          <w:szCs w:val="19"/>
-        </w:rPr>
-        <w:t xml:space="preserve">current</w:t>
-      </w:r>
-      <w:r>
-        <w:rPr>
-          <w:rFonts w:ascii="Calibri" w:cs="Calibri" w:eastAsia="Microsoft JhengHei" w:hAnsi="Calibri"/>
-        </w:rPr>
-        <w:t xml:space="preserve"> symlink switches over in one atomic step. The newest 5 releases are kept, so you can roll back at any time.</w:t>
+        <w:t xml:space="preserve">On the server, each release runs </w:t>
+      </w:r>
+      <w:r>
+        <w:rPr>
+          <w:rFonts w:ascii="Consolas" w:cs="Consolas" w:eastAsia="Microsoft JhengHei" w:hAnsi="Consolas"/>
+          <w:color w:val="7A2E0E"/>
+          <w:sz w:val="19"/>
+          <w:szCs w:val="19"/>
+        </w:rPr>
+        <w:t xml:space="preserve">npm install</w:t>
+      </w:r>
+      <w:r>
+        <w:rPr>
+          <w:rFonts w:ascii="Calibri" w:cs="Calibri" w:eastAsia="Microsoft JhengHei" w:hAnsi="Calibri"/>
+        </w:rPr>
+        <w:t xml:space="preserve"> (production dependencies) and then </w:t>
+      </w:r>
+      <w:r>
+        <w:rPr>
+          <w:rFonts w:ascii="Consolas" w:cs="Consolas" w:eastAsia="Microsoft JhengHei" w:hAnsi="Consolas"/>
+          <w:color w:val="7A2E0E"/>
+          <w:sz w:val="19"/>
+          <w:szCs w:val="19"/>
+        </w:rPr>
+        <w:t xml:space="preserve">npm run build</w:t>
+      </w:r>
+      <w:r>
+        <w:rPr>
+          <w:rFonts w:ascii="Calibri" w:cs="Calibri" w:eastAsia="Microsoft JhengHei" w:hAnsi="Calibri"/>
+        </w:rPr>
+        <w:t xml:space="preserve">, the pre-deploy check. It stops the deploy, before anything is switched, if the Node version is unsupported, a JS file has a syntax error or a dependency is missing.</w:t>
       </w:r>
     </w:p>
     <w:p>
@@ -302,22 +317,22 @@
         <w:rPr>
           <w:rFonts w:ascii="Calibri" w:cs="Calibri" w:eastAsia="Microsoft JhengHei" w:hAnsi="Calibri"/>
         </w:rPr>
-        <w:t xml:space="preserve">The service runs as a dedicated system user (</w:t>
-      </w:r>
-      <w:r>
-        <w:rPr>
-          <w:rFonts w:ascii="Consolas" w:cs="Consolas" w:eastAsia="Microsoft JhengHei" w:hAnsi="Consolas"/>
-          <w:color w:val="7A2E0E"/>
-          <w:sz w:val="19"/>
-          <w:szCs w:val="19"/>
-        </w:rPr>
-        <w:t xml:space="preserve">stockapp</w:t>
-      </w:r>
-      <w:r>
-        <w:rPr>
-          <w:rFonts w:ascii="Calibri" w:cs="Calibri" w:eastAsia="Microsoft JhengHei" w:hAnsi="Calibri"/>
-        </w:rPr>
-        <w:t xml:space="preserve"> by default, no login shell). systemd manages it: the service starts on boot and restarts if it crashes.</w:t>
+        <w:t xml:space="preserve">Each deploy creates a new release directory, and the </w:t>
+      </w:r>
+      <w:r>
+        <w:rPr>
+          <w:rFonts w:ascii="Consolas" w:cs="Consolas" w:eastAsia="Microsoft JhengHei" w:hAnsi="Consolas"/>
+          <w:color w:val="7A2E0E"/>
+          <w:sz w:val="19"/>
+          <w:szCs w:val="19"/>
+        </w:rPr>
+        <w:t xml:space="preserve">current</w:t>
+      </w:r>
+      <w:r>
+        <w:rPr>
+          <w:rFonts w:ascii="Calibri" w:cs="Calibri" w:eastAsia="Microsoft JhengHei" w:hAnsi="Calibri"/>
+        </w:rPr>
+        <w:t xml:space="preserve"> symlink switches over in one atomic step. The newest 5 releases are kept, so you can roll back at any time.</w:t>
       </w:r>
     </w:p>
     <w:p>
@@ -333,54 +348,22 @@
         <w:rPr>
           <w:rFonts w:ascii="Calibri" w:cs="Calibri" w:eastAsia="Microsoft JhengHei" w:hAnsi="Calibri"/>
         </w:rPr>
-        <w:t xml:space="preserve">After each deploy, a health check requests </w:t>
-      </w:r>
-      <w:r>
-        <w:rPr>
-          <w:rFonts w:ascii="Consolas" w:cs="Consolas" w:eastAsia="Microsoft JhengHei" w:hAnsi="Consolas"/>
-          <w:color w:val="7A2E0E"/>
-          <w:sz w:val="19"/>
-          <w:szCs w:val="19"/>
-        </w:rPr>
-        <w:t xml:space="preserve">http://127.0.0.1:&lt;PORT&gt;/config.js</w:t>
-      </w:r>
-      <w:r>
-        <w:rPr>
-          <w:rFonts w:ascii="Calibri" w:cs="Calibri" w:eastAsia="Microsoft JhengHei" w:hAnsi="Calibri"/>
-        </w:rPr>
-        <w:t xml:space="preserve"> and waits up to 20 seconds for an answer. </w:t>
-      </w:r>
-      <w:r>
-        <w:rPr>
-          <w:rFonts w:ascii="Calibri" w:cs="Calibri" w:eastAsia="Microsoft JhengHei" w:hAnsi="Calibri"/>
-          <w:b/>
-          <w:bCs/>
-        </w:rPr>
-        <w:t xml:space="preserve">If the new release doesn't come up, the previous release is restored automatically.</w:t>
-      </w:r>
-    </w:p>
-    <w:p>
-      <w:pPr>
-        <w:pStyle w:val="Heading1"/>
-      </w:pPr>
-      <w:r>
-        <w:rPr>
-          <w:rFonts w:ascii="Calibri" w:cs="Calibri" w:eastAsia="Microsoft JhengHei" w:hAnsi="Calibri"/>
-        </w:rPr>
-        <w:t xml:space="preserve">2. Requirements</w:t>
-      </w:r>
-    </w:p>
-    <w:p>
-      <w:pPr>
-        <w:spacing w:after="120"/>
-      </w:pPr>
-      <w:r>
-        <w:rPr>
-          <w:rFonts w:ascii="Calibri" w:cs="Calibri" w:eastAsia="Microsoft JhengHei" w:hAnsi="Calibri"/>
-          <w:b/>
-          <w:bCs/>
-        </w:rPr>
-        <w:t xml:space="preserve">Server</w:t>
+        <w:t xml:space="preserve">The service runs as a dedicated system user (</w:t>
+      </w:r>
+      <w:r>
+        <w:rPr>
+          <w:rFonts w:ascii="Consolas" w:cs="Consolas" w:eastAsia="Microsoft JhengHei" w:hAnsi="Consolas"/>
+          <w:color w:val="7A2E0E"/>
+          <w:sz w:val="19"/>
+          <w:szCs w:val="19"/>
+        </w:rPr>
+        <w:t xml:space="preserve">stockapp</w:t>
+      </w:r>
+      <w:r>
+        <w:rPr>
+          <w:rFonts w:ascii="Calibri" w:cs="Calibri" w:eastAsia="Microsoft JhengHei" w:hAnsi="Calibri"/>
+        </w:rPr>
+        <w:t xml:space="preserve"> by default, no login shell). systemd manages it: the service starts on boot and restarts if it crashes.</w:t>
       </w:r>
     </w:p>
     <w:p>
@@ -396,7 +379,54 @@
         <w:rPr>
           <w:rFonts w:ascii="Calibri" w:cs="Calibri" w:eastAsia="Microsoft JhengHei" w:hAnsi="Calibri"/>
         </w:rPr>
-        <w:t xml:space="preserve">A Linux distribution that uses systemd (Ubuntu 20.04+, Debian 11+, RHEL/Rocky/Alma 8+, etc.).</w:t>
+        <w:t xml:space="preserve">After each deploy, a health check requests </w:t>
+      </w:r>
+      <w:r>
+        <w:rPr>
+          <w:rFonts w:ascii="Consolas" w:cs="Consolas" w:eastAsia="Microsoft JhengHei" w:hAnsi="Consolas"/>
+          <w:color w:val="7A2E0E"/>
+          <w:sz w:val="19"/>
+          <w:szCs w:val="19"/>
+        </w:rPr>
+        <w:t xml:space="preserve">http://127.0.0.1:&lt;PORT&gt;/config.js</w:t>
+      </w:r>
+      <w:r>
+        <w:rPr>
+          <w:rFonts w:ascii="Calibri" w:cs="Calibri" w:eastAsia="Microsoft JhengHei" w:hAnsi="Calibri"/>
+        </w:rPr>
+        <w:t xml:space="preserve"> and waits up to 20 seconds for an answer. </w:t>
+      </w:r>
+      <w:r>
+        <w:rPr>
+          <w:rFonts w:ascii="Calibri" w:cs="Calibri" w:eastAsia="Microsoft JhengHei" w:hAnsi="Calibri"/>
+          <w:b/>
+          <w:bCs/>
+        </w:rPr>
+        <w:t xml:space="preserve">If the new release doesn't come up, the previous release is restored automatically.</w:t>
+      </w:r>
+    </w:p>
+    <w:p>
+      <w:pPr>
+        <w:pStyle w:val="Heading1"/>
+      </w:pPr>
+      <w:r>
+        <w:rPr>
+          <w:rFonts w:ascii="Calibri" w:cs="Calibri" w:eastAsia="Microsoft JhengHei" w:hAnsi="Calibri"/>
+        </w:rPr>
+        <w:t xml:space="preserve">2. Requirements</w:t>
+      </w:r>
+    </w:p>
+    <w:p>
+      <w:pPr>
+        <w:spacing w:after="120"/>
+      </w:pPr>
+      <w:r>
+        <w:rPr>
+          <w:rFonts w:ascii="Calibri" w:cs="Calibri" w:eastAsia="Microsoft JhengHei" w:hAnsi="Calibri"/>
+          <w:b/>
+          <w:bCs/>
+        </w:rPr>
+        <w:t xml:space="preserve">Server</w:t>
       </w:r>
     </w:p>
     <w:p>
@@ -410,78 +440,9 @@
       </w:pPr>
       <w:r>
         <w:rPr>
-          <w:rFonts w:ascii="Consolas" w:cs="Consolas" w:eastAsia="Microsoft JhengHei" w:hAnsi="Consolas"/>
-          <w:color w:val="7A2E0E"/>
-          <w:sz w:val="19"/>
-          <w:szCs w:val="19"/>
-        </w:rPr>
-        <w:t xml:space="preserve">curl</w:t>
-      </w:r>
-      <w:r>
-        <w:rPr>
-          <w:rFonts w:ascii="Calibri" w:cs="Calibri" w:eastAsia="Microsoft JhengHei" w:hAnsi="Calibri"/>
-        </w:rPr>
-        <w:t xml:space="preserve">, </w:t>
-      </w:r>
-      <w:r>
-        <w:rPr>
-          <w:rFonts w:ascii="Consolas" w:cs="Consolas" w:eastAsia="Microsoft JhengHei" w:hAnsi="Consolas"/>
-          <w:color w:val="7A2E0E"/>
-          <w:sz w:val="19"/>
-          <w:szCs w:val="19"/>
-        </w:rPr>
-        <w:t xml:space="preserve">tar</w:t>
-      </w:r>
-      <w:r>
-        <w:rPr>
-          <w:rFonts w:ascii="Calibri" w:cs="Calibri" w:eastAsia="Microsoft JhengHei" w:hAnsi="Calibri"/>
-        </w:rPr>
-        <w:t xml:space="preserve"> and </w:t>
-      </w:r>
-      <w:r>
-        <w:rPr>
-          <w:rFonts w:ascii="Consolas" w:cs="Consolas" w:eastAsia="Microsoft JhengHei" w:hAnsi="Consolas"/>
-          <w:color w:val="7A2E0E"/>
-          <w:sz w:val="19"/>
-          <w:szCs w:val="19"/>
-        </w:rPr>
-        <w:t xml:space="preserve">sudo</w:t>
-      </w:r>
-      <w:r>
-        <w:rPr>
-          <w:rFonts w:ascii="Calibri" w:cs="Calibri" w:eastAsia="Microsoft JhengHei" w:hAnsi="Calibri"/>
-        </w:rPr>
-        <w:t xml:space="preserve"> installed (Ubuntu/Debian: </w:t>
-      </w:r>
-      <w:r>
-        <w:rPr>
-          <w:rFonts w:ascii="Consolas" w:cs="Consolas" w:eastAsia="Microsoft JhengHei" w:hAnsi="Consolas"/>
-          <w:color w:val="7A2E0E"/>
-          <w:sz w:val="19"/>
-          <w:szCs w:val="19"/>
-        </w:rPr>
-        <w:t xml:space="preserve">sudo apt install curl tar sudo</w:t>
-      </w:r>
-      <w:r>
-        <w:rPr>
-          <w:rFonts w:ascii="Calibri" w:cs="Calibri" w:eastAsia="Microsoft JhengHei" w:hAnsi="Calibri"/>
-        </w:rPr>
-        <w:t xml:space="preserve">; RHEL family: </w:t>
-      </w:r>
-      <w:r>
-        <w:rPr>
-          <w:rFonts w:ascii="Consolas" w:cs="Consolas" w:eastAsia="Microsoft JhengHei" w:hAnsi="Consolas"/>
-          <w:color w:val="7A2E0E"/>
-          <w:sz w:val="19"/>
-          <w:szCs w:val="19"/>
-        </w:rPr>
-        <w:t xml:space="preserve">sudo dnf install curl tar sudo</w:t>
-      </w:r>
-      <w:r>
-        <w:rPr>
-          <w:rFonts w:ascii="Calibri" w:cs="Calibri" w:eastAsia="Microsoft JhengHei" w:hAnsi="Calibri"/>
-        </w:rPr>
-        <w:t xml:space="preserve">).</w:t>
+          <w:rFonts w:ascii="Calibri" w:cs="Calibri" w:eastAsia="Microsoft JhengHei" w:hAnsi="Calibri"/>
+        </w:rPr>
+        <w:t xml:space="preserve">A Linux distribution that uses systemd (Ubuntu 20.04+, Debian 11+, RHEL/Rocky/Alma 8+, etc.).</w:t>
       </w:r>
     </w:p>
     <w:p>
@@ -495,9 +456,33 @@
       </w:pPr>
       <w:r>
         <w:rPr>
-          <w:rFonts w:ascii="Calibri" w:cs="Calibri" w:eastAsia="Microsoft JhengHei" w:hAnsi="Calibri"/>
-        </w:rPr>
-        <w:t xml:space="preserve">An account you can SSH into with a key and that has </w:t>
+          <w:rFonts w:ascii="Consolas" w:cs="Consolas" w:eastAsia="Microsoft JhengHei" w:hAnsi="Consolas"/>
+          <w:color w:val="7A2E0E"/>
+          <w:sz w:val="19"/>
+          <w:szCs w:val="19"/>
+        </w:rPr>
+        <w:t xml:space="preserve">curl</w:t>
+      </w:r>
+      <w:r>
+        <w:rPr>
+          <w:rFonts w:ascii="Calibri" w:cs="Calibri" w:eastAsia="Microsoft JhengHei" w:hAnsi="Calibri"/>
+        </w:rPr>
+        <w:t xml:space="preserve">, </w:t>
+      </w:r>
+      <w:r>
+        <w:rPr>
+          <w:rFonts w:ascii="Consolas" w:cs="Consolas" w:eastAsia="Microsoft JhengHei" w:hAnsi="Consolas"/>
+          <w:color w:val="7A2E0E"/>
+          <w:sz w:val="19"/>
+          <w:szCs w:val="19"/>
+        </w:rPr>
+        <w:t xml:space="preserve">tar</w:t>
+      </w:r>
+      <w:r>
+        <w:rPr>
+          <w:rFonts w:ascii="Calibri" w:cs="Calibri" w:eastAsia="Microsoft JhengHei" w:hAnsi="Calibri"/>
+        </w:rPr>
+        <w:t xml:space="preserve"> and </w:t>
       </w:r>
       <w:r>
         <w:rPr>
@@ -512,22 +497,37 @@
         <w:rPr>
           <w:rFonts w:ascii="Calibri" w:cs="Calibri" w:eastAsia="Microsoft JhengHei" w:hAnsi="Calibri"/>
         </w:rPr>
-        <w:t xml:space="preserve"> rights (the "deploy user", e.g. </w:t>
-      </w:r>
-      <w:r>
-        <w:rPr>
-          <w:rFonts w:ascii="Consolas" w:cs="Consolas" w:eastAsia="Microsoft JhengHei" w:hAnsi="Consolas"/>
-          <w:color w:val="7A2E0E"/>
-          <w:sz w:val="19"/>
-          <w:szCs w:val="19"/>
-        </w:rPr>
-        <w:t xml:space="preserve">deploy</w:t>
-      </w:r>
-      <w:r>
-        <w:rPr>
-          <w:rFonts w:ascii="Calibri" w:cs="Calibri" w:eastAsia="Microsoft JhengHei" w:hAnsi="Calibri"/>
-        </w:rPr>
-        <w:t xml:space="preserve">). Only the first-time setup asks for the sudo password. Later deploys don't need it.</w:t>
+        <w:t xml:space="preserve"> installed (Ubuntu/Debian: </w:t>
+      </w:r>
+      <w:r>
+        <w:rPr>
+          <w:rFonts w:ascii="Consolas" w:cs="Consolas" w:eastAsia="Microsoft JhengHei" w:hAnsi="Consolas"/>
+          <w:color w:val="7A2E0E"/>
+          <w:sz w:val="19"/>
+          <w:szCs w:val="19"/>
+        </w:rPr>
+        <w:t xml:space="preserve">sudo apt install curl tar sudo</w:t>
+      </w:r>
+      <w:r>
+        <w:rPr>
+          <w:rFonts w:ascii="Calibri" w:cs="Calibri" w:eastAsia="Microsoft JhengHei" w:hAnsi="Calibri"/>
+        </w:rPr>
+        <w:t xml:space="preserve">; RHEL family: </w:t>
+      </w:r>
+      <w:r>
+        <w:rPr>
+          <w:rFonts w:ascii="Consolas" w:cs="Consolas" w:eastAsia="Microsoft JhengHei" w:hAnsi="Consolas"/>
+          <w:color w:val="7A2E0E"/>
+          <w:sz w:val="19"/>
+          <w:szCs w:val="19"/>
+        </w:rPr>
+        <w:t xml:space="preserve">sudo dnf install curl tar sudo</w:t>
+      </w:r>
+      <w:r>
+        <w:rPr>
+          <w:rFonts w:ascii="Calibri" w:cs="Calibri" w:eastAsia="Microsoft JhengHei" w:hAnsi="Calibri"/>
+        </w:rPr>
+        <w:t xml:space="preserve">).</w:t>
       </w:r>
     </w:p>
     <w:p>
@@ -543,6 +543,52 @@
         <w:rPr>
           <w:rFonts w:ascii="Calibri" w:cs="Calibri" w:eastAsia="Microsoft JhengHei" w:hAnsi="Calibri"/>
         </w:rPr>
+        <w:t xml:space="preserve">An account you can SSH into with a key and that has </w:t>
+      </w:r>
+      <w:r>
+        <w:rPr>
+          <w:rFonts w:ascii="Consolas" w:cs="Consolas" w:eastAsia="Microsoft JhengHei" w:hAnsi="Consolas"/>
+          <w:color w:val="7A2E0E"/>
+          <w:sz w:val="19"/>
+          <w:szCs w:val="19"/>
+        </w:rPr>
+        <w:t xml:space="preserve">sudo</w:t>
+      </w:r>
+      <w:r>
+        <w:rPr>
+          <w:rFonts w:ascii="Calibri" w:cs="Calibri" w:eastAsia="Microsoft JhengHei" w:hAnsi="Calibri"/>
+        </w:rPr>
+        <w:t xml:space="preserve"> rights (the "deploy user", e.g. </w:t>
+      </w:r>
+      <w:r>
+        <w:rPr>
+          <w:rFonts w:ascii="Consolas" w:cs="Consolas" w:eastAsia="Microsoft JhengHei" w:hAnsi="Consolas"/>
+          <w:color w:val="7A2E0E"/>
+          <w:sz w:val="19"/>
+          <w:szCs w:val="19"/>
+        </w:rPr>
+        <w:t xml:space="preserve">deploy</w:t>
+      </w:r>
+      <w:r>
+        <w:rPr>
+          <w:rFonts w:ascii="Calibri" w:cs="Calibri" w:eastAsia="Microsoft JhengHei" w:hAnsi="Calibri"/>
+        </w:rPr>
+        <w:t xml:space="preserve">). Only the first-time setup asks for the sudo password. Later deploys don't need it.</w:t>
+      </w:r>
+    </w:p>
+    <w:p>
+      <w:pPr>
+        <w:pStyle w:val="ListParagraph"/>
+        <w:numPr>
+          <w:ilvl w:val="0"/>
+          <w:numId w:val="2"/>
+        </w:numPr>
+        <w:spacing w:after="60"/>
+      </w:pPr>
+      <w:r>
+        <w:rPr>
+          <w:rFonts w:ascii="Calibri" w:cs="Calibri" w:eastAsia="Microsoft JhengHei" w:hAnsi="Calibri"/>
+        </w:rPr>
         <w:t xml:space="preserve">Outbound internet access for:</w:t>
       </w:r>
     </w:p>
@@ -593,7 +639,7 @@
           <w:sz w:val="19"/>
           <w:szCs w:val="19"/>
         </w:rPr>
-        <w:t xml:space="preserve">npm ci</w:t>
+        <w:t xml:space="preserve">npm install</w:t>
       </w:r>
       <w:r>
         <w:rPr>

</xml_diff>

<commit_message>
Guides: building on the remote server with npm run build
Section 3.4 lists what the deploy script runs on the server (npm install,
npm run build, switch, restart). New sections: building by hand on the
server (git clone, npm install, npm run build, npm start / PM2) and the
company_profiles repo's GitHub Actions deploy; a Build check failed row
in troubleshooting.

Co-Authored-By: Claude Opus 5.5 <noreply@anthropic.com>
</commit_message>
<xml_diff>
--- a/docs/Deployment_Guide_en.docx
+++ b/docs/Deployment_Guide_en.docx
@@ -29,6 +29,7 @@
     </w:p>
     <w:p>
       <w:pPr>
+        <w:keepNext w:val="false"/>
         <w:spacing w:after="120"/>
       </w:pPr>
       <w:r>
@@ -418,6 +419,7 @@
     </w:p>
     <w:p>
       <w:pPr>
+        <w:keepNext w:val="false"/>
         <w:spacing w:after="120"/>
       </w:pPr>
       <w:r>
@@ -697,6 +699,7 @@
     </w:p>
     <w:p>
       <w:pPr>
+        <w:keepNext w:val="false"/>
         <w:spacing w:after="120"/>
       </w:pPr>
       <w:r>
@@ -819,6 +822,7 @@
     </w:p>
     <w:p>
       <w:pPr>
+        <w:keepNext w:val="false"/>
         <w:spacing w:after="120"/>
       </w:pPr>
       <w:r>
@@ -942,6 +946,7 @@
     </w:p>
     <w:p>
       <w:pPr>
+        <w:keepNext w:val="false"/>
         <w:spacing w:after="120"/>
       </w:pPr>
       <w:r>
@@ -2103,6 +2108,7 @@
     </w:p>
     <w:p>
       <w:pPr>
+        <w:keepNext/>
         <w:spacing w:after="120"/>
       </w:pPr>
       <w:r>
@@ -2179,6 +2185,7 @@
     </w:p>
     <w:p>
       <w:pPr>
+        <w:keepNext/>
         <w:spacing w:after="120"/>
       </w:pPr>
       <w:r>
@@ -2464,6 +2471,7 @@
     </w:p>
     <w:p>
       <w:pPr>
+        <w:keepNext/>
         <w:spacing w:after="120"/>
       </w:pPr>
       <w:r>
@@ -2689,6 +2697,7 @@
     </w:p>
     <w:p>
       <w:pPr>
+        <w:keepNext w:val="false"/>
         <w:spacing w:after="120"/>
       </w:pPr>
       <w:r>
@@ -2779,13 +2788,194 @@
     </w:p>
     <w:p>
       <w:pPr>
+        <w:keepNext/>
         <w:spacing w:after="120"/>
       </w:pPr>
       <w:r>
         <w:rPr>
           <w:rFonts w:ascii="Calibri" w:cs="Calibri" w:eastAsia="Microsoft JhengHei" w:hAnsi="Calibri"/>
         </w:rPr>
-        <w:t xml:space="preserve">A successful deploy ends with </w:t>
+        <w:t xml:space="preserve">On the remote server, the deploy script:</w:t>
+      </w:r>
+    </w:p>
+    <w:p>
+      <w:pPr>
+        <w:pStyle w:val="ListParagraph"/>
+        <w:numPr>
+          <w:ilvl w:val="0"/>
+          <w:numId w:val="4"/>
+        </w:numPr>
+        <w:spacing w:after="60"/>
+      </w:pPr>
+      <w:r>
+        <w:rPr>
+          <w:rFonts w:ascii="Calibri" w:cs="Calibri" w:eastAsia="Microsoft JhengHei" w:hAnsi="Calibri"/>
+        </w:rPr>
+        <w:t xml:space="preserve">Uploads the commit to a new release directory, </w:t>
+      </w:r>
+      <w:r>
+        <w:rPr>
+          <w:rFonts w:ascii="Consolas" w:cs="Consolas" w:eastAsia="Microsoft JhengHei" w:hAnsi="Consolas"/>
+          <w:color w:val="7A2E0E"/>
+          <w:sz w:val="19"/>
+          <w:szCs w:val="19"/>
+        </w:rPr>
+        <w:t xml:space="preserve">/opt/stock-app/releases/&lt;time&gt;-&lt;commit&gt;/</w:t>
+      </w:r>
+      <w:r>
+        <w:rPr>
+          <w:rFonts w:ascii="Calibri" w:cs="Calibri" w:eastAsia="Microsoft JhengHei" w:hAnsi="Calibri"/>
+        </w:rPr>
+        <w:t xml:space="preserve">, and links </w:t>
+      </w:r>
+      <w:r>
+        <w:rPr>
+          <w:rFonts w:ascii="Consolas" w:cs="Consolas" w:eastAsia="Microsoft JhengHei" w:hAnsi="Consolas"/>
+          <w:color w:val="7A2E0E"/>
+          <w:sz w:val="19"/>
+          <w:szCs w:val="19"/>
+        </w:rPr>
+        <w:t xml:space="preserve">shared/.env</w:t>
+      </w:r>
+      <w:r>
+        <w:rPr>
+          <w:rFonts w:ascii="Calibri" w:cs="Calibri" w:eastAsia="Microsoft JhengHei" w:hAnsi="Calibri"/>
+        </w:rPr>
+        <w:t xml:space="preserve"> into it.</w:t>
+      </w:r>
+    </w:p>
+    <w:p>
+      <w:pPr>
+        <w:pStyle w:val="ListParagraph"/>
+        <w:numPr>
+          <w:ilvl w:val="0"/>
+          <w:numId w:val="4"/>
+        </w:numPr>
+        <w:spacing w:after="60"/>
+      </w:pPr>
+      <w:r>
+        <w:rPr>
+          <w:rFonts w:ascii="Calibri" w:cs="Calibri" w:eastAsia="Microsoft JhengHei" w:hAnsi="Calibri"/>
+        </w:rPr>
+        <w:t xml:space="preserve">Runs </w:t>
+      </w:r>
+      <w:r>
+        <w:rPr>
+          <w:rFonts w:ascii="Consolas" w:cs="Consolas" w:eastAsia="Microsoft JhengHei" w:hAnsi="Consolas"/>
+          <w:color w:val="7A2E0E"/>
+          <w:sz w:val="19"/>
+          <w:szCs w:val="19"/>
+        </w:rPr>
+        <w:t xml:space="preserve">npm install</w:t>
+      </w:r>
+      <w:r>
+        <w:rPr>
+          <w:rFonts w:ascii="Calibri" w:cs="Calibri" w:eastAsia="Microsoft JhengHei" w:hAnsi="Calibri"/>
+        </w:rPr>
+        <w:t xml:space="preserve"> to install the production dependencies.</w:t>
+      </w:r>
+    </w:p>
+    <w:p>
+      <w:pPr>
+        <w:pStyle w:val="ListParagraph"/>
+        <w:numPr>
+          <w:ilvl w:val="0"/>
+          <w:numId w:val="4"/>
+        </w:numPr>
+        <w:spacing w:after="60"/>
+      </w:pPr>
+      <w:r>
+        <w:rPr>
+          <w:rFonts w:ascii="Calibri" w:cs="Calibri" w:eastAsia="Microsoft JhengHei" w:hAnsi="Calibri"/>
+        </w:rPr>
+        <w:t xml:space="preserve">Runs </w:t>
+      </w:r>
+      <w:r>
+        <w:rPr>
+          <w:rFonts w:ascii="Consolas" w:cs="Consolas" w:eastAsia="Microsoft JhengHei" w:hAnsi="Consolas"/>
+          <w:color w:val="7A2E0E"/>
+          <w:sz w:val="19"/>
+          <w:szCs w:val="19"/>
+        </w:rPr>
+        <w:t xml:space="preserve">npm run build</w:t>
+      </w:r>
+      <w:r>
+        <w:rPr>
+          <w:rFonts w:ascii="Calibri" w:cs="Calibri" w:eastAsia="Microsoft JhengHei" w:hAnsi="Calibri"/>
+        </w:rPr>
+        <w:t xml:space="preserve"> to build the site. The frontend needs no bundling, so the build writes no files. Instead it is the pre-deploy check: Node is 22.8.0 or newer (and not v22.7.0), every JS file parses, and every dependency is installed. </w:t>
+      </w:r>
+      <w:r>
+        <w:rPr>
+          <w:rFonts w:ascii="Calibri" w:cs="Calibri" w:eastAsia="Microsoft JhengHei" w:hAnsi="Calibri"/>
+          <w:b/>
+          <w:bCs/>
+        </w:rPr>
+        <w:t xml:space="preserve">If the check fails, the deploy stops</w:t>
+      </w:r>
+      <w:r>
+        <w:rPr>
+          <w:rFonts w:ascii="Calibri" w:cs="Calibri" w:eastAsia="Microsoft JhengHei" w:hAnsi="Calibri"/>
+        </w:rPr>
+        <w:t xml:space="preserve"> and the live release keeps running.</w:t>
+      </w:r>
+    </w:p>
+    <w:p>
+      <w:pPr>
+        <w:pStyle w:val="ListParagraph"/>
+        <w:numPr>
+          <w:ilvl w:val="0"/>
+          <w:numId w:val="4"/>
+        </w:numPr>
+        <w:spacing w:after="60"/>
+      </w:pPr>
+      <w:r>
+        <w:rPr>
+          <w:rFonts w:ascii="Calibri" w:cs="Calibri" w:eastAsia="Microsoft JhengHei" w:hAnsi="Calibri"/>
+        </w:rPr>
+        <w:t xml:space="preserve">Points </w:t>
+      </w:r>
+      <w:r>
+        <w:rPr>
+          <w:rFonts w:ascii="Consolas" w:cs="Consolas" w:eastAsia="Microsoft JhengHei" w:hAnsi="Consolas"/>
+          <w:color w:val="7A2E0E"/>
+          <w:sz w:val="19"/>
+          <w:szCs w:val="19"/>
+        </w:rPr>
+        <w:t xml:space="preserve">current</w:t>
+      </w:r>
+      <w:r>
+        <w:rPr>
+          <w:rFonts w:ascii="Calibri" w:cs="Calibri" w:eastAsia="Microsoft JhengHei" w:hAnsi="Calibri"/>
+        </w:rPr>
+        <w:t xml:space="preserve"> at the new release, restarts the service and runs the health check.</w:t>
+      </w:r>
+    </w:p>
+    <w:p>
+      <w:pPr>
+        <w:keepNext w:val="false"/>
+        <w:spacing w:after="120"/>
+      </w:pPr>
+      <w:r>
+        <w:rPr>
+          <w:rFonts w:ascii="Calibri" w:cs="Calibri" w:eastAsia="Microsoft JhengHei" w:hAnsi="Calibri"/>
+        </w:rPr>
+        <w:t xml:space="preserve">A successful deploy prints </w:t>
+      </w:r>
+      <w:r>
+        <w:rPr>
+          <w:rFonts w:ascii="Consolas" w:cs="Consolas" w:eastAsia="Microsoft JhengHei" w:hAnsi="Consolas"/>
+          <w:color w:val="7A2E0E"/>
+          <w:sz w:val="19"/>
+          <w:szCs w:val="19"/>
+        </w:rPr>
+        <w:t xml:space="preserve">Build check OK: Node v22..., 27 JS files, 6 dependencies</w:t>
+      </w:r>
+      <w:r>
+        <w:rPr>
+          <w:rFonts w:ascii="Calibri" w:cs="Calibri" w:eastAsia="Microsoft JhengHei" w:hAnsi="Calibri"/>
+        </w:rPr>
+        <w:t xml:space="preserve">, then </w:t>
       </w:r>
       <w:r>
         <w:rPr>
@@ -2846,13 +3036,14 @@
     </w:p>
     <w:p>
       <w:pPr>
+        <w:keepNext/>
         <w:spacing w:after="120"/>
       </w:pPr>
       <w:r>
         <w:rPr>
           <w:rFonts w:ascii="Calibri" w:cs="Calibri" w:eastAsia="Microsoft JhengHei" w:hAnsi="Calibri"/>
         </w:rPr>
-        <w:t xml:space="preserve">If the server runs a firewall, open port 3000 (or use a reverse proxy instead, see section 7):</w:t>
+        <w:t xml:space="preserve">If the server runs a firewall, open port 3000 (or use a reverse proxy instead, see section 9):</w:t>
       </w:r>
     </w:p>
     <w:p>
@@ -2985,6 +3176,7 @@
     </w:p>
     <w:p>
       <w:pPr>
+        <w:keepNext w:val="false"/>
         <w:spacing w:after="120"/>
       </w:pPr>
       <w:r>
@@ -3072,6 +3264,7 @@
     </w:p>
     <w:p>
       <w:pPr>
+        <w:keepNext w:val="false"/>
         <w:spacing w:after="120"/>
       </w:pPr>
       <w:r>
@@ -3159,6 +3352,7 @@
     </w:p>
     <w:p>
       <w:pPr>
+        <w:keepNext w:val="false"/>
         <w:spacing w:after="120"/>
       </w:pPr>
       <w:r>
@@ -3191,7 +3385,64 @@
         <w:rPr>
           <w:rFonts w:ascii="Calibri" w:cs="Calibri" w:eastAsia="Microsoft JhengHei" w:hAnsi="Calibri"/>
         </w:rPr>
-        <w:t xml:space="preserve">6. Operations</w:t>
+        <w:t xml:space="preserve">6. Building by hand on the remote server (without the deploy scripts)</w:t>
+      </w:r>
+    </w:p>
+    <w:p>
+      <w:pPr>
+        <w:keepNext w:val="false"/>
+        <w:spacing w:after="120"/>
+      </w:pPr>
+      <w:r>
+        <w:rPr>
+          <w:rFonts w:ascii="Calibri" w:cs="Calibri" w:eastAsia="Microsoft JhengHei" w:hAnsi="Calibri"/>
+        </w:rPr>
+        <w:t xml:space="preserve">You can also skip the </w:t>
+      </w:r>
+      <w:r>
+        <w:rPr>
+          <w:rFonts w:ascii="Consolas" w:cs="Consolas" w:eastAsia="Microsoft JhengHei" w:hAnsi="Consolas"/>
+          <w:color w:val="7A2E0E"/>
+          <w:sz w:val="19"/>
+          <w:szCs w:val="19"/>
+        </w:rPr>
+        <w:t xml:space="preserve">deploy/</w:t>
+      </w:r>
+      <w:r>
+        <w:rPr>
+          <w:rFonts w:ascii="Calibri" w:cs="Calibri" w:eastAsia="Microsoft JhengHei" w:hAnsi="Calibri"/>
+        </w:rPr>
+        <w:t xml:space="preserve"> scripts: log in to the server, get the code there and build it with </w:t>
+      </w:r>
+      <w:r>
+        <w:rPr>
+          <w:rFonts w:ascii="Consolas" w:cs="Consolas" w:eastAsia="Microsoft JhengHei" w:hAnsi="Consolas"/>
+          <w:color w:val="7A2E0E"/>
+          <w:sz w:val="19"/>
+          <w:szCs w:val="19"/>
+        </w:rPr>
+        <w:t xml:space="preserve">npm run build</w:t>
+      </w:r>
+      <w:r>
+        <w:rPr>
+          <w:rFonts w:ascii="Calibri" w:cs="Calibri" w:eastAsia="Microsoft JhengHei" w:hAnsi="Calibri"/>
+        </w:rPr>
+        <w:t xml:space="preserve">. The server needs Node 22.8.0 or newer (check with </w:t>
+      </w:r>
+      <w:r>
+        <w:rPr>
+          <w:rFonts w:ascii="Consolas" w:cs="Consolas" w:eastAsia="Microsoft JhengHei" w:hAnsi="Consolas"/>
+          <w:color w:val="7A2E0E"/>
+          <w:sz w:val="19"/>
+          <w:szCs w:val="19"/>
+        </w:rPr>
+        <w:t xml:space="preserve">node -v</w:t>
+      </w:r>
+      <w:r>
+        <w:rPr>
+          <w:rFonts w:ascii="Calibri" w:cs="Calibri" w:eastAsia="Microsoft JhengHei" w:hAnsi="Calibri"/>
+        </w:rPr>
+        <w:t xml:space="preserve">; never v22.7.0).</w:t>
       </w:r>
     </w:p>
     <w:p>
@@ -3213,7 +3464,7 @@
           <w:sz w:val="18"/>
           <w:szCs w:val="18"/>
         </w:rPr>
-        <w:t xml:space="preserve"># On the server (the deploy user needs no password for these)</w:t>
+        <w:t xml:space="preserve"># 1. Get the code (first time); later, use git pull instead</w:t>
       </w:r>
     </w:p>
     <w:p>
@@ -3234,7 +3485,7 @@
           <w:sz w:val="18"/>
           <w:szCs w:val="18"/>
         </w:rPr>
-        <w:t xml:space="preserve">sudo systemctl status stock-app --no-pager</w:t>
+        <w:t xml:space="preserve">git clone &lt;repo-url&gt; stock-app</w:t>
       </w:r>
     </w:p>
     <w:p>
@@ -3255,7 +3506,7 @@
           <w:sz w:val="18"/>
           <w:szCs w:val="18"/>
         </w:rPr>
-        <w:t xml:space="preserve">sudo journalctl -u stock-app -n 100 --no-pager     # recent log</w:t>
+        <w:t xml:space="preserve">cd stock-app</w:t>
       </w:r>
     </w:p>
     <w:p>
@@ -3276,7 +3527,7 @@
           <w:sz w:val="18"/>
           <w:szCs w:val="18"/>
         </w:rPr>
-        <w:t xml:space="preserve">sudo journalctl -u stock-app -f                    # follow the log</w:t>
+        <w:t xml:space="preserve"> </w:t>
       </w:r>
     </w:p>
     <w:p>
@@ -3297,7 +3548,7 @@
           <w:sz w:val="18"/>
           <w:szCs w:val="18"/>
         </w:rPr>
-        <w:t xml:space="preserve"> </w:t>
+        <w:t xml:space="preserve"># 2. Prepare .env (if the repo has none, copy the template and edit it as in 3.2)</w:t>
       </w:r>
     </w:p>
     <w:p>
@@ -3318,7 +3569,7 @@
           <w:sz w:val="18"/>
           <w:szCs w:val="18"/>
         </w:rPr>
-        <w:t xml:space="preserve"># To change settings: edit shared/.env, then restart</w:t>
+        <w:t xml:space="preserve">cp .env.example .env</w:t>
       </w:r>
     </w:p>
     <w:p>
@@ -3339,7 +3590,133 @@
           <w:sz w:val="18"/>
           <w:szCs w:val="18"/>
         </w:rPr>
-        <w:t xml:space="preserve">nano /opt/stock-app/shared/.env</w:t>
+        <w:t xml:space="preserve">nano .env</w:t>
+      </w:r>
+    </w:p>
+    <w:p>
+      <w:pPr>
+        <w:keepNext/>
+        <w:keepLines/>
+        <w:pBdr>
+          <w:left w:val="single" w:color="D9D9D9" w:sz="4" w:space="6"/>
+          <w:right w:val="single" w:color="D9D9D9" w:sz="4" w:space="6"/>
+        </w:pBdr>
+        <w:shd w:fill="F2F2F2" w:color="auto" w:val="clear"/>
+        <w:spacing w:after="0" w:before="0" w:line="228"/>
+        <w:ind w:left="200" w:right="200"/>
+      </w:pPr>
+      <w:r>
+        <w:rPr>
+          <w:rFonts w:ascii="Consolas" w:cs="Consolas" w:eastAsia="Microsoft JhengHei" w:hAnsi="Consolas"/>
+          <w:sz w:val="18"/>
+          <w:szCs w:val="18"/>
+        </w:rPr>
+        <w:t xml:space="preserve"> </w:t>
+      </w:r>
+    </w:p>
+    <w:p>
+      <w:pPr>
+        <w:keepNext/>
+        <w:keepLines/>
+        <w:pBdr>
+          <w:left w:val="single" w:color="D9D9D9" w:sz="4" w:space="6"/>
+          <w:right w:val="single" w:color="D9D9D9" w:sz="4" w:space="6"/>
+        </w:pBdr>
+        <w:shd w:fill="F2F2F2" w:color="auto" w:val="clear"/>
+        <w:spacing w:after="0" w:before="0" w:line="228"/>
+        <w:ind w:left="200" w:right="200"/>
+      </w:pPr>
+      <w:r>
+        <w:rPr>
+          <w:rFonts w:ascii="Consolas" w:cs="Consolas" w:eastAsia="Microsoft JhengHei" w:hAnsi="Consolas"/>
+          <w:sz w:val="18"/>
+          <w:szCs w:val="18"/>
+        </w:rPr>
+        <w:t xml:space="preserve"># 3. Install the dependencies and build</w:t>
+      </w:r>
+    </w:p>
+    <w:p>
+      <w:pPr>
+        <w:keepNext/>
+        <w:keepLines/>
+        <w:pBdr>
+          <w:left w:val="single" w:color="D9D9D9" w:sz="4" w:space="6"/>
+          <w:right w:val="single" w:color="D9D9D9" w:sz="4" w:space="6"/>
+        </w:pBdr>
+        <w:shd w:fill="F2F2F2" w:color="auto" w:val="clear"/>
+        <w:spacing w:after="0" w:before="0" w:line="228"/>
+        <w:ind w:left="200" w:right="200"/>
+      </w:pPr>
+      <w:r>
+        <w:rPr>
+          <w:rFonts w:ascii="Consolas" w:cs="Consolas" w:eastAsia="Microsoft JhengHei" w:hAnsi="Consolas"/>
+          <w:sz w:val="18"/>
+          <w:szCs w:val="18"/>
+        </w:rPr>
+        <w:t xml:space="preserve">npm install</w:t>
+      </w:r>
+    </w:p>
+    <w:p>
+      <w:pPr>
+        <w:keepNext/>
+        <w:keepLines/>
+        <w:pBdr>
+          <w:left w:val="single" w:color="D9D9D9" w:sz="4" w:space="6"/>
+          <w:right w:val="single" w:color="D9D9D9" w:sz="4" w:space="6"/>
+        </w:pBdr>
+        <w:shd w:fill="F2F2F2" w:color="auto" w:val="clear"/>
+        <w:spacing w:after="0" w:before="0" w:line="228"/>
+        <w:ind w:left="200" w:right="200"/>
+      </w:pPr>
+      <w:r>
+        <w:rPr>
+          <w:rFonts w:ascii="Consolas" w:cs="Consolas" w:eastAsia="Microsoft JhengHei" w:hAnsi="Consolas"/>
+          <w:sz w:val="18"/>
+          <w:szCs w:val="18"/>
+        </w:rPr>
+        <w:t xml:space="preserve">npm run build</w:t>
+      </w:r>
+    </w:p>
+    <w:p>
+      <w:pPr>
+        <w:keepNext/>
+        <w:keepLines/>
+        <w:pBdr>
+          <w:left w:val="single" w:color="D9D9D9" w:sz="4" w:space="6"/>
+          <w:right w:val="single" w:color="D9D9D9" w:sz="4" w:space="6"/>
+        </w:pBdr>
+        <w:shd w:fill="F2F2F2" w:color="auto" w:val="clear"/>
+        <w:spacing w:after="0" w:before="0" w:line="228"/>
+        <w:ind w:left="200" w:right="200"/>
+      </w:pPr>
+      <w:r>
+        <w:rPr>
+          <w:rFonts w:ascii="Consolas" w:cs="Consolas" w:eastAsia="Microsoft JhengHei" w:hAnsi="Consolas"/>
+          <w:sz w:val="18"/>
+          <w:szCs w:val="18"/>
+        </w:rPr>
+        <w:t xml:space="preserve"> </w:t>
+      </w:r>
+    </w:p>
+    <w:p>
+      <w:pPr>
+        <w:keepNext/>
+        <w:keepLines/>
+        <w:pBdr>
+          <w:left w:val="single" w:color="D9D9D9" w:sz="4" w:space="6"/>
+          <w:right w:val="single" w:color="D9D9D9" w:sz="4" w:space="6"/>
+        </w:pBdr>
+        <w:shd w:fill="F2F2F2" w:color="auto" w:val="clear"/>
+        <w:spacing w:after="0" w:before="0" w:line="228"/>
+        <w:ind w:left="200" w:right="200"/>
+      </w:pPr>
+      <w:r>
+        <w:rPr>
+          <w:rFonts w:ascii="Consolas" w:cs="Consolas" w:eastAsia="Microsoft JhengHei" w:hAnsi="Consolas"/>
+          <w:sz w:val="18"/>
+          <w:szCs w:val="18"/>
+        </w:rPr>
+        <w:t xml:space="preserve"># 4. Start</w:t>
       </w:r>
     </w:p>
     <w:p>
@@ -3361,48 +3738,284 @@
           <w:sz w:val="18"/>
           <w:szCs w:val="18"/>
         </w:rPr>
-        <w:t xml:space="preserve">sudo systemctl restart stock-app</w:t>
-      </w:r>
-    </w:p>
-    <w:p>
-      <w:pPr>
-        <w:spacing w:after="120"/>
-      </w:pPr>
-      <w:r>
-        <w:rPr>
-          <w:rFonts w:ascii="Calibri" w:cs="Calibri" w:eastAsia="Microsoft JhengHei" w:hAnsi="Calibri"/>
-        </w:rPr>
-        <w:t xml:space="preserve">To run the </w:t>
-      </w:r>
-      <w:r>
-        <w:rPr>
-          <w:rFonts w:ascii="Consolas" w:cs="Consolas" w:eastAsia="Microsoft JhengHei" w:hAnsi="Consolas"/>
-          <w:color w:val="7A2E0E"/>
-          <w:sz w:val="19"/>
-          <w:szCs w:val="19"/>
-        </w:rPr>
-        <w:t xml:space="preserve">scripts/</w:t>
-      </w:r>
-      <w:r>
-        <w:rPr>
-          <w:rFonts w:ascii="Calibri" w:cs="Calibri" w:eastAsia="Microsoft JhengHei" w:hAnsi="Calibri"/>
-        </w:rPr>
-        <w:t xml:space="preserve"> CLI tools on the server, run them as the service user so they can read </w:t>
-      </w:r>
-      <w:r>
-        <w:rPr>
-          <w:rFonts w:ascii="Consolas" w:cs="Consolas" w:eastAsia="Microsoft JhengHei" w:hAnsi="Consolas"/>
-          <w:color w:val="7A2E0E"/>
-          <w:sz w:val="19"/>
-          <w:szCs w:val="19"/>
-        </w:rPr>
-        <w:t xml:space="preserve">.env</w:t>
-      </w:r>
-      <w:r>
-        <w:rPr>
-          <w:rFonts w:ascii="Calibri" w:cs="Calibri" w:eastAsia="Microsoft JhengHei" w:hAnsi="Calibri"/>
-        </w:rPr>
-        <w:t xml:space="preserve">:</w:t>
+        <w:t xml:space="preserve">npm start</w:t>
+      </w:r>
+    </w:p>
+    <w:p>
+      <w:pPr>
+        <w:pStyle w:val="ListParagraph"/>
+        <w:numPr>
+          <w:ilvl w:val="0"/>
+          <w:numId w:val="2"/>
+        </w:numPr>
+        <w:spacing w:after="60"/>
+      </w:pPr>
+      <w:r>
+        <w:rPr>
+          <w:rFonts w:ascii="Consolas" w:cs="Consolas" w:eastAsia="Microsoft JhengHei" w:hAnsi="Consolas"/>
+          <w:color w:val="7A2E0E"/>
+          <w:sz w:val="19"/>
+          <w:szCs w:val="19"/>
+        </w:rPr>
+        <w:t xml:space="preserve">&lt;repo-url&gt;</w:t>
+      </w:r>
+      <w:r>
+        <w:rPr>
+          <w:rFonts w:ascii="Calibri" w:cs="Calibri" w:eastAsia="Microsoft JhengHei" w:hAnsi="Calibri"/>
+        </w:rPr>
+        <w:t xml:space="preserve">: </w:t>
+      </w:r>
+      <w:r>
+        <w:rPr>
+          <w:rFonts w:ascii="Consolas" w:cs="Consolas" w:eastAsia="Microsoft JhengHei" w:hAnsi="Consolas"/>
+          <w:color w:val="7A2E0E"/>
+          <w:sz w:val="19"/>
+          <w:szCs w:val="19"/>
+        </w:rPr>
+        <w:t xml:space="preserve">https://github.com/victor5566/update_stock_app.git</w:t>
+      </w:r>
+      <w:r>
+        <w:rPr>
+          <w:rFonts w:ascii="Calibri" w:cs="Calibri" w:eastAsia="Microsoft JhengHei" w:hAnsi="Calibri"/>
+        </w:rPr>
+        <w:t xml:space="preserve"> (branch </w:t>
+      </w:r>
+      <w:r>
+        <w:rPr>
+          <w:rFonts w:ascii="Consolas" w:cs="Consolas" w:eastAsia="Microsoft JhengHei" w:hAnsi="Consolas"/>
+          <w:color w:val="7A2E0E"/>
+          <w:sz w:val="19"/>
+          <w:szCs w:val="19"/>
+        </w:rPr>
+        <w:t xml:space="preserve">main</w:t>
+      </w:r>
+      <w:r>
+        <w:rPr>
+          <w:rFonts w:ascii="Calibri" w:cs="Calibri" w:eastAsia="Microsoft JhengHei" w:hAnsi="Calibri"/>
+        </w:rPr>
+        <w:t xml:space="preserve">), or </w:t>
+      </w:r>
+      <w:r>
+        <w:rPr>
+          <w:rFonts w:ascii="Consolas" w:cs="Consolas" w:eastAsia="Microsoft JhengHei" w:hAnsi="Consolas"/>
+          <w:color w:val="7A2E0E"/>
+          <w:sz w:val="19"/>
+          <w:szCs w:val="19"/>
+        </w:rPr>
+        <w:t xml:space="preserve">https://github.com/infocast-tw/company_profiles.git</w:t>
+      </w:r>
+      <w:r>
+        <w:rPr>
+          <w:rFonts w:ascii="Calibri" w:cs="Calibri" w:eastAsia="Microsoft JhengHei" w:hAnsi="Calibri"/>
+        </w:rPr>
+        <w:t xml:space="preserve"> (branch </w:t>
+      </w:r>
+      <w:r>
+        <w:rPr>
+          <w:rFonts w:ascii="Consolas" w:cs="Consolas" w:eastAsia="Microsoft JhengHei" w:hAnsi="Consolas"/>
+          <w:color w:val="7A2E0E"/>
+          <w:sz w:val="19"/>
+          <w:szCs w:val="19"/>
+        </w:rPr>
+        <w:t xml:space="preserve">dev</w:t>
+      </w:r>
+      <w:r>
+        <w:rPr>
+          <w:rFonts w:ascii="Calibri" w:cs="Calibri" w:eastAsia="Microsoft JhengHei" w:hAnsi="Calibri"/>
+        </w:rPr>
+        <w:t xml:space="preserve">; add </w:t>
+      </w:r>
+      <w:r>
+        <w:rPr>
+          <w:rFonts w:ascii="Consolas" w:cs="Consolas" w:eastAsia="Microsoft JhengHei" w:hAnsi="Consolas"/>
+          <w:color w:val="7A2E0E"/>
+          <w:sz w:val="19"/>
+          <w:szCs w:val="19"/>
+        </w:rPr>
+        <w:t xml:space="preserve">--branch dev</w:t>
+      </w:r>
+      <w:r>
+        <w:rPr>
+          <w:rFonts w:ascii="Calibri" w:cs="Calibri" w:eastAsia="Microsoft JhengHei" w:hAnsi="Calibri"/>
+        </w:rPr>
+        <w:t xml:space="preserve"> to the clone).</w:t>
+      </w:r>
+    </w:p>
+    <w:p>
+      <w:pPr>
+        <w:pStyle w:val="ListParagraph"/>
+        <w:numPr>
+          <w:ilvl w:val="0"/>
+          <w:numId w:val="2"/>
+        </w:numPr>
+        <w:spacing w:after="60"/>
+      </w:pPr>
+      <w:r>
+        <w:rPr>
+          <w:rFonts w:ascii="Calibri" w:cs="Calibri" w:eastAsia="Microsoft JhengHei" w:hAnsi="Calibri"/>
+        </w:rPr>
+        <w:t xml:space="preserve">Start the app only after </w:t>
+      </w:r>
+      <w:r>
+        <w:rPr>
+          <w:rFonts w:ascii="Consolas" w:cs="Consolas" w:eastAsia="Microsoft JhengHei" w:hAnsi="Consolas"/>
+          <w:color w:val="7A2E0E"/>
+          <w:sz w:val="19"/>
+          <w:szCs w:val="19"/>
+        </w:rPr>
+        <w:t xml:space="preserve">npm run build</w:t>
+      </w:r>
+      <w:r>
+        <w:rPr>
+          <w:rFonts w:ascii="Calibri" w:cs="Calibri" w:eastAsia="Microsoft JhengHei" w:hAnsi="Calibri"/>
+        </w:rPr>
+        <w:t xml:space="preserve"> prints </w:t>
+      </w:r>
+      <w:r>
+        <w:rPr>
+          <w:rFonts w:ascii="Consolas" w:cs="Consolas" w:eastAsia="Microsoft JhengHei" w:hAnsi="Consolas"/>
+          <w:color w:val="7A2E0E"/>
+          <w:sz w:val="19"/>
+          <w:szCs w:val="19"/>
+        </w:rPr>
+        <w:t xml:space="preserve">Build check OK</w:t>
+      </w:r>
+      <w:r>
+        <w:rPr>
+          <w:rFonts w:ascii="Calibri" w:cs="Calibri" w:eastAsia="Microsoft JhengHei" w:hAnsi="Calibri"/>
+        </w:rPr>
+        <w:t xml:space="preserve">. On failure it lists the reasons and exits non-zero (for example </w:t>
+      </w:r>
+      <w:r>
+        <w:rPr>
+          <w:rFonts w:ascii="Consolas" w:cs="Consolas" w:eastAsia="Microsoft JhengHei" w:hAnsi="Consolas"/>
+          <w:color w:val="7A2E0E"/>
+          <w:sz w:val="19"/>
+          <w:szCs w:val="19"/>
+        </w:rPr>
+        <w:t xml:space="preserve">Node v22.7.0 is not supported</w:t>
+      </w:r>
+      <w:r>
+        <w:rPr>
+          <w:rFonts w:ascii="Calibri" w:cs="Calibri" w:eastAsia="Microsoft JhengHei" w:hAnsi="Calibri"/>
+        </w:rPr>
+        <w:t xml:space="preserve">, </w:t>
+      </w:r>
+      <w:r>
+        <w:rPr>
+          <w:rFonts w:ascii="Consolas" w:cs="Consolas" w:eastAsia="Microsoft JhengHei" w:hAnsi="Consolas"/>
+          <w:color w:val="7A2E0E"/>
+          <w:sz w:val="19"/>
+          <w:szCs w:val="19"/>
+        </w:rPr>
+        <w:t xml:space="preserve">syntax error in ...</w:t>
+      </w:r>
+      <w:r>
+        <w:rPr>
+          <w:rFonts w:ascii="Calibri" w:cs="Calibri" w:eastAsia="Microsoft JhengHei" w:hAnsi="Calibri"/>
+        </w:rPr>
+        <w:t xml:space="preserve"> or </w:t>
+      </w:r>
+      <w:r>
+        <w:rPr>
+          <w:rFonts w:ascii="Consolas" w:cs="Consolas" w:eastAsia="Microsoft JhengHei" w:hAnsi="Consolas"/>
+          <w:color w:val="7A2E0E"/>
+          <w:sz w:val="19"/>
+          <w:szCs w:val="19"/>
+        </w:rPr>
+        <w:t xml:space="preserve">dependency ... is not installed</w:t>
+      </w:r>
+      <w:r>
+        <w:rPr>
+          <w:rFonts w:ascii="Calibri" w:cs="Calibri" w:eastAsia="Microsoft JhengHei" w:hAnsi="Calibri"/>
+        </w:rPr>
+        <w:t xml:space="preserve">). Fix them first.</w:t>
+      </w:r>
+    </w:p>
+    <w:p>
+      <w:pPr>
+        <w:pStyle w:val="ListParagraph"/>
+        <w:numPr>
+          <w:ilvl w:val="0"/>
+          <w:numId w:val="2"/>
+        </w:numPr>
+        <w:spacing w:after="60"/>
+      </w:pPr>
+      <w:r>
+        <w:rPr>
+          <w:rFonts w:ascii="Calibri" w:cs="Calibri" w:eastAsia="Microsoft JhengHei" w:hAnsi="Calibri"/>
+        </w:rPr>
+        <w:t xml:space="preserve">For every update, repeat </w:t>
+      </w:r>
+      <w:r>
+        <w:rPr>
+          <w:rFonts w:ascii="Consolas" w:cs="Consolas" w:eastAsia="Microsoft JhengHei" w:hAnsi="Consolas"/>
+          <w:color w:val="7A2E0E"/>
+          <w:sz w:val="19"/>
+          <w:szCs w:val="19"/>
+        </w:rPr>
+        <w:t xml:space="preserve">git pull</w:t>
+      </w:r>
+      <w:r>
+        <w:rPr>
+          <w:rFonts w:ascii="Calibri" w:cs="Calibri" w:eastAsia="Microsoft JhengHei" w:hAnsi="Calibri"/>
+        </w:rPr>
+        <w:t xml:space="preserve">, </w:t>
+      </w:r>
+      <w:r>
+        <w:rPr>
+          <w:rFonts w:ascii="Consolas" w:cs="Consolas" w:eastAsia="Microsoft JhengHei" w:hAnsi="Consolas"/>
+          <w:color w:val="7A2E0E"/>
+          <w:sz w:val="19"/>
+          <w:szCs w:val="19"/>
+        </w:rPr>
+        <w:t xml:space="preserve">npm install</w:t>
+      </w:r>
+      <w:r>
+        <w:rPr>
+          <w:rFonts w:ascii="Calibri" w:cs="Calibri" w:eastAsia="Microsoft JhengHei" w:hAnsi="Calibri"/>
+        </w:rPr>
+        <w:t xml:space="preserve">, </w:t>
+      </w:r>
+      <w:r>
+        <w:rPr>
+          <w:rFonts w:ascii="Consolas" w:cs="Consolas" w:eastAsia="Microsoft JhengHei" w:hAnsi="Consolas"/>
+          <w:color w:val="7A2E0E"/>
+          <w:sz w:val="19"/>
+          <w:szCs w:val="19"/>
+        </w:rPr>
+        <w:t xml:space="preserve">npm run build</w:t>
+      </w:r>
+      <w:r>
+        <w:rPr>
+          <w:rFonts w:ascii="Calibri" w:cs="Calibri" w:eastAsia="Microsoft JhengHei" w:hAnsi="Calibri"/>
+        </w:rPr>
+        <w:t xml:space="preserve">, then restart.</w:t>
+      </w:r>
+    </w:p>
+    <w:p>
+      <w:pPr>
+        <w:pStyle w:val="ListParagraph"/>
+        <w:numPr>
+          <w:ilvl w:val="0"/>
+          <w:numId w:val="2"/>
+        </w:numPr>
+        <w:spacing w:after="60"/>
+      </w:pPr>
+      <w:r>
+        <w:rPr>
+          <w:rFonts w:ascii="Consolas" w:cs="Consolas" w:eastAsia="Microsoft JhengHei" w:hAnsi="Consolas"/>
+          <w:color w:val="7A2E0E"/>
+          <w:sz w:val="19"/>
+          <w:szCs w:val="19"/>
+        </w:rPr>
+        <w:t xml:space="preserve">npm start</w:t>
+      </w:r>
+      <w:r>
+        <w:rPr>
+          <w:rFonts w:ascii="Calibri" w:cs="Calibri" w:eastAsia="Microsoft JhengHei" w:hAnsi="Calibri"/>
+        </w:rPr>
+        <w:t xml:space="preserve"> stops when you log out. To keep the app running, hand it to PM2 or systemd:</w:t>
       </w:r>
     </w:p>
     <w:p>
@@ -3424,28 +4037,7 @@
           <w:sz w:val="18"/>
           <w:szCs w:val="18"/>
         </w:rPr>
-        <w:t xml:space="preserve">cd /opt/stock-app/current</w:t>
-      </w:r>
-    </w:p>
-    <w:p>
-      <w:pPr>
-        <w:keepNext/>
-        <w:keepLines/>
-        <w:pBdr>
-          <w:left w:val="single" w:color="D9D9D9" w:sz="4" w:space="6"/>
-          <w:right w:val="single" w:color="D9D9D9" w:sz="4" w:space="6"/>
-        </w:pBdr>
-        <w:shd w:fill="F2F2F2" w:color="auto" w:val="clear"/>
-        <w:spacing w:after="0" w:before="0" w:line="228"/>
-        <w:ind w:left="200" w:right="200"/>
-      </w:pPr>
-      <w:r>
-        <w:rPr>
-          <w:rFonts w:ascii="Consolas" w:cs="Consolas" w:eastAsia="Microsoft JhengHei" w:hAnsi="Consolas"/>
-          <w:sz w:val="18"/>
-          <w:szCs w:val="18"/>
-        </w:rPr>
-        <w:t xml:space="preserve">sudo -u stockapp node scripts/monitor-stocks.js AAPL MSFT          # preview</w:t>
+        <w:t xml:space="preserve">pm2 start npm --name stock-app -- start</w:t>
       </w:r>
     </w:p>
     <w:p>
@@ -3467,33 +4059,1012 @@
           <w:sz w:val="18"/>
           <w:szCs w:val="18"/>
         </w:rPr>
-        <w:t xml:space="preserve">sudo -u stockapp node scripts/add-from-yahoo.js NVDA</w:t>
-      </w:r>
-    </w:p>
-    <w:p>
-      <w:pPr>
+        <w:t xml:space="preserve">pm2 save</w:t>
+      </w:r>
+    </w:p>
+    <w:p>
+      <w:pPr>
+        <w:pStyle w:val="Heading1"/>
+      </w:pPr>
+      <w:r>
+        <w:rPr>
+          <w:rFonts w:ascii="Calibri" w:cs="Calibri" w:eastAsia="Microsoft JhengHei" w:hAnsi="Calibri"/>
+        </w:rPr>
+        <w:t xml:space="preserve">7. Automatic deployment with GitHub Actions (infocast-tw/company_profiles)</w:t>
+      </w:r>
+    </w:p>
+    <w:p>
+      <w:pPr>
+        <w:keepNext/>
         <w:spacing w:after="120"/>
       </w:pPr>
       <w:r>
         <w:rPr>
           <w:rFonts w:ascii="Calibri" w:cs="Calibri" w:eastAsia="Microsoft JhengHei" w:hAnsi="Calibri"/>
         </w:rPr>
-        <w:t xml:space="preserve">This needs general sudo rights for the deploy user. Scripts that write files, such as </w:t>
-      </w:r>
-      <w:r>
-        <w:rPr>
-          <w:rFonts w:ascii="Consolas" w:cs="Consolas" w:eastAsia="Microsoft JhengHei" w:hAnsi="Consolas"/>
-          <w:color w:val="7A2E0E"/>
-          <w:sz w:val="19"/>
-          <w:szCs w:val="19"/>
-        </w:rPr>
-        <w:t xml:space="preserve">export-to-csv.js</w:t>
-      </w:r>
-      <w:r>
-        <w:rPr>
-          <w:rFonts w:ascii="Calibri" w:cs="Calibri" w:eastAsia="Microsoft JhengHei" w:hAnsi="Calibri"/>
-        </w:rPr>
-        <w:t xml:space="preserve">, must run as the deploy user instead, because the deploy user owns the release directories.</w:t>
+        <w:t xml:space="preserve">In the </w:t>
+      </w:r>
+      <w:r>
+        <w:rPr>
+          <w:rFonts w:ascii="Consolas" w:cs="Consolas" w:eastAsia="Microsoft JhengHei" w:hAnsi="Consolas"/>
+          <w:color w:val="7A2E0E"/>
+          <w:sz w:val="19"/>
+          <w:szCs w:val="19"/>
+        </w:rPr>
+        <w:t xml:space="preserve">infocast-tw/company_profiles</w:t>
+      </w:r>
+      <w:r>
+        <w:rPr>
+          <w:rFonts w:ascii="Calibri" w:cs="Calibri" w:eastAsia="Microsoft JhengHei" w:hAnsi="Calibri"/>
+        </w:rPr>
+        <w:t xml:space="preserve"> repo, </w:t>
+      </w:r>
+      <w:r>
+        <w:rPr>
+          <w:rFonts w:ascii="Consolas" w:cs="Consolas" w:eastAsia="Microsoft JhengHei" w:hAnsi="Consolas"/>
+          <w:color w:val="7A2E0E"/>
+          <w:sz w:val="19"/>
+          <w:szCs w:val="19"/>
+        </w:rPr>
+        <w:t xml:space="preserve">.github/workflows/deploy.yml</w:t>
+      </w:r>
+      <w:r>
+        <w:rPr>
+          <w:rFonts w:ascii="Calibri" w:cs="Calibri" w:eastAsia="Microsoft JhengHei" w:hAnsi="Calibri"/>
+        </w:rPr>
+        <w:t xml:space="preserve"> deploys to the VPS on every push to </w:t>
+      </w:r>
+      <w:r>
+        <w:rPr>
+          <w:rFonts w:ascii="Consolas" w:cs="Consolas" w:eastAsia="Microsoft JhengHei" w:hAnsi="Consolas"/>
+          <w:color w:val="7A2E0E"/>
+          <w:sz w:val="19"/>
+          <w:szCs w:val="19"/>
+        </w:rPr>
+        <w:t xml:space="preserve">main</w:t>
+      </w:r>
+      <w:r>
+        <w:rPr>
+          <w:rFonts w:ascii="Calibri" w:cs="Calibri" w:eastAsia="Microsoft JhengHei" w:hAnsi="Calibri"/>
+        </w:rPr>
+        <w:t xml:space="preserve">, </w:t>
+      </w:r>
+      <w:r>
+        <w:rPr>
+          <w:rFonts w:ascii="Consolas" w:cs="Consolas" w:eastAsia="Microsoft JhengHei" w:hAnsi="Consolas"/>
+          <w:color w:val="7A2E0E"/>
+          <w:sz w:val="19"/>
+          <w:szCs w:val="19"/>
+        </w:rPr>
+        <w:t xml:space="preserve">dev</w:t>
+      </w:r>
+      <w:r>
+        <w:rPr>
+          <w:rFonts w:ascii="Calibri" w:cs="Calibri" w:eastAsia="Microsoft JhengHei" w:hAnsi="Calibri"/>
+        </w:rPr>
+        <w:t xml:space="preserve"> or </w:t>
+      </w:r>
+      <w:r>
+        <w:rPr>
+          <w:rFonts w:ascii="Consolas" w:cs="Consolas" w:eastAsia="Microsoft JhengHei" w:hAnsi="Consolas"/>
+          <w:color w:val="7A2E0E"/>
+          <w:sz w:val="19"/>
+          <w:szCs w:val="19"/>
+        </w:rPr>
+        <w:t xml:space="preserve">test</w:t>
+      </w:r>
+      <w:r>
+        <w:rPr>
+          <w:rFonts w:ascii="Calibri" w:cs="Calibri" w:eastAsia="Microsoft JhengHei" w:hAnsi="Calibri"/>
+        </w:rPr>
+        <w:t xml:space="preserve">. It also builds on the remote server with </w:t>
+      </w:r>
+      <w:r>
+        <w:rPr>
+          <w:rFonts w:ascii="Consolas" w:cs="Consolas" w:eastAsia="Microsoft JhengHei" w:hAnsi="Consolas"/>
+          <w:color w:val="7A2E0E"/>
+          <w:sz w:val="19"/>
+          <w:szCs w:val="19"/>
+        </w:rPr>
+        <w:t xml:space="preserve">npm run build</w:t>
+      </w:r>
+      <w:r>
+        <w:rPr>
+          <w:rFonts w:ascii="Calibri" w:cs="Calibri" w:eastAsia="Microsoft JhengHei" w:hAnsi="Calibri"/>
+        </w:rPr>
+        <w:t xml:space="preserve">:</w:t>
+      </w:r>
+    </w:p>
+    <w:tbl>
+      <w:tblPr>
+        <w:tblW w:type="dxa" w:w="9306"/>
+        <w:tblBorders>
+          <w:top w:val="single" w:color="auto" w:sz="4"/>
+          <w:left w:val="single" w:color="auto" w:sz="4"/>
+          <w:bottom w:val="single" w:color="auto" w:sz="4"/>
+          <w:right w:val="single" w:color="auto" w:sz="4"/>
+          <w:insideH w:val="single" w:color="auto" w:sz="4"/>
+          <w:insideV w:val="single" w:color="auto" w:sz="4"/>
+        </w:tblBorders>
+      </w:tblPr>
+      <w:tblGrid>
+        <w:gridCol w:w="1892"/>
+        <w:gridCol w:w="1892"/>
+        <w:gridCol w:w="3627"/>
+        <w:gridCol w:w="1895"/>
+      </w:tblGrid>
+      <w:tr>
+        <w:trPr>
+          <w:tblHeader/>
+        </w:trPr>
+        <w:tc>
+          <w:tcPr>
+            <w:tcW w:type="dxa" w:w="1892"/>
+            <w:tcBorders>
+              <w:top w:val="single" w:color="BFBFBF" w:sz="4"/>
+              <w:left w:val="single" w:color="BFBFBF" w:sz="4"/>
+              <w:bottom w:val="single" w:color="BFBFBF" w:sz="4"/>
+              <w:right w:val="single" w:color="BFBFBF" w:sz="4"/>
+            </w:tcBorders>
+            <w:shd w:fill="DCE6F1" w:color="auto" w:val="clear"/>
+            <w:tcMar>
+              <w:top w:type="dxa" w:w="60"/>
+              <w:left w:type="dxa" w:w="100"/>
+              <w:bottom w:type="dxa" w:w="60"/>
+              <w:right w:type="dxa" w:w="100"/>
+            </w:tcMar>
+          </w:tcPr>
+          <w:p>
+            <w:pPr>
+              <w:spacing w:after="0"/>
+            </w:pPr>
+            <w:r>
+              <w:rPr>
+                <w:rFonts w:ascii="Calibri" w:cs="Calibri" w:eastAsia="Microsoft JhengHei" w:hAnsi="Calibri"/>
+                <w:b/>
+                <w:bCs/>
+                <w:sz w:val="20"/>
+                <w:szCs w:val="20"/>
+              </w:rPr>
+              <w:t xml:space="preserve">Branch</w:t>
+            </w:r>
+          </w:p>
+        </w:tc>
+        <w:tc>
+          <w:tcPr>
+            <w:tcW w:type="dxa" w:w="1892"/>
+            <w:tcBorders>
+              <w:top w:val="single" w:color="BFBFBF" w:sz="4"/>
+              <w:left w:val="single" w:color="BFBFBF" w:sz="4"/>
+              <w:bottom w:val="single" w:color="BFBFBF" w:sz="4"/>
+              <w:right w:val="single" w:color="BFBFBF" w:sz="4"/>
+            </w:tcBorders>
+            <w:shd w:fill="DCE6F1" w:color="auto" w:val="clear"/>
+            <w:tcMar>
+              <w:top w:type="dxa" w:w="60"/>
+              <w:left w:type="dxa" w:w="100"/>
+              <w:bottom w:type="dxa" w:w="60"/>
+              <w:right w:type="dxa" w:w="100"/>
+            </w:tcMar>
+          </w:tcPr>
+          <w:p>
+            <w:pPr>
+              <w:spacing w:after="0"/>
+            </w:pPr>
+            <w:r>
+              <w:rPr>
+                <w:rFonts w:ascii="Calibri" w:cs="Calibri" w:eastAsia="Microsoft JhengHei" w:hAnsi="Calibri"/>
+                <w:b/>
+                <w:bCs/>
+                <w:sz w:val="20"/>
+                <w:szCs w:val="20"/>
+              </w:rPr>
+              <w:t xml:space="preserve">Environment</w:t>
+            </w:r>
+          </w:p>
+        </w:tc>
+        <w:tc>
+          <w:tcPr>
+            <w:tcW w:type="dxa" w:w="3627"/>
+            <w:tcBorders>
+              <w:top w:val="single" w:color="BFBFBF" w:sz="4"/>
+              <w:left w:val="single" w:color="BFBFBF" w:sz="4"/>
+              <w:bottom w:val="single" w:color="BFBFBF" w:sz="4"/>
+              <w:right w:val="single" w:color="BFBFBF" w:sz="4"/>
+            </w:tcBorders>
+            <w:shd w:fill="DCE6F1" w:color="auto" w:val="clear"/>
+            <w:tcMar>
+              <w:top w:type="dxa" w:w="60"/>
+              <w:left w:type="dxa" w:w="100"/>
+              <w:bottom w:type="dxa" w:w="60"/>
+              <w:right w:type="dxa" w:w="100"/>
+            </w:tcMar>
+          </w:tcPr>
+          <w:p>
+            <w:pPr>
+              <w:spacing w:after="0"/>
+            </w:pPr>
+            <w:r>
+              <w:rPr>
+                <w:rFonts w:ascii="Calibri" w:cs="Calibri" w:eastAsia="Microsoft JhengHei" w:hAnsi="Calibri"/>
+                <w:b/>
+                <w:bCs/>
+                <w:sz w:val="20"/>
+                <w:szCs w:val="20"/>
+              </w:rPr>
+              <w:t xml:space="preserve">Directory on the server</w:t>
+            </w:r>
+          </w:p>
+        </w:tc>
+        <w:tc>
+          <w:tcPr>
+            <w:tcW w:type="dxa" w:w="1895"/>
+            <w:tcBorders>
+              <w:top w:val="single" w:color="BFBFBF" w:sz="4"/>
+              <w:left w:val="single" w:color="BFBFBF" w:sz="4"/>
+              <w:bottom w:val="single" w:color="BFBFBF" w:sz="4"/>
+              <w:right w:val="single" w:color="BFBFBF" w:sz="4"/>
+            </w:tcBorders>
+            <w:shd w:fill="DCE6F1" w:color="auto" w:val="clear"/>
+            <w:tcMar>
+              <w:top w:type="dxa" w:w="60"/>
+              <w:left w:type="dxa" w:w="100"/>
+              <w:bottom w:type="dxa" w:w="60"/>
+              <w:right w:type="dxa" w:w="100"/>
+            </w:tcMar>
+          </w:tcPr>
+          <w:p>
+            <w:pPr>
+              <w:spacing w:after="0"/>
+            </w:pPr>
+            <w:r>
+              <w:rPr>
+                <w:rFonts w:ascii="Calibri" w:cs="Calibri" w:eastAsia="Microsoft JhengHei" w:hAnsi="Calibri"/>
+                <w:b/>
+                <w:bCs/>
+                <w:sz w:val="20"/>
+                <w:szCs w:val="20"/>
+              </w:rPr>
+              <w:t xml:space="preserve">PM2 name</w:t>
+            </w:r>
+          </w:p>
+        </w:tc>
+      </w:tr>
+      <w:tr>
+        <w:tc>
+          <w:tcPr>
+            <w:tcW w:type="dxa" w:w="1892"/>
+            <w:tcBorders>
+              <w:top w:val="single" w:color="BFBFBF" w:sz="4"/>
+              <w:left w:val="single" w:color="BFBFBF" w:sz="4"/>
+              <w:bottom w:val="single" w:color="BFBFBF" w:sz="4"/>
+              <w:right w:val="single" w:color="BFBFBF" w:sz="4"/>
+            </w:tcBorders>
+            <w:tcMar>
+              <w:top w:type="dxa" w:w="60"/>
+              <w:left w:type="dxa" w:w="100"/>
+              <w:bottom w:type="dxa" w:w="60"/>
+              <w:right w:type="dxa" w:w="100"/>
+            </w:tcMar>
+          </w:tcPr>
+          <w:p>
+            <w:pPr>
+              <w:spacing w:after="0"/>
+            </w:pPr>
+            <w:r>
+              <w:rPr>
+                <w:rFonts w:ascii="Consolas" w:cs="Consolas" w:eastAsia="Microsoft JhengHei" w:hAnsi="Consolas"/>
+                <w:color w:val="7A2E0E"/>
+                <w:sz w:val="19"/>
+                <w:szCs w:val="19"/>
+              </w:rPr>
+              <w:t xml:space="preserve">main</w:t>
+            </w:r>
+          </w:p>
+        </w:tc>
+        <w:tc>
+          <w:tcPr>
+            <w:tcW w:type="dxa" w:w="1892"/>
+            <w:tcBorders>
+              <w:top w:val="single" w:color="BFBFBF" w:sz="4"/>
+              <w:left w:val="single" w:color="BFBFBF" w:sz="4"/>
+              <w:bottom w:val="single" w:color="BFBFBF" w:sz="4"/>
+              <w:right w:val="single" w:color="BFBFBF" w:sz="4"/>
+            </w:tcBorders>
+            <w:tcMar>
+              <w:top w:type="dxa" w:w="60"/>
+              <w:left w:type="dxa" w:w="100"/>
+              <w:bottom w:type="dxa" w:w="60"/>
+              <w:right w:type="dxa" w:w="100"/>
+            </w:tcMar>
+          </w:tcPr>
+          <w:p>
+            <w:pPr>
+              <w:spacing w:after="0"/>
+            </w:pPr>
+            <w:r>
+              <w:rPr>
+                <w:rFonts w:ascii="Calibri" w:cs="Calibri" w:eastAsia="Microsoft JhengHei" w:hAnsi="Calibri"/>
+                <w:sz w:val="20"/>
+                <w:szCs w:val="20"/>
+              </w:rPr>
+              <w:t xml:space="preserve">production</w:t>
+            </w:r>
+          </w:p>
+        </w:tc>
+        <w:tc>
+          <w:tcPr>
+            <w:tcW w:type="dxa" w:w="3627"/>
+            <w:tcBorders>
+              <w:top w:val="single" w:color="BFBFBF" w:sz="4"/>
+              <w:left w:val="single" w:color="BFBFBF" w:sz="4"/>
+              <w:bottom w:val="single" w:color="BFBFBF" w:sz="4"/>
+              <w:right w:val="single" w:color="BFBFBF" w:sz="4"/>
+            </w:tcBorders>
+            <w:tcMar>
+              <w:top w:type="dxa" w:w="60"/>
+              <w:left w:type="dxa" w:w="100"/>
+              <w:bottom w:type="dxa" w:w="60"/>
+              <w:right w:type="dxa" w:w="100"/>
+            </w:tcMar>
+          </w:tcPr>
+          <w:p>
+            <w:pPr>
+              <w:spacing w:after="0"/>
+            </w:pPr>
+            <w:r>
+              <w:rPr>
+                <w:rFonts w:ascii="Consolas" w:cs="Consolas" w:eastAsia="Microsoft JhengHei" w:hAnsi="Consolas"/>
+                <w:color w:val="7A2E0E"/>
+                <w:sz w:val="19"/>
+                <w:szCs w:val="19"/>
+              </w:rPr>
+              <w:t xml:space="preserve">prod_env</w:t>
+            </w:r>
+          </w:p>
+        </w:tc>
+        <w:tc>
+          <w:tcPr>
+            <w:tcW w:type="dxa" w:w="1895"/>
+            <w:tcBorders>
+              <w:top w:val="single" w:color="BFBFBF" w:sz="4"/>
+              <w:left w:val="single" w:color="BFBFBF" w:sz="4"/>
+              <w:bottom w:val="single" w:color="BFBFBF" w:sz="4"/>
+              <w:right w:val="single" w:color="BFBFBF" w:sz="4"/>
+            </w:tcBorders>
+            <w:tcMar>
+              <w:top w:type="dxa" w:w="60"/>
+              <w:left w:type="dxa" w:w="100"/>
+              <w:bottom w:type="dxa" w:w="60"/>
+              <w:right w:type="dxa" w:w="100"/>
+            </w:tcMar>
+          </w:tcPr>
+          <w:p>
+            <w:pPr>
+              <w:spacing w:after="0"/>
+            </w:pPr>
+            <w:r>
+              <w:rPr>
+                <w:rFonts w:ascii="Consolas" w:cs="Consolas" w:eastAsia="Microsoft JhengHei" w:hAnsi="Consolas"/>
+                <w:color w:val="7A2E0E"/>
+                <w:sz w:val="19"/>
+                <w:szCs w:val="19"/>
+              </w:rPr>
+              <w:t xml:space="preserve">ProdServer</w:t>
+            </w:r>
+          </w:p>
+        </w:tc>
+      </w:tr>
+      <w:tr>
+        <w:tc>
+          <w:tcPr>
+            <w:tcW w:type="dxa" w:w="1892"/>
+            <w:tcBorders>
+              <w:top w:val="single" w:color="BFBFBF" w:sz="4"/>
+              <w:left w:val="single" w:color="BFBFBF" w:sz="4"/>
+              <w:bottom w:val="single" w:color="BFBFBF" w:sz="4"/>
+              <w:right w:val="single" w:color="BFBFBF" w:sz="4"/>
+            </w:tcBorders>
+            <w:tcMar>
+              <w:top w:type="dxa" w:w="60"/>
+              <w:left w:type="dxa" w:w="100"/>
+              <w:bottom w:type="dxa" w:w="60"/>
+              <w:right w:type="dxa" w:w="100"/>
+            </w:tcMar>
+          </w:tcPr>
+          <w:p>
+            <w:pPr>
+              <w:spacing w:after="0"/>
+            </w:pPr>
+            <w:r>
+              <w:rPr>
+                <w:rFonts w:ascii="Consolas" w:cs="Consolas" w:eastAsia="Microsoft JhengHei" w:hAnsi="Consolas"/>
+                <w:color w:val="7A2E0E"/>
+                <w:sz w:val="19"/>
+                <w:szCs w:val="19"/>
+              </w:rPr>
+              <w:t xml:space="preserve">test</w:t>
+            </w:r>
+          </w:p>
+        </w:tc>
+        <w:tc>
+          <w:tcPr>
+            <w:tcW w:type="dxa" w:w="1892"/>
+            <w:tcBorders>
+              <w:top w:val="single" w:color="BFBFBF" w:sz="4"/>
+              <w:left w:val="single" w:color="BFBFBF" w:sz="4"/>
+              <w:bottom w:val="single" w:color="BFBFBF" w:sz="4"/>
+              <w:right w:val="single" w:color="BFBFBF" w:sz="4"/>
+            </w:tcBorders>
+            <w:tcMar>
+              <w:top w:type="dxa" w:w="60"/>
+              <w:left w:type="dxa" w:w="100"/>
+              <w:bottom w:type="dxa" w:w="60"/>
+              <w:right w:type="dxa" w:w="100"/>
+            </w:tcMar>
+          </w:tcPr>
+          <w:p>
+            <w:pPr>
+              <w:spacing w:after="0"/>
+            </w:pPr>
+            <w:r>
+              <w:rPr>
+                <w:rFonts w:ascii="Calibri" w:cs="Calibri" w:eastAsia="Microsoft JhengHei" w:hAnsi="Calibri"/>
+                <w:sz w:val="20"/>
+                <w:szCs w:val="20"/>
+              </w:rPr>
+              <w:t xml:space="preserve">test</w:t>
+            </w:r>
+          </w:p>
+        </w:tc>
+        <w:tc>
+          <w:tcPr>
+            <w:tcW w:type="dxa" w:w="3627"/>
+            <w:tcBorders>
+              <w:top w:val="single" w:color="BFBFBF" w:sz="4"/>
+              <w:left w:val="single" w:color="BFBFBF" w:sz="4"/>
+              <w:bottom w:val="single" w:color="BFBFBF" w:sz="4"/>
+              <w:right w:val="single" w:color="BFBFBF" w:sz="4"/>
+            </w:tcBorders>
+            <w:tcMar>
+              <w:top w:type="dxa" w:w="60"/>
+              <w:left w:type="dxa" w:w="100"/>
+              <w:bottom w:type="dxa" w:w="60"/>
+              <w:right w:type="dxa" w:w="100"/>
+            </w:tcMar>
+          </w:tcPr>
+          <w:p>
+            <w:pPr>
+              <w:spacing w:after="0"/>
+            </w:pPr>
+            <w:r>
+              <w:rPr>
+                <w:rFonts w:ascii="Consolas" w:cs="Consolas" w:eastAsia="Microsoft JhengHei" w:hAnsi="Consolas"/>
+                <w:color w:val="7A2E0E"/>
+                <w:sz w:val="19"/>
+                <w:szCs w:val="19"/>
+              </w:rPr>
+              <w:t xml:space="preserve">test_env</w:t>
+            </w:r>
+          </w:p>
+        </w:tc>
+        <w:tc>
+          <w:tcPr>
+            <w:tcW w:type="dxa" w:w="1895"/>
+            <w:tcBorders>
+              <w:top w:val="single" w:color="BFBFBF" w:sz="4"/>
+              <w:left w:val="single" w:color="BFBFBF" w:sz="4"/>
+              <w:bottom w:val="single" w:color="BFBFBF" w:sz="4"/>
+              <w:right w:val="single" w:color="BFBFBF" w:sz="4"/>
+            </w:tcBorders>
+            <w:tcMar>
+              <w:top w:type="dxa" w:w="60"/>
+              <w:left w:type="dxa" w:w="100"/>
+              <w:bottom w:type="dxa" w:w="60"/>
+              <w:right w:type="dxa" w:w="100"/>
+            </w:tcMar>
+          </w:tcPr>
+          <w:p>
+            <w:pPr>
+              <w:spacing w:after="0"/>
+            </w:pPr>
+            <w:r>
+              <w:rPr>
+                <w:rFonts w:ascii="Consolas" w:cs="Consolas" w:eastAsia="Microsoft JhengHei" w:hAnsi="Consolas"/>
+                <w:color w:val="7A2E0E"/>
+                <w:sz w:val="19"/>
+                <w:szCs w:val="19"/>
+              </w:rPr>
+              <w:t xml:space="preserve">TestServer</w:t>
+            </w:r>
+          </w:p>
+        </w:tc>
+      </w:tr>
+      <w:tr>
+        <w:tc>
+          <w:tcPr>
+            <w:tcW w:type="dxa" w:w="1892"/>
+            <w:tcBorders>
+              <w:top w:val="single" w:color="BFBFBF" w:sz="4"/>
+              <w:left w:val="single" w:color="BFBFBF" w:sz="4"/>
+              <w:bottom w:val="single" w:color="BFBFBF" w:sz="4"/>
+              <w:right w:val="single" w:color="BFBFBF" w:sz="4"/>
+            </w:tcBorders>
+            <w:tcMar>
+              <w:top w:type="dxa" w:w="60"/>
+              <w:left w:type="dxa" w:w="100"/>
+              <w:bottom w:type="dxa" w:w="60"/>
+              <w:right w:type="dxa" w:w="100"/>
+            </w:tcMar>
+          </w:tcPr>
+          <w:p>
+            <w:pPr>
+              <w:spacing w:after="0"/>
+            </w:pPr>
+            <w:r>
+              <w:rPr>
+                <w:rFonts w:ascii="Consolas" w:cs="Consolas" w:eastAsia="Microsoft JhengHei" w:hAnsi="Consolas"/>
+                <w:color w:val="7A2E0E"/>
+                <w:sz w:val="19"/>
+                <w:szCs w:val="19"/>
+              </w:rPr>
+              <w:t xml:space="preserve">dev</w:t>
+            </w:r>
+          </w:p>
+        </w:tc>
+        <w:tc>
+          <w:tcPr>
+            <w:tcW w:type="dxa" w:w="1892"/>
+            <w:tcBorders>
+              <w:top w:val="single" w:color="BFBFBF" w:sz="4"/>
+              <w:left w:val="single" w:color="BFBFBF" w:sz="4"/>
+              <w:bottom w:val="single" w:color="BFBFBF" w:sz="4"/>
+              <w:right w:val="single" w:color="BFBFBF" w:sz="4"/>
+            </w:tcBorders>
+            <w:tcMar>
+              <w:top w:type="dxa" w:w="60"/>
+              <w:left w:type="dxa" w:w="100"/>
+              <w:bottom w:type="dxa" w:w="60"/>
+              <w:right w:type="dxa" w:w="100"/>
+            </w:tcMar>
+          </w:tcPr>
+          <w:p>
+            <w:pPr>
+              <w:spacing w:after="0"/>
+            </w:pPr>
+            <w:r>
+              <w:rPr>
+                <w:rFonts w:ascii="Calibri" w:cs="Calibri" w:eastAsia="Microsoft JhengHei" w:hAnsi="Calibri"/>
+                <w:sz w:val="20"/>
+                <w:szCs w:val="20"/>
+              </w:rPr>
+              <w:t xml:space="preserve">dev</w:t>
+            </w:r>
+          </w:p>
+        </w:tc>
+        <w:tc>
+          <w:tcPr>
+            <w:tcW w:type="dxa" w:w="3627"/>
+            <w:tcBorders>
+              <w:top w:val="single" w:color="BFBFBF" w:sz="4"/>
+              <w:left w:val="single" w:color="BFBFBF" w:sz="4"/>
+              <w:bottom w:val="single" w:color="BFBFBF" w:sz="4"/>
+              <w:right w:val="single" w:color="BFBFBF" w:sz="4"/>
+            </w:tcBorders>
+            <w:tcMar>
+              <w:top w:type="dxa" w:w="60"/>
+              <w:left w:type="dxa" w:w="100"/>
+              <w:bottom w:type="dxa" w:w="60"/>
+              <w:right w:type="dxa" w:w="100"/>
+            </w:tcMar>
+          </w:tcPr>
+          <w:p>
+            <w:pPr>
+              <w:spacing w:after="0"/>
+            </w:pPr>
+            <w:r>
+              <w:rPr>
+                <w:rFonts w:ascii="Consolas" w:cs="Consolas" w:eastAsia="Microsoft JhengHei" w:hAnsi="Consolas"/>
+                <w:color w:val="7A2E0E"/>
+                <w:sz w:val="19"/>
+                <w:szCs w:val="19"/>
+              </w:rPr>
+              <w:t xml:space="preserve">dev_env</w:t>
+            </w:r>
+          </w:p>
+        </w:tc>
+        <w:tc>
+          <w:tcPr>
+            <w:tcW w:type="dxa" w:w="1895"/>
+            <w:tcBorders>
+              <w:top w:val="single" w:color="BFBFBF" w:sz="4"/>
+              <w:left w:val="single" w:color="BFBFBF" w:sz="4"/>
+              <w:bottom w:val="single" w:color="BFBFBF" w:sz="4"/>
+              <w:right w:val="single" w:color="BFBFBF" w:sz="4"/>
+            </w:tcBorders>
+            <w:tcMar>
+              <w:top w:type="dxa" w:w="60"/>
+              <w:left w:type="dxa" w:w="100"/>
+              <w:bottom w:type="dxa" w:w="60"/>
+              <w:right w:type="dxa" w:w="100"/>
+            </w:tcMar>
+          </w:tcPr>
+          <w:p>
+            <w:pPr>
+              <w:spacing w:after="0"/>
+            </w:pPr>
+            <w:r>
+              <w:rPr>
+                <w:rFonts w:ascii="Consolas" w:cs="Consolas" w:eastAsia="Microsoft JhengHei" w:hAnsi="Consolas"/>
+                <w:color w:val="7A2E0E"/>
+                <w:sz w:val="19"/>
+                <w:szCs w:val="19"/>
+              </w:rPr>
+              <w:t xml:space="preserve">DevServer</w:t>
+            </w:r>
+          </w:p>
+        </w:tc>
+      </w:tr>
+    </w:tbl>
+    <w:p>
+      <w:pPr>
+        <w:spacing w:after="120"/>
+      </w:pPr>
+    </w:p>
+    <w:p>
+      <w:pPr>
+        <w:keepNext/>
+        <w:spacing w:after="120"/>
+      </w:pPr>
+      <w:r>
+        <w:rPr>
+          <w:rFonts w:ascii="Calibri" w:cs="Calibri" w:eastAsia="Microsoft JhengHei" w:hAnsi="Calibri"/>
+        </w:rPr>
+        <w:t xml:space="preserve">Steps:</w:t>
+      </w:r>
+    </w:p>
+    <w:p>
+      <w:pPr>
+        <w:pStyle w:val="ListParagraph"/>
+        <w:numPr>
+          <w:ilvl w:val="0"/>
+          <w:numId w:val="5"/>
+        </w:numPr>
+        <w:spacing w:after="60"/>
+      </w:pPr>
+      <w:r>
+        <w:rPr>
+          <w:rFonts w:ascii="Calibri" w:cs="Calibri" w:eastAsia="Microsoft JhengHei" w:hAnsi="Calibri"/>
+        </w:rPr>
+        <w:t xml:space="preserve">Logs in to the VPS over SSH and runs inside the LXC container </w:t>
+      </w:r>
+      <w:r>
+        <w:rPr>
+          <w:rFonts w:ascii="Consolas" w:cs="Consolas" w:eastAsia="Microsoft JhengHei" w:hAnsi="Consolas"/>
+          <w:color w:val="7A2E0E"/>
+          <w:sz w:val="19"/>
+          <w:szCs w:val="19"/>
+        </w:rPr>
+        <w:t xml:space="preserve">company-profiler</w:t>
+      </w:r>
+      <w:r>
+        <w:rPr>
+          <w:rFonts w:ascii="Calibri" w:cs="Calibri" w:eastAsia="Microsoft JhengHei" w:hAnsi="Calibri"/>
+        </w:rPr>
+        <w:t xml:space="preserve"> as the </w:t>
+      </w:r>
+      <w:r>
+        <w:rPr>
+          <w:rFonts w:ascii="Consolas" w:cs="Consolas" w:eastAsia="Microsoft JhengHei" w:hAnsi="Consolas"/>
+          <w:color w:val="7A2E0E"/>
+          <w:sz w:val="19"/>
+          <w:szCs w:val="19"/>
+        </w:rPr>
+        <w:t xml:space="preserve">company-profiler</w:t>
+      </w:r>
+      <w:r>
+        <w:rPr>
+          <w:rFonts w:ascii="Calibri" w:cs="Calibri" w:eastAsia="Microsoft JhengHei" w:hAnsi="Calibri"/>
+        </w:rPr>
+        <w:t xml:space="preserve"> user.</w:t>
+      </w:r>
+    </w:p>
+    <w:p>
+      <w:pPr>
+        <w:pStyle w:val="ListParagraph"/>
+        <w:numPr>
+          <w:ilvl w:val="0"/>
+          <w:numId w:val="5"/>
+        </w:numPr>
+        <w:spacing w:after="60"/>
+      </w:pPr>
+      <w:r>
+        <w:rPr>
+          <w:rFonts w:ascii="Calibri" w:cs="Calibri" w:eastAsia="Microsoft JhengHei" w:hAnsi="Calibri"/>
+        </w:rPr>
+        <w:t xml:space="preserve">Selects Node 22 with </w:t>
+      </w:r>
+      <w:r>
+        <w:rPr>
+          <w:rFonts w:ascii="Consolas" w:cs="Consolas" w:eastAsia="Microsoft JhengHei" w:hAnsi="Consolas"/>
+          <w:color w:val="7A2E0E"/>
+          <w:sz w:val="19"/>
+          <w:szCs w:val="19"/>
+        </w:rPr>
+        <w:t xml:space="preserve">nvm use 22</w:t>
+      </w:r>
+      <w:r>
+        <w:rPr>
+          <w:rFonts w:ascii="Calibri" w:cs="Calibri" w:eastAsia="Microsoft JhengHei" w:hAnsi="Calibri"/>
+        </w:rPr>
+        <w:t xml:space="preserve">.</w:t>
+      </w:r>
+    </w:p>
+    <w:p>
+      <w:pPr>
+        <w:pStyle w:val="ListParagraph"/>
+        <w:numPr>
+          <w:ilvl w:val="0"/>
+          <w:numId w:val="5"/>
+        </w:numPr>
+        <w:spacing w:after="60"/>
+      </w:pPr>
+      <w:r>
+        <w:rPr>
+          <w:rFonts w:ascii="Calibri" w:cs="Calibri" w:eastAsia="Microsoft JhengHei" w:hAnsi="Calibri"/>
+        </w:rPr>
+        <w:t xml:space="preserve">Deletes the old directory and runs </w:t>
+      </w:r>
+      <w:r>
+        <w:rPr>
+          <w:rFonts w:ascii="Consolas" w:cs="Consolas" w:eastAsia="Microsoft JhengHei" w:hAnsi="Consolas"/>
+          <w:color w:val="7A2E0E"/>
+          <w:sz w:val="19"/>
+          <w:szCs w:val="19"/>
+        </w:rPr>
+        <w:t xml:space="preserve">git clone</w:t>
+      </w:r>
+      <w:r>
+        <w:rPr>
+          <w:rFonts w:ascii="Calibri" w:cs="Calibri" w:eastAsia="Microsoft JhengHei" w:hAnsi="Calibri"/>
+        </w:rPr>
+        <w:t xml:space="preserve"> for the branch.</w:t>
+      </w:r>
+    </w:p>
+    <w:p>
+      <w:pPr>
+        <w:pStyle w:val="ListParagraph"/>
+        <w:numPr>
+          <w:ilvl w:val="0"/>
+          <w:numId w:val="5"/>
+        </w:numPr>
+        <w:spacing w:after="60"/>
+      </w:pPr>
+      <w:r>
+        <w:rPr>
+          <w:rFonts w:ascii="Calibri" w:cs="Calibri" w:eastAsia="Microsoft JhengHei" w:hAnsi="Calibri"/>
+        </w:rPr>
+        <w:t xml:space="preserve">Runs </w:t>
+      </w:r>
+      <w:r>
+        <w:rPr>
+          <w:rFonts w:ascii="Consolas" w:cs="Consolas" w:eastAsia="Microsoft JhengHei" w:hAnsi="Consolas"/>
+          <w:color w:val="7A2E0E"/>
+          <w:sz w:val="19"/>
+          <w:szCs w:val="19"/>
+        </w:rPr>
+        <w:t xml:space="preserve">npm install</w:t>
+      </w:r>
+      <w:r>
+        <w:rPr>
+          <w:rFonts w:ascii="Calibri" w:cs="Calibri" w:eastAsia="Microsoft JhengHei" w:hAnsi="Calibri"/>
+        </w:rPr>
+        <w:t xml:space="preserve">, then </w:t>
+      </w:r>
+      <w:r>
+        <w:rPr>
+          <w:rFonts w:ascii="Consolas" w:cs="Consolas" w:eastAsia="Microsoft JhengHei" w:hAnsi="Consolas"/>
+          <w:color w:val="7A2E0E"/>
+          <w:sz w:val="19"/>
+          <w:szCs w:val="19"/>
+        </w:rPr>
+        <w:t xml:space="preserve">npm run build</w:t>
+      </w:r>
+      <w:r>
+        <w:rPr>
+          <w:rFonts w:ascii="Calibri" w:cs="Calibri" w:eastAsia="Microsoft JhengHei" w:hAnsi="Calibri"/>
+        </w:rPr>
+        <w:t xml:space="preserve">.</w:t>
+      </w:r>
+    </w:p>
+    <w:p>
+      <w:pPr>
+        <w:pStyle w:val="ListParagraph"/>
+        <w:numPr>
+          <w:ilvl w:val="0"/>
+          <w:numId w:val="5"/>
+        </w:numPr>
+        <w:spacing w:after="60"/>
+      </w:pPr>
+      <w:r>
+        <w:rPr>
+          <w:rFonts w:ascii="Calibri" w:cs="Calibri" w:eastAsia="Microsoft JhengHei" w:hAnsi="Calibri"/>
+        </w:rPr>
+        <w:t xml:space="preserve">If the build succeeds, restarts </w:t>
+      </w:r>
+      <w:r>
+        <w:rPr>
+          <w:rFonts w:ascii="Consolas" w:cs="Consolas" w:eastAsia="Microsoft JhengHei" w:hAnsi="Consolas"/>
+          <w:color w:val="7A2E0E"/>
+          <w:sz w:val="19"/>
+          <w:szCs w:val="19"/>
+        </w:rPr>
+        <w:t xml:space="preserve">npm start</w:t>
+      </w:r>
+      <w:r>
+        <w:rPr>
+          <w:rFonts w:ascii="Calibri" w:cs="Calibri" w:eastAsia="Microsoft JhengHei" w:hAnsi="Calibri"/>
+        </w:rPr>
+        <w:t xml:space="preserve"> under PM2 and runs </w:t>
+      </w:r>
+      <w:r>
+        <w:rPr>
+          <w:rFonts w:ascii="Consolas" w:cs="Consolas" w:eastAsia="Microsoft JhengHei" w:hAnsi="Consolas"/>
+          <w:color w:val="7A2E0E"/>
+          <w:sz w:val="19"/>
+          <w:szCs w:val="19"/>
+        </w:rPr>
+        <w:t xml:space="preserve">pm2 save</w:t>
+      </w:r>
+      <w:r>
+        <w:rPr>
+          <w:rFonts w:ascii="Calibri" w:cs="Calibri" w:eastAsia="Microsoft JhengHei" w:hAnsi="Calibri"/>
+        </w:rPr>
+        <w:t xml:space="preserve">.</w:t>
+      </w:r>
+    </w:p>
+    <w:p>
+      <w:pPr>
+        <w:keepNext/>
+        <w:spacing w:after="120"/>
+      </w:pPr>
+      <w:r>
+        <w:rPr>
+          <w:rFonts w:ascii="Calibri" w:cs="Calibri" w:eastAsia="Microsoft JhengHei" w:hAnsi="Calibri"/>
+        </w:rPr>
+        <w:t xml:space="preserve">Notes:</w:t>
+      </w:r>
+    </w:p>
+    <w:p>
+      <w:pPr>
+        <w:pStyle w:val="ListParagraph"/>
+        <w:numPr>
+          <w:ilvl w:val="0"/>
+          <w:numId w:val="2"/>
+        </w:numPr>
+        <w:spacing w:after="60"/>
+      </w:pPr>
+      <w:r>
+        <w:rPr>
+          <w:rFonts w:ascii="Calibri" w:cs="Calibri" w:eastAsia="Microsoft JhengHei" w:hAnsi="Calibri"/>
+          <w:b/>
+          <w:bCs/>
+        </w:rPr>
+        <w:t xml:space="preserve">A failed build doesn't restart the service.</w:t>
+      </w:r>
+      <w:r>
+        <w:rPr>
+          <w:rFonts w:ascii="Calibri" w:cs="Calibri" w:eastAsia="Microsoft JhengHei" w:hAnsi="Calibri"/>
+        </w:rPr>
+        <w:t xml:space="preserve"> PM2 keeps running the old process, but the directory on the server already holds the new code. Fix the problem and push again.</w:t>
+      </w:r>
+    </w:p>
+    <w:p>
+      <w:pPr>
+        <w:pStyle w:val="ListParagraph"/>
+        <w:numPr>
+          <w:ilvl w:val="0"/>
+          <w:numId w:val="2"/>
+        </w:numPr>
+        <w:spacing w:after="60"/>
+      </w:pPr>
+      <w:r>
+        <w:rPr>
+          <w:rFonts w:ascii="Calibri" w:cs="Calibri" w:eastAsia="Microsoft JhengHei" w:hAnsi="Calibri"/>
+        </w:rPr>
+        <w:t xml:space="preserve">If </w:t>
+      </w:r>
+      <w:r>
+        <w:rPr>
+          <w:rFonts w:ascii="Consolas" w:cs="Consolas" w:eastAsia="Microsoft JhengHei" w:hAnsi="Consolas"/>
+          <w:color w:val="7A2E0E"/>
+          <w:sz w:val="19"/>
+          <w:szCs w:val="19"/>
+        </w:rPr>
+        <w:t xml:space="preserve">nvm use 22</w:t>
+      </w:r>
+      <w:r>
+        <w:rPr>
+          <w:rFonts w:ascii="Calibri" w:cs="Calibri" w:eastAsia="Microsoft JhengHei" w:hAnsi="Calibri"/>
+        </w:rPr>
+        <w:t xml:space="preserve"> picks v22.7.0, </w:t>
+      </w:r>
+      <w:r>
+        <w:rPr>
+          <w:rFonts w:ascii="Consolas" w:cs="Consolas" w:eastAsia="Microsoft JhengHei" w:hAnsi="Consolas"/>
+          <w:color w:val="7A2E0E"/>
+          <w:sz w:val="19"/>
+          <w:szCs w:val="19"/>
+        </w:rPr>
+        <w:t xml:space="preserve">npm run build</w:t>
+      </w:r>
+      <w:r>
+        <w:rPr>
+          <w:rFonts w:ascii="Calibri" w:cs="Calibri" w:eastAsia="Microsoft JhengHei" w:hAnsi="Calibri"/>
+        </w:rPr>
+        <w:t xml:space="preserve"> fails. Install a newer Node 22 on the server.</w:t>
+      </w:r>
+    </w:p>
+    <w:p>
+      <w:pPr>
+        <w:pStyle w:val="ListParagraph"/>
+        <w:numPr>
+          <w:ilvl w:val="0"/>
+          <w:numId w:val="2"/>
+        </w:numPr>
+        <w:spacing w:after="60"/>
+      </w:pPr>
+      <w:r>
+        <w:rPr>
+          <w:rFonts w:ascii="Calibri" w:cs="Calibri" w:eastAsia="Microsoft JhengHei" w:hAnsi="Calibri"/>
+        </w:rPr>
+        <w:t xml:space="preserve">This flow uses the </w:t>
+      </w:r>
+      <w:r>
+        <w:rPr>
+          <w:rFonts w:ascii="Consolas" w:cs="Consolas" w:eastAsia="Microsoft JhengHei" w:hAnsi="Consolas"/>
+          <w:color w:val="7A2E0E"/>
+          <w:sz w:val="19"/>
+          <w:szCs w:val="19"/>
+        </w:rPr>
+        <w:t xml:space="preserve">.env</w:t>
+      </w:r>
+      <w:r>
+        <w:rPr>
+          <w:rFonts w:ascii="Calibri" w:cs="Calibri" w:eastAsia="Microsoft JhengHei" w:hAnsi="Calibri"/>
+        </w:rPr>
+        <w:t xml:space="preserve"> committed in the repo, so its settings (especially </w:t>
+      </w:r>
+      <w:r>
+        <w:rPr>
+          <w:rFonts w:ascii="Consolas" w:cs="Consolas" w:eastAsia="Microsoft JhengHei" w:hAnsi="Consolas"/>
+          <w:color w:val="7A2E0E"/>
+          <w:sz w:val="19"/>
+          <w:szCs w:val="19"/>
+        </w:rPr>
+        <w:t xml:space="preserve">PUBLIC_URL</w:t>
+      </w:r>
+      <w:r>
+        <w:rPr>
+          <w:rFonts w:ascii="Calibri" w:cs="Calibri" w:eastAsia="Microsoft JhengHei" w:hAnsi="Calibri"/>
+        </w:rPr>
+        <w:t xml:space="preserve">) must fit that server.</w:t>
+      </w:r>
+    </w:p>
+    <w:p>
+      <w:pPr>
+        <w:pStyle w:val="ListParagraph"/>
+        <w:numPr>
+          <w:ilvl w:val="0"/>
+          <w:numId w:val="2"/>
+        </w:numPr>
+        <w:spacing w:after="60"/>
+      </w:pPr>
+      <w:r>
+        <w:rPr>
+          <w:rFonts w:ascii="Calibri" w:cs="Calibri" w:eastAsia="Microsoft JhengHei" w:hAnsi="Calibri"/>
+        </w:rPr>
+        <w:t xml:space="preserve">See the results at https://github.com/infocast-tw/company_profiles/actions.</w:t>
       </w:r>
     </w:p>
     <w:p>
@@ -3504,7 +5075,7 @@
         <w:rPr>
           <w:rFonts w:ascii="Calibri" w:cs="Calibri" w:eastAsia="Microsoft JhengHei" w:hAnsi="Calibri"/>
         </w:rPr>
-        <w:t xml:space="preserve">7. Optional: Nginx reverse proxy (ports 80/443)</w:t>
+        <w:t xml:space="preserve">8. Operations</w:t>
       </w:r>
     </w:p>
     <w:p>
@@ -3526,7 +5097,7 @@
           <w:sz w:val="18"/>
           <w:szCs w:val="18"/>
         </w:rPr>
-        <w:t xml:space="preserve">server {</w:t>
+        <w:t xml:space="preserve"># On the server (the deploy user needs no password for these)</w:t>
       </w:r>
     </w:p>
     <w:p>
@@ -3547,7 +5118,7 @@
           <w:sz w:val="18"/>
           <w:szCs w:val="18"/>
         </w:rPr>
-        <w:t xml:space="preserve">    listen 80;</w:t>
+        <w:t xml:space="preserve">sudo systemctl status stock-app --no-pager</w:t>
       </w:r>
     </w:p>
     <w:p>
@@ -3568,7 +5139,7 @@
           <w:sz w:val="18"/>
           <w:szCs w:val="18"/>
         </w:rPr>
-        <w:t xml:space="preserve">    server_name stock.example.com;</w:t>
+        <w:t xml:space="preserve">sudo journalctl -u stock-app -n 100 --no-pager     # recent log</w:t>
       </w:r>
     </w:p>
     <w:p>
@@ -3589,7 +5160,7 @@
           <w:sz w:val="18"/>
           <w:szCs w:val="18"/>
         </w:rPr>
-        <w:t xml:space="preserve">    location / {</w:t>
+        <w:t xml:space="preserve">sudo journalctl -u stock-app -f                    # follow the log</w:t>
       </w:r>
     </w:p>
     <w:p>
@@ -3610,7 +5181,7 @@
           <w:sz w:val="18"/>
           <w:szCs w:val="18"/>
         </w:rPr>
-        <w:t xml:space="preserve">        proxy_pass http://127.0.0.1:3000;</w:t>
+        <w:t xml:space="preserve"> </w:t>
       </w:r>
     </w:p>
     <w:p>
@@ -3631,7 +5202,7 @@
           <w:sz w:val="18"/>
           <w:szCs w:val="18"/>
         </w:rPr>
-        <w:t xml:space="preserve">        proxy_set_header Host $host;</w:t>
+        <w:t xml:space="preserve"># To change settings: edit shared/.env, then restart</w:t>
       </w:r>
     </w:p>
     <w:p>
@@ -3652,49 +5223,7 @@
           <w:sz w:val="18"/>
           <w:szCs w:val="18"/>
         </w:rPr>
-        <w:t xml:space="preserve">        proxy_set_header X-Forwarded-For $proxy_add_x_forwarded_for;</w:t>
-      </w:r>
-    </w:p>
-    <w:p>
-      <w:pPr>
-        <w:keepNext/>
-        <w:keepLines/>
-        <w:pBdr>
-          <w:left w:val="single" w:color="D9D9D9" w:sz="4" w:space="6"/>
-          <w:right w:val="single" w:color="D9D9D9" w:sz="4" w:space="6"/>
-        </w:pBdr>
-        <w:shd w:fill="F2F2F2" w:color="auto" w:val="clear"/>
-        <w:spacing w:after="0" w:before="0" w:line="228"/>
-        <w:ind w:left="200" w:right="200"/>
-      </w:pPr>
-      <w:r>
-        <w:rPr>
-          <w:rFonts w:ascii="Consolas" w:cs="Consolas" w:eastAsia="Microsoft JhengHei" w:hAnsi="Consolas"/>
-          <w:sz w:val="18"/>
-          <w:szCs w:val="18"/>
-        </w:rPr>
-        <w:t xml:space="preserve">        proxy_read_timeout 60s;   # adding a stock can take up to 20s of lookups</w:t>
-      </w:r>
-    </w:p>
-    <w:p>
-      <w:pPr>
-        <w:keepNext/>
-        <w:keepLines/>
-        <w:pBdr>
-          <w:left w:val="single" w:color="D9D9D9" w:sz="4" w:space="6"/>
-          <w:right w:val="single" w:color="D9D9D9" w:sz="4" w:space="6"/>
-        </w:pBdr>
-        <w:shd w:fill="F2F2F2" w:color="auto" w:val="clear"/>
-        <w:spacing w:after="0" w:before="0" w:line="228"/>
-        <w:ind w:left="200" w:right="200"/>
-      </w:pPr>
-      <w:r>
-        <w:rPr>
-          <w:rFonts w:ascii="Consolas" w:cs="Consolas" w:eastAsia="Microsoft JhengHei" w:hAnsi="Consolas"/>
-          <w:sz w:val="18"/>
-          <w:szCs w:val="18"/>
-        </w:rPr>
-        <w:t xml:space="preserve">    }</w:t>
+        <w:t xml:space="preserve">nano /opt/stock-app/shared/.env</w:t>
       </w:r>
     </w:p>
     <w:p>
@@ -3716,11 +5245,369 @@
           <w:sz w:val="18"/>
           <w:szCs w:val="18"/>
         </w:rPr>
+        <w:t xml:space="preserve">sudo systemctl restart stock-app</w:t>
+      </w:r>
+    </w:p>
+    <w:p>
+      <w:pPr>
+        <w:keepNext/>
+        <w:spacing w:after="120"/>
+      </w:pPr>
+      <w:r>
+        <w:rPr>
+          <w:rFonts w:ascii="Calibri" w:cs="Calibri" w:eastAsia="Microsoft JhengHei" w:hAnsi="Calibri"/>
+        </w:rPr>
+        <w:t xml:space="preserve">To run the </w:t>
+      </w:r>
+      <w:r>
+        <w:rPr>
+          <w:rFonts w:ascii="Consolas" w:cs="Consolas" w:eastAsia="Microsoft JhengHei" w:hAnsi="Consolas"/>
+          <w:color w:val="7A2E0E"/>
+          <w:sz w:val="19"/>
+          <w:szCs w:val="19"/>
+        </w:rPr>
+        <w:t xml:space="preserve">scripts/</w:t>
+      </w:r>
+      <w:r>
+        <w:rPr>
+          <w:rFonts w:ascii="Calibri" w:cs="Calibri" w:eastAsia="Microsoft JhengHei" w:hAnsi="Calibri"/>
+        </w:rPr>
+        <w:t xml:space="preserve"> CLI tools on the server, run them as the service user so they can read </w:t>
+      </w:r>
+      <w:r>
+        <w:rPr>
+          <w:rFonts w:ascii="Consolas" w:cs="Consolas" w:eastAsia="Microsoft JhengHei" w:hAnsi="Consolas"/>
+          <w:color w:val="7A2E0E"/>
+          <w:sz w:val="19"/>
+          <w:szCs w:val="19"/>
+        </w:rPr>
+        <w:t xml:space="preserve">.env</w:t>
+      </w:r>
+      <w:r>
+        <w:rPr>
+          <w:rFonts w:ascii="Calibri" w:cs="Calibri" w:eastAsia="Microsoft JhengHei" w:hAnsi="Calibri"/>
+        </w:rPr>
+        <w:t xml:space="preserve">:</w:t>
+      </w:r>
+    </w:p>
+    <w:p>
+      <w:pPr>
+        <w:keepNext/>
+        <w:keepLines/>
+        <w:pBdr>
+          <w:top w:val="single" w:color="D9D9D9" w:sz="4" w:space="4"/>
+          <w:left w:val="single" w:color="D9D9D9" w:sz="4" w:space="6"/>
+          <w:right w:val="single" w:color="D9D9D9" w:sz="4" w:space="6"/>
+        </w:pBdr>
+        <w:shd w:fill="F2F2F2" w:color="auto" w:val="clear"/>
+        <w:spacing w:after="0" w:before="80" w:line="228"/>
+        <w:ind w:left="200" w:right="200"/>
+      </w:pPr>
+      <w:r>
+        <w:rPr>
+          <w:rFonts w:ascii="Consolas" w:cs="Consolas" w:eastAsia="Microsoft JhengHei" w:hAnsi="Consolas"/>
+          <w:sz w:val="18"/>
+          <w:szCs w:val="18"/>
+        </w:rPr>
+        <w:t xml:space="preserve">cd /opt/stock-app/current</w:t>
+      </w:r>
+    </w:p>
+    <w:p>
+      <w:pPr>
+        <w:keepNext/>
+        <w:keepLines/>
+        <w:pBdr>
+          <w:left w:val="single" w:color="D9D9D9" w:sz="4" w:space="6"/>
+          <w:right w:val="single" w:color="D9D9D9" w:sz="4" w:space="6"/>
+        </w:pBdr>
+        <w:shd w:fill="F2F2F2" w:color="auto" w:val="clear"/>
+        <w:spacing w:after="0" w:before="0" w:line="228"/>
+        <w:ind w:left="200" w:right="200"/>
+      </w:pPr>
+      <w:r>
+        <w:rPr>
+          <w:rFonts w:ascii="Consolas" w:cs="Consolas" w:eastAsia="Microsoft JhengHei" w:hAnsi="Consolas"/>
+          <w:sz w:val="18"/>
+          <w:szCs w:val="18"/>
+        </w:rPr>
+        <w:t xml:space="preserve">sudo -u stockapp node scripts/monitor-stocks.js AAPL MSFT          # preview</w:t>
+      </w:r>
+    </w:p>
+    <w:p>
+      <w:pPr>
+        <w:keepNext w:val="false"/>
+        <w:keepLines/>
+        <w:pBdr>
+          <w:left w:val="single" w:color="D9D9D9" w:sz="4" w:space="6"/>
+          <w:bottom w:val="single" w:color="D9D9D9" w:sz="4" w:space="4"/>
+          <w:right w:val="single" w:color="D9D9D9" w:sz="4" w:space="6"/>
+        </w:pBdr>
+        <w:shd w:fill="F2F2F2" w:color="auto" w:val="clear"/>
+        <w:spacing w:after="160" w:before="0" w:line="228"/>
+        <w:ind w:left="200" w:right="200"/>
+      </w:pPr>
+      <w:r>
+        <w:rPr>
+          <w:rFonts w:ascii="Consolas" w:cs="Consolas" w:eastAsia="Microsoft JhengHei" w:hAnsi="Consolas"/>
+          <w:sz w:val="18"/>
+          <w:szCs w:val="18"/>
+        </w:rPr>
+        <w:t xml:space="preserve">sudo -u stockapp node scripts/add-from-yahoo.js NVDA</w:t>
+      </w:r>
+    </w:p>
+    <w:p>
+      <w:pPr>
+        <w:keepNext w:val="false"/>
+        <w:spacing w:after="120"/>
+      </w:pPr>
+      <w:r>
+        <w:rPr>
+          <w:rFonts w:ascii="Calibri" w:cs="Calibri" w:eastAsia="Microsoft JhengHei" w:hAnsi="Calibri"/>
+        </w:rPr>
+        <w:t xml:space="preserve">This needs general sudo rights for the deploy user. Scripts that write files, such as </w:t>
+      </w:r>
+      <w:r>
+        <w:rPr>
+          <w:rFonts w:ascii="Consolas" w:cs="Consolas" w:eastAsia="Microsoft JhengHei" w:hAnsi="Consolas"/>
+          <w:color w:val="7A2E0E"/>
+          <w:sz w:val="19"/>
+          <w:szCs w:val="19"/>
+        </w:rPr>
+        <w:t xml:space="preserve">export-to-csv.js</w:t>
+      </w:r>
+      <w:r>
+        <w:rPr>
+          <w:rFonts w:ascii="Calibri" w:cs="Calibri" w:eastAsia="Microsoft JhengHei" w:hAnsi="Calibri"/>
+        </w:rPr>
+        <w:t xml:space="preserve">, must run as the deploy user instead, because the deploy user owns the release directories.</w:t>
+      </w:r>
+    </w:p>
+    <w:p>
+      <w:pPr>
+        <w:pStyle w:val="Heading1"/>
+      </w:pPr>
+      <w:r>
+        <w:rPr>
+          <w:rFonts w:ascii="Calibri" w:cs="Calibri" w:eastAsia="Microsoft JhengHei" w:hAnsi="Calibri"/>
+        </w:rPr>
+        <w:t xml:space="preserve">9. Optional: Nginx reverse proxy (ports 80/443)</w:t>
+      </w:r>
+    </w:p>
+    <w:p>
+      <w:pPr>
+        <w:keepNext/>
+        <w:keepLines/>
+        <w:pBdr>
+          <w:top w:val="single" w:color="D9D9D9" w:sz="4" w:space="4"/>
+          <w:left w:val="single" w:color="D9D9D9" w:sz="4" w:space="6"/>
+          <w:right w:val="single" w:color="D9D9D9" w:sz="4" w:space="6"/>
+        </w:pBdr>
+        <w:shd w:fill="F2F2F2" w:color="auto" w:val="clear"/>
+        <w:spacing w:after="0" w:before="80" w:line="228"/>
+        <w:ind w:left="200" w:right="200"/>
+      </w:pPr>
+      <w:r>
+        <w:rPr>
+          <w:rFonts w:ascii="Consolas" w:cs="Consolas" w:eastAsia="Microsoft JhengHei" w:hAnsi="Consolas"/>
+          <w:sz w:val="18"/>
+          <w:szCs w:val="18"/>
+        </w:rPr>
+        <w:t xml:space="preserve">server {</w:t>
+      </w:r>
+    </w:p>
+    <w:p>
+      <w:pPr>
+        <w:keepNext/>
+        <w:keepLines/>
+        <w:pBdr>
+          <w:left w:val="single" w:color="D9D9D9" w:sz="4" w:space="6"/>
+          <w:right w:val="single" w:color="D9D9D9" w:sz="4" w:space="6"/>
+        </w:pBdr>
+        <w:shd w:fill="F2F2F2" w:color="auto" w:val="clear"/>
+        <w:spacing w:after="0" w:before="0" w:line="228"/>
+        <w:ind w:left="200" w:right="200"/>
+      </w:pPr>
+      <w:r>
+        <w:rPr>
+          <w:rFonts w:ascii="Consolas" w:cs="Consolas" w:eastAsia="Microsoft JhengHei" w:hAnsi="Consolas"/>
+          <w:sz w:val="18"/>
+          <w:szCs w:val="18"/>
+        </w:rPr>
+        <w:t xml:space="preserve">    listen 80;</w:t>
+      </w:r>
+    </w:p>
+    <w:p>
+      <w:pPr>
+        <w:keepNext/>
+        <w:keepLines/>
+        <w:pBdr>
+          <w:left w:val="single" w:color="D9D9D9" w:sz="4" w:space="6"/>
+          <w:right w:val="single" w:color="D9D9D9" w:sz="4" w:space="6"/>
+        </w:pBdr>
+        <w:shd w:fill="F2F2F2" w:color="auto" w:val="clear"/>
+        <w:spacing w:after="0" w:before="0" w:line="228"/>
+        <w:ind w:left="200" w:right="200"/>
+      </w:pPr>
+      <w:r>
+        <w:rPr>
+          <w:rFonts w:ascii="Consolas" w:cs="Consolas" w:eastAsia="Microsoft JhengHei" w:hAnsi="Consolas"/>
+          <w:sz w:val="18"/>
+          <w:szCs w:val="18"/>
+        </w:rPr>
+        <w:t xml:space="preserve">    server_name stock.example.com;</w:t>
+      </w:r>
+    </w:p>
+    <w:p>
+      <w:pPr>
+        <w:keepNext/>
+        <w:keepLines/>
+        <w:pBdr>
+          <w:left w:val="single" w:color="D9D9D9" w:sz="4" w:space="6"/>
+          <w:right w:val="single" w:color="D9D9D9" w:sz="4" w:space="6"/>
+        </w:pBdr>
+        <w:shd w:fill="F2F2F2" w:color="auto" w:val="clear"/>
+        <w:spacing w:after="0" w:before="0" w:line="228"/>
+        <w:ind w:left="200" w:right="200"/>
+      </w:pPr>
+      <w:r>
+        <w:rPr>
+          <w:rFonts w:ascii="Consolas" w:cs="Consolas" w:eastAsia="Microsoft JhengHei" w:hAnsi="Consolas"/>
+          <w:sz w:val="18"/>
+          <w:szCs w:val="18"/>
+        </w:rPr>
+        <w:t xml:space="preserve">    location / {</w:t>
+      </w:r>
+    </w:p>
+    <w:p>
+      <w:pPr>
+        <w:keepNext/>
+        <w:keepLines/>
+        <w:pBdr>
+          <w:left w:val="single" w:color="D9D9D9" w:sz="4" w:space="6"/>
+          <w:right w:val="single" w:color="D9D9D9" w:sz="4" w:space="6"/>
+        </w:pBdr>
+        <w:shd w:fill="F2F2F2" w:color="auto" w:val="clear"/>
+        <w:spacing w:after="0" w:before="0" w:line="228"/>
+        <w:ind w:left="200" w:right="200"/>
+      </w:pPr>
+      <w:r>
+        <w:rPr>
+          <w:rFonts w:ascii="Consolas" w:cs="Consolas" w:eastAsia="Microsoft JhengHei" w:hAnsi="Consolas"/>
+          <w:sz w:val="18"/>
+          <w:szCs w:val="18"/>
+        </w:rPr>
+        <w:t xml:space="preserve">        proxy_pass http://127.0.0.1:3000;</w:t>
+      </w:r>
+    </w:p>
+    <w:p>
+      <w:pPr>
+        <w:keepNext/>
+        <w:keepLines/>
+        <w:pBdr>
+          <w:left w:val="single" w:color="D9D9D9" w:sz="4" w:space="6"/>
+          <w:right w:val="single" w:color="D9D9D9" w:sz="4" w:space="6"/>
+        </w:pBdr>
+        <w:shd w:fill="F2F2F2" w:color="auto" w:val="clear"/>
+        <w:spacing w:after="0" w:before="0" w:line="228"/>
+        <w:ind w:left="200" w:right="200"/>
+      </w:pPr>
+      <w:r>
+        <w:rPr>
+          <w:rFonts w:ascii="Consolas" w:cs="Consolas" w:eastAsia="Microsoft JhengHei" w:hAnsi="Consolas"/>
+          <w:sz w:val="18"/>
+          <w:szCs w:val="18"/>
+        </w:rPr>
+        <w:t xml:space="preserve">        proxy_set_header Host $host;</w:t>
+      </w:r>
+    </w:p>
+    <w:p>
+      <w:pPr>
+        <w:keepNext/>
+        <w:keepLines/>
+        <w:pBdr>
+          <w:left w:val="single" w:color="D9D9D9" w:sz="4" w:space="6"/>
+          <w:right w:val="single" w:color="D9D9D9" w:sz="4" w:space="6"/>
+        </w:pBdr>
+        <w:shd w:fill="F2F2F2" w:color="auto" w:val="clear"/>
+        <w:spacing w:after="0" w:before="0" w:line="228"/>
+        <w:ind w:left="200" w:right="200"/>
+      </w:pPr>
+      <w:r>
+        <w:rPr>
+          <w:rFonts w:ascii="Consolas" w:cs="Consolas" w:eastAsia="Microsoft JhengHei" w:hAnsi="Consolas"/>
+          <w:sz w:val="18"/>
+          <w:szCs w:val="18"/>
+        </w:rPr>
+        <w:t xml:space="preserve">        proxy_set_header X-Forwarded-For $proxy_add_x_forwarded_for;</w:t>
+      </w:r>
+    </w:p>
+    <w:p>
+      <w:pPr>
+        <w:keepNext/>
+        <w:keepLines/>
+        <w:pBdr>
+          <w:left w:val="single" w:color="D9D9D9" w:sz="4" w:space="6"/>
+          <w:right w:val="single" w:color="D9D9D9" w:sz="4" w:space="6"/>
+        </w:pBdr>
+        <w:shd w:fill="F2F2F2" w:color="auto" w:val="clear"/>
+        <w:spacing w:after="0" w:before="0" w:line="228"/>
+        <w:ind w:left="200" w:right="200"/>
+      </w:pPr>
+      <w:r>
+        <w:rPr>
+          <w:rFonts w:ascii="Consolas" w:cs="Consolas" w:eastAsia="Microsoft JhengHei" w:hAnsi="Consolas"/>
+          <w:sz w:val="18"/>
+          <w:szCs w:val="18"/>
+        </w:rPr>
+        <w:t xml:space="preserve">        proxy_read_timeout 60s;   # adding a stock can take up to 20s of lookups</w:t>
+      </w:r>
+    </w:p>
+    <w:p>
+      <w:pPr>
+        <w:keepNext/>
+        <w:keepLines/>
+        <w:pBdr>
+          <w:left w:val="single" w:color="D9D9D9" w:sz="4" w:space="6"/>
+          <w:right w:val="single" w:color="D9D9D9" w:sz="4" w:space="6"/>
+        </w:pBdr>
+        <w:shd w:fill="F2F2F2" w:color="auto" w:val="clear"/>
+        <w:spacing w:after="0" w:before="0" w:line="228"/>
+        <w:ind w:left="200" w:right="200"/>
+      </w:pPr>
+      <w:r>
+        <w:rPr>
+          <w:rFonts w:ascii="Consolas" w:cs="Consolas" w:eastAsia="Microsoft JhengHei" w:hAnsi="Consolas"/>
+          <w:sz w:val="18"/>
+          <w:szCs w:val="18"/>
+        </w:rPr>
+        <w:t xml:space="preserve">    }</w:t>
+      </w:r>
+    </w:p>
+    <w:p>
+      <w:pPr>
+        <w:keepNext w:val="false"/>
+        <w:keepLines/>
+        <w:pBdr>
+          <w:left w:val="single" w:color="D9D9D9" w:sz="4" w:space="6"/>
+          <w:bottom w:val="single" w:color="D9D9D9" w:sz="4" w:space="4"/>
+          <w:right w:val="single" w:color="D9D9D9" w:sz="4" w:space="6"/>
+        </w:pBdr>
+        <w:shd w:fill="F2F2F2" w:color="auto" w:val="clear"/>
+        <w:spacing w:after="160" w:before="0" w:line="228"/>
+        <w:ind w:left="200" w:right="200"/>
+      </w:pPr>
+      <w:r>
+        <w:rPr>
+          <w:rFonts w:ascii="Consolas" w:cs="Consolas" w:eastAsia="Microsoft JhengHei" w:hAnsi="Consolas"/>
+          <w:sz w:val="18"/>
+          <w:szCs w:val="18"/>
+        </w:rPr>
         <w:t xml:space="preserve">}</w:t>
       </w:r>
     </w:p>
     <w:p>
       <w:pPr>
+        <w:keepNext/>
         <w:spacing w:after="120"/>
       </w:pPr>
       <w:r>
@@ -3861,7 +5748,7 @@
         <w:rPr>
           <w:rFonts w:ascii="Calibri" w:cs="Calibri" w:eastAsia="Microsoft JhengHei" w:hAnsi="Calibri"/>
         </w:rPr>
-        <w:t xml:space="preserve">8. Troubleshooting</w:t>
+        <w:t xml:space="preserve">10. Troubleshooting</w:t>
       </w:r>
     </w:p>
     <w:tbl>
@@ -4299,15 +6186,7 @@
                 <w:sz w:val="19"/>
                 <w:szCs w:val="19"/>
               </w:rPr>
-              <w:t xml:space="preserve">Health check failed</w:t>
-            </w:r>
-            <w:r>
-              <w:rPr>
-                <w:rFonts w:ascii="Calibri" w:cs="Calibri" w:eastAsia="Microsoft JhengHei" w:hAnsi="Calibri"/>
-                <w:sz w:val="20"/>
-                <w:szCs w:val="20"/>
-              </w:rPr>
-              <w:t xml:space="preserve">, then an automatic rollback</w:t>
+              <w:t xml:space="preserve">Build check failed</w:t>
             </w:r>
           </w:p>
         </w:tc>
@@ -4337,7 +6216,7 @@
                 <w:sz w:val="20"/>
                 <w:szCs w:val="20"/>
               </w:rPr>
-              <w:t xml:space="preserve">Read the log printed after the message. Common causes: the server can't reach the database (IP restriction), or another process is using the </w:t>
+              <w:t xml:space="preserve">The reasons </w:t>
             </w:r>
             <w:r>
               <w:rPr>
@@ -4346,7 +6225,7 @@
                 <w:sz w:val="19"/>
                 <w:szCs w:val="19"/>
               </w:rPr>
-              <w:t xml:space="preserve">PORT</w:t>
+              <w:t xml:space="preserve">npm run build</w:t>
             </w:r>
             <w:r>
               <w:rPr>
@@ -4354,7 +6233,7 @@
                 <w:sz w:val="20"/>
                 <w:szCs w:val="20"/>
               </w:rPr>
-              <w:t xml:space="preserve"> from </w:t>
+              <w:t xml:space="preserve"> lists: the Node version (upgrade to 22.8.0 or newer), a JS syntax error (fix it, commit and deploy again) or a missing dependency (run </w:t>
             </w:r>
             <w:r>
               <w:rPr>
@@ -4363,7 +6242,7 @@
                 <w:sz w:val="19"/>
                 <w:szCs w:val="19"/>
               </w:rPr>
-              <w:t xml:space="preserve">.env</w:t>
+              <w:t xml:space="preserve">npm install</w:t>
             </w:r>
             <w:r>
               <w:rPr>
@@ -4371,7 +6250,7 @@
                 <w:sz w:val="20"/>
                 <w:szCs w:val="20"/>
               </w:rPr>
-              <w:t xml:space="preserve">.</w:t>
+              <w:t xml:space="preserve"> again). The deploy stopped and the live release is unaffected.</w:t>
             </w:r>
           </w:p>
         </w:tc>
@@ -4399,11 +6278,20 @@
             </w:pPr>
             <w:r>
               <w:rPr>
+                <w:rFonts w:ascii="Consolas" w:cs="Consolas" w:eastAsia="Microsoft JhengHei" w:hAnsi="Consolas"/>
+                <w:color w:val="7A2E0E"/>
+                <w:sz w:val="19"/>
+                <w:szCs w:val="19"/>
+              </w:rPr>
+              <w:t xml:space="preserve">Health check failed</w:t>
+            </w:r>
+            <w:r>
+              <w:rPr>
                 <w:rFonts w:ascii="Calibri" w:cs="Calibri" w:eastAsia="Microsoft JhengHei" w:hAnsi="Calibri"/>
                 <w:sz w:val="20"/>
                 <w:szCs w:val="20"/>
               </w:rPr>
-              <w:t xml:space="preserve">The page loads but shows no data</w:t>
+              <w:t xml:space="preserve">, then an automatic rollback</w:t>
             </w:r>
           </w:p>
         </w:tc>
@@ -4429,12 +6317,20 @@
             </w:pPr>
             <w:r>
               <w:rPr>
+                <w:rFonts w:ascii="Calibri" w:cs="Calibri" w:eastAsia="Microsoft JhengHei" w:hAnsi="Calibri"/>
+                <w:sz w:val="20"/>
+                <w:szCs w:val="20"/>
+              </w:rPr>
+              <w:t xml:space="preserve">Read the log printed after the message. Common causes: the server can't reach the database (IP restriction), or another process is using the </w:t>
+            </w:r>
+            <w:r>
+              <w:rPr>
                 <w:rFonts w:ascii="Consolas" w:cs="Consolas" w:eastAsia="Microsoft JhengHei" w:hAnsi="Consolas"/>
                 <w:color w:val="7A2E0E"/>
                 <w:sz w:val="19"/>
                 <w:szCs w:val="19"/>
               </w:rPr>
-              <w:t xml:space="preserve">PUBLIC_URL</w:t>
+              <w:t xml:space="preserve">PORT</w:t>
             </w:r>
             <w:r>
               <w:rPr>
@@ -4442,7 +6338,24 @@
                 <w:sz w:val="20"/>
                 <w:szCs w:val="20"/>
               </w:rPr>
-              <w:t xml:space="preserve"> still points at an old address. Fix or delete it, then restart.</w:t>
+              <w:t xml:space="preserve"> from </w:t>
+            </w:r>
+            <w:r>
+              <w:rPr>
+                <w:rFonts w:ascii="Consolas" w:cs="Consolas" w:eastAsia="Microsoft JhengHei" w:hAnsi="Consolas"/>
+                <w:color w:val="7A2E0E"/>
+                <w:sz w:val="19"/>
+                <w:szCs w:val="19"/>
+              </w:rPr>
+              <w:t xml:space="preserve">.env</w:t>
+            </w:r>
+            <w:r>
+              <w:rPr>
+                <w:rFonts w:ascii="Calibri" w:cs="Calibri" w:eastAsia="Microsoft JhengHei" w:hAnsi="Calibri"/>
+                <w:sz w:val="20"/>
+                <w:szCs w:val="20"/>
+              </w:rPr>
+              <w:t xml:space="preserve">.</w:t>
             </w:r>
           </w:p>
         </w:tc>
@@ -4474,16 +6387,7 @@
                 <w:sz w:val="20"/>
                 <w:szCs w:val="20"/>
               </w:rPr>
-              <w:t xml:space="preserve">Writes fail with </w:t>
-            </w:r>
-            <w:r>
-              <w:rPr>
-                <w:rFonts w:ascii="Consolas" w:cs="Consolas" w:eastAsia="Microsoft JhengHei" w:hAnsi="Consolas"/>
-                <w:color w:val="7A2E0E"/>
-                <w:sz w:val="19"/>
-                <w:szCs w:val="19"/>
-              </w:rPr>
-              <w:t xml:space="preserve">permission denied for schema sandbox</w:t>
+              <w:t xml:space="preserve">The page loads but shows no data</w:t>
             </w:r>
           </w:p>
         </w:tc>
@@ -4509,11 +6413,20 @@
             </w:pPr>
             <w:r>
               <w:rPr>
+                <w:rFonts w:ascii="Consolas" w:cs="Consolas" w:eastAsia="Microsoft JhengHei" w:hAnsi="Consolas"/>
+                <w:color w:val="7A2E0E"/>
+                <w:sz w:val="19"/>
+                <w:szCs w:val="19"/>
+              </w:rPr>
+              <w:t xml:space="preserve">PUBLIC_URL</w:t>
+            </w:r>
+            <w:r>
+              <w:rPr>
                 <w:rFonts w:ascii="Calibri" w:cs="Calibri" w:eastAsia="Microsoft JhengHei" w:hAnsi="Calibri"/>
                 <w:sz w:val="20"/>
                 <w:szCs w:val="20"/>
               </w:rPr>
-              <w:t xml:space="preserve">A permission on the database's audit trigger. The DBA must grant it; it isn't a deployment problem.</w:t>
+              <w:t xml:space="preserve"> still points at an old address. Fix or delete it, then restart.</w:t>
             </w:r>
           </w:p>
         </w:tc>
@@ -4545,16 +6458,16 @@
                 <w:sz w:val="20"/>
                 <w:szCs w:val="20"/>
               </w:rPr>
-              <w:t xml:space="preserve">Accented company names show as </w:t>
-            </w:r>
-            <w:r>
-              <w:rPr>
-                <w:rFonts w:ascii="Segoe UI" w:cs="Segoe UI" w:eastAsia="Segoe UI" w:hAnsi="Segoe UI"/>
+              <w:t xml:space="preserve">Writes fail with </w:t>
+            </w:r>
+            <w:r>
+              <w:rPr>
+                <w:rFonts w:ascii="Consolas" w:cs="Consolas" w:eastAsia="Microsoft JhengHei" w:hAnsi="Consolas"/>
                 <w:color w:val="7A2E0E"/>
                 <w:sz w:val="19"/>
                 <w:szCs w:val="19"/>
               </w:rPr>
-              <w:t xml:space="preserve">�</w:t>
+              <w:t xml:space="preserve">permission denied for schema sandbox</w:t>
             </w:r>
           </w:p>
         </w:tc>
@@ -4584,24 +6497,7 @@
                 <w:sz w:val="20"/>
                 <w:szCs w:val="20"/>
               </w:rPr>
-              <w:t xml:space="preserve">The server's Node is v22.7.0. Upgrade it (</w:t>
-            </w:r>
-            <w:r>
-              <w:rPr>
-                <w:rFonts w:ascii="Consolas" w:cs="Consolas" w:eastAsia="Microsoft JhengHei" w:hAnsi="Consolas"/>
-                <w:color w:val="7A2E0E"/>
-                <w:sz w:val="19"/>
-                <w:szCs w:val="19"/>
-              </w:rPr>
-              <w:t xml:space="preserve">sudo n install 22</w:t>
-            </w:r>
-            <w:r>
-              <w:rPr>
-                <w:rFonts w:ascii="Calibri" w:cs="Calibri" w:eastAsia="Microsoft JhengHei" w:hAnsi="Calibri"/>
-                <w:sz w:val="20"/>
-                <w:szCs w:val="20"/>
-              </w:rPr>
-              <w:t xml:space="preserve">) and restart.</w:t>
+              <w:t xml:space="preserve">A permission on the database's audit trigger. The DBA must grant it; it isn't a deployment problem.</w:t>
             </w:r>
           </w:p>
         </w:tc>
@@ -4633,7 +6529,16 @@
                 <w:sz w:val="20"/>
                 <w:szCs w:val="20"/>
               </w:rPr>
-              <w:t xml:space="preserve">The daily check doesn't run</w:t>
+              <w:t xml:space="preserve">Accented company names show as </w:t>
+            </w:r>
+            <w:r>
+              <w:rPr>
+                <w:rFonts w:ascii="Segoe UI" w:cs="Segoe UI" w:eastAsia="Segoe UI" w:hAnsi="Segoe UI"/>
+                <w:color w:val="7A2E0E"/>
+                <w:sz w:val="19"/>
+                <w:szCs w:val="19"/>
+              </w:rPr>
+              <w:t xml:space="preserve">�</w:t>
             </w:r>
           </w:p>
         </w:tc>
@@ -4659,12 +6564,20 @@
             </w:pPr>
             <w:r>
               <w:rPr>
+                <w:rFonts w:ascii="Calibri" w:cs="Calibri" w:eastAsia="Microsoft JhengHei" w:hAnsi="Calibri"/>
+                <w:sz w:val="20"/>
+                <w:szCs w:val="20"/>
+              </w:rPr>
+              <w:t xml:space="preserve">The server's Node is v22.7.0. Upgrade it (</w:t>
+            </w:r>
+            <w:r>
+              <w:rPr>
                 <w:rFonts w:ascii="Consolas" w:cs="Consolas" w:eastAsia="Microsoft JhengHei" w:hAnsi="Consolas"/>
                 <w:color w:val="7A2E0E"/>
                 <w:sz w:val="19"/>
                 <w:szCs w:val="19"/>
               </w:rPr>
-              <w:t xml:space="preserve">MONITOR_DAILY_AT</w:t>
+              <w:t xml:space="preserve">sudo n install 22</w:t>
             </w:r>
             <w:r>
               <w:rPr>
@@ -4672,8 +6585,62 @@
                 <w:sz w:val="20"/>
                 <w:szCs w:val="20"/>
               </w:rPr>
-              <w:t xml:space="preserve"> isn't set, or you expected a different time zone (it uses </w:t>
-            </w:r>
+              <w:t xml:space="preserve">) and restart.</w:t>
+            </w:r>
+          </w:p>
+        </w:tc>
+      </w:tr>
+      <w:tr>
+        <w:tc>
+          <w:tcPr>
+            <w:tcW w:type="dxa" w:w="4364"/>
+            <w:tcBorders>
+              <w:top w:val="single" w:color="BFBFBF" w:sz="4"/>
+              <w:left w:val="single" w:color="BFBFBF" w:sz="4"/>
+              <w:bottom w:val="single" w:color="BFBFBF" w:sz="4"/>
+              <w:right w:val="single" w:color="BFBFBF" w:sz="4"/>
+            </w:tcBorders>
+            <w:tcMar>
+              <w:top w:type="dxa" w:w="60"/>
+              <w:left w:type="dxa" w:w="100"/>
+              <w:bottom w:type="dxa" w:w="60"/>
+              <w:right w:type="dxa" w:w="100"/>
+            </w:tcMar>
+          </w:tcPr>
+          <w:p>
+            <w:pPr>
+              <w:spacing w:after="0"/>
+            </w:pPr>
+            <w:r>
+              <w:rPr>
+                <w:rFonts w:ascii="Calibri" w:cs="Calibri" w:eastAsia="Microsoft JhengHei" w:hAnsi="Calibri"/>
+                <w:sz w:val="20"/>
+                <w:szCs w:val="20"/>
+              </w:rPr>
+              <w:t xml:space="preserve">The daily check doesn't run</w:t>
+            </w:r>
+          </w:p>
+        </w:tc>
+        <w:tc>
+          <w:tcPr>
+            <w:tcW w:type="dxa" w:w="4942"/>
+            <w:tcBorders>
+              <w:top w:val="single" w:color="BFBFBF" w:sz="4"/>
+              <w:left w:val="single" w:color="BFBFBF" w:sz="4"/>
+              <w:bottom w:val="single" w:color="BFBFBF" w:sz="4"/>
+              <w:right w:val="single" w:color="BFBFBF" w:sz="4"/>
+            </w:tcBorders>
+            <w:tcMar>
+              <w:top w:type="dxa" w:w="60"/>
+              <w:left w:type="dxa" w:w="100"/>
+              <w:bottom w:type="dxa" w:w="60"/>
+              <w:right w:type="dxa" w:w="100"/>
+            </w:tcMar>
+          </w:tcPr>
+          <w:p>
+            <w:pPr>
+              <w:spacing w:after="0"/>
+            </w:pPr>
             <w:r>
               <w:rPr>
                 <w:rFonts w:ascii="Consolas" w:cs="Consolas" w:eastAsia="Microsoft JhengHei" w:hAnsi="Consolas"/>
@@ -4681,7 +6648,7 @@
                 <w:sz w:val="19"/>
                 <w:szCs w:val="19"/>
               </w:rPr>
-              <w:t xml:space="preserve">APP_TZ</w:t>
+              <w:t xml:space="preserve">MONITOR_DAILY_AT</w:t>
             </w:r>
             <w:r>
               <w:rPr>
@@ -4689,7 +6656,7 @@
                 <w:sz w:val="20"/>
                 <w:szCs w:val="20"/>
               </w:rPr>
-              <w:t xml:space="preserve">). Look for </w:t>
+              <w:t xml:space="preserve"> isn't set, or you expected a different time zone (it uses </w:t>
             </w:r>
             <w:r>
               <w:rPr>
@@ -4698,6 +6665,23 @@
                 <w:sz w:val="19"/>
                 <w:szCs w:val="19"/>
               </w:rPr>
+              <w:t xml:space="preserve">APP_TZ</w:t>
+            </w:r>
+            <w:r>
+              <w:rPr>
+                <w:rFonts w:ascii="Calibri" w:cs="Calibri" w:eastAsia="Microsoft JhengHei" w:hAnsi="Calibri"/>
+                <w:sz w:val="20"/>
+                <w:szCs w:val="20"/>
+              </w:rPr>
+              <w:t xml:space="preserve">). Look for </w:t>
+            </w:r>
+            <w:r>
+              <w:rPr>
+                <w:rFonts w:ascii="Consolas" w:cs="Consolas" w:eastAsia="Microsoft JhengHei" w:hAnsi="Consolas"/>
+                <w:color w:val="7A2E0E"/>
+                <w:sz w:val="19"/>
+                <w:szCs w:val="19"/>
+              </w:rPr>
               <w:t xml:space="preserve">[monitor] daily check scheduled for ...</w:t>
             </w:r>
             <w:r>
@@ -4725,7 +6709,7 @@
         <w:rPr>
           <w:rFonts w:ascii="Calibri" w:cs="Calibri" w:eastAsia="Microsoft JhengHei" w:hAnsi="Calibri"/>
         </w:rPr>
-        <w:t xml:space="preserve">9. Uninstall</w:t>
+        <w:t xml:space="preserve">11. Uninstall</w:t>
       </w:r>
     </w:p>
     <w:p>
@@ -4837,6 +6821,7 @@
     </w:p>
     <w:p>
       <w:pPr>
+        <w:keepNext w:val="false"/>
         <w:spacing w:after="120"/>
       </w:pPr>
       <w:r>
@@ -5100,6 +7085,18 @@
     </w:lvlOverride>
   </w:num>
   <w:num w:numId="3">
+    <w:abstractNumId w:val="3"/>
+    <w:lvlOverride w:ilvl="0">
+      <w:startOverride w:val="1"/>
+    </w:lvlOverride>
+  </w:num>
+  <w:num w:numId="4">
+    <w:abstractNumId w:val="3"/>
+    <w:lvlOverride w:ilvl="0">
+      <w:startOverride w:val="1"/>
+    </w:lvlOverride>
+  </w:num>
+  <w:num w:numId="5">
     <w:abstractNumId w:val="3"/>
     <w:lvlOverride w:ilvl="0">
       <w:startOverride w:val="1"/>

</xml_diff>

<commit_message>
Build check: fail on a UTF-16 .env
dotenv reads a UTF-16 .env (what Windows PowerShell 5.1's `>` writes) as
no settings at all, so the app ran without database settings. npm run
build now fails with a clear message instead. The Word guides' troubleshooting
table has a row for it.

Co-Authored-By: Claude Opus 5.5 <noreply@anthropic.com>
</commit_message>
<xml_diff>
--- a/docs/Deployment_Guide_en.docx
+++ b/docs/Deployment_Guide_en.docx
@@ -5764,8 +5764,8 @@
         </w:tblBorders>
       </w:tblPr>
       <w:tblGrid>
-        <w:gridCol w:w="4364"/>
-        <w:gridCol w:w="4942"/>
+        <w:gridCol w:w="4450"/>
+        <w:gridCol w:w="4856"/>
       </w:tblGrid>
       <w:tr>
         <w:trPr>
@@ -5773,7 +5773,7 @@
         </w:trPr>
         <w:tc>
           <w:tcPr>
-            <w:tcW w:type="dxa" w:w="4364"/>
+            <w:tcW w:type="dxa" w:w="4450"/>
             <w:tcBorders>
               <w:top w:val="single" w:color="BFBFBF" w:sz="4"/>
               <w:left w:val="single" w:color="BFBFBF" w:sz="4"/>
@@ -5806,7 +5806,7 @@
         </w:tc>
         <w:tc>
           <w:tcPr>
-            <w:tcW w:type="dxa" w:w="4942"/>
+            <w:tcW w:type="dxa" w:w="4856"/>
             <w:tcBorders>
               <w:top w:val="single" w:color="BFBFBF" w:sz="4"/>
               <w:left w:val="single" w:color="BFBFBF" w:sz="4"/>
@@ -5841,7 +5841,7 @@
       <w:tr>
         <w:tc>
           <w:tcPr>
-            <w:tcW w:type="dxa" w:w="4364"/>
+            <w:tcW w:type="dxa" w:w="4450"/>
             <w:tcBorders>
               <w:top w:val="single" w:color="BFBFBF" w:sz="4"/>
               <w:left w:val="single" w:color="BFBFBF" w:sz="4"/>
@@ -5872,7 +5872,7 @@
         </w:tc>
         <w:tc>
           <w:tcPr>
-            <w:tcW w:type="dxa" w:w="4942"/>
+            <w:tcW w:type="dxa" w:w="4856"/>
             <w:tcBorders>
               <w:top w:val="single" w:color="BFBFBF" w:sz="4"/>
               <w:left w:val="single" w:color="BFBFBF" w:sz="4"/>
@@ -5904,7 +5904,7 @@
       <w:tr>
         <w:tc>
           <w:tcPr>
-            <w:tcW w:type="dxa" w:w="4364"/>
+            <w:tcW w:type="dxa" w:w="4450"/>
             <w:tcBorders>
               <w:top w:val="single" w:color="BFBFBF" w:sz="4"/>
               <w:left w:val="single" w:color="BFBFBF" w:sz="4"/>
@@ -5935,7 +5935,7 @@
         </w:tc>
         <w:tc>
           <w:tcPr>
-            <w:tcW w:type="dxa" w:w="4942"/>
+            <w:tcW w:type="dxa" w:w="4856"/>
             <w:tcBorders>
               <w:top w:val="single" w:color="BFBFBF" w:sz="4"/>
               <w:left w:val="single" w:color="BFBFBF" w:sz="4"/>
@@ -5984,7 +5984,7 @@
       <w:tr>
         <w:tc>
           <w:tcPr>
-            <w:tcW w:type="dxa" w:w="4364"/>
+            <w:tcW w:type="dxa" w:w="4450"/>
             <w:tcBorders>
               <w:top w:val="single" w:color="BFBFBF" w:sz="4"/>
               <w:left w:val="single" w:color="BFBFBF" w:sz="4"/>
@@ -6015,7 +6015,7 @@
         </w:tc>
         <w:tc>
           <w:tcPr>
-            <w:tcW w:type="dxa" w:w="4942"/>
+            <w:tcW w:type="dxa" w:w="4856"/>
             <w:tcBorders>
               <w:top w:val="single" w:color="BFBFBF" w:sz="4"/>
               <w:left w:val="single" w:color="BFBFBF" w:sz="4"/>
@@ -6064,7 +6064,7 @@
       <w:tr>
         <w:tc>
           <w:tcPr>
-            <w:tcW w:type="dxa" w:w="4364"/>
+            <w:tcW w:type="dxa" w:w="4450"/>
             <w:tcBorders>
               <w:top w:val="single" w:color="BFBFBF" w:sz="4"/>
               <w:left w:val="single" w:color="BFBFBF" w:sz="4"/>
@@ -6095,7 +6095,7 @@
         </w:tc>
         <w:tc>
           <w:tcPr>
-            <w:tcW w:type="dxa" w:w="4942"/>
+            <w:tcW w:type="dxa" w:w="4856"/>
             <w:tcBorders>
               <w:top w:val="single" w:color="BFBFBF" w:sz="4"/>
               <w:left w:val="single" w:color="BFBFBF" w:sz="4"/>
@@ -6161,7 +6161,7 @@
       <w:tr>
         <w:tc>
           <w:tcPr>
-            <w:tcW w:type="dxa" w:w="4364"/>
+            <w:tcW w:type="dxa" w:w="4450"/>
             <w:tcBorders>
               <w:top w:val="single" w:color="BFBFBF" w:sz="4"/>
               <w:left w:val="single" w:color="BFBFBF" w:sz="4"/>
@@ -6192,7 +6192,7 @@
         </w:tc>
         <w:tc>
           <w:tcPr>
-            <w:tcW w:type="dxa" w:w="4942"/>
+            <w:tcW w:type="dxa" w:w="4856"/>
             <w:tcBorders>
               <w:top w:val="single" w:color="BFBFBF" w:sz="4"/>
               <w:left w:val="single" w:color="BFBFBF" w:sz="4"/>
@@ -6258,7 +6258,7 @@
       <w:tr>
         <w:tc>
           <w:tcPr>
-            <w:tcW w:type="dxa" w:w="4364"/>
+            <w:tcW w:type="dxa" w:w="4450"/>
             <w:tcBorders>
               <w:top w:val="single" w:color="BFBFBF" w:sz="4"/>
               <w:left w:val="single" w:color="BFBFBF" w:sz="4"/>
@@ -6283,7 +6283,7 @@
                 <w:sz w:val="19"/>
                 <w:szCs w:val="19"/>
               </w:rPr>
-              <w:t xml:space="preserve">Health check failed</w:t>
+              <w:t xml:space="preserve">.env is saved as UTF-16</w:t>
             </w:r>
             <w:r>
               <w:rPr>
@@ -6291,13 +6291,13 @@
                 <w:sz w:val="20"/>
                 <w:szCs w:val="20"/>
               </w:rPr>
-              <w:t xml:space="preserve">, then an automatic rollback</w:t>
+              <w:t xml:space="preserve">, or no settings are read at all</w:t>
             </w:r>
           </w:p>
         </w:tc>
         <w:tc>
           <w:tcPr>
-            <w:tcW w:type="dxa" w:w="4942"/>
+            <w:tcW w:type="dxa" w:w="4856"/>
             <w:tcBorders>
               <w:top w:val="single" w:color="BFBFBF" w:sz="4"/>
               <w:left w:val="single" w:color="BFBFBF" w:sz="4"/>
@@ -6317,20 +6317,12 @@
             </w:pPr>
             <w:r>
               <w:rPr>
-                <w:rFonts w:ascii="Calibri" w:cs="Calibri" w:eastAsia="Microsoft JhengHei" w:hAnsi="Calibri"/>
-                <w:sz w:val="20"/>
-                <w:szCs w:val="20"/>
-              </w:rPr>
-              <w:t xml:space="preserve">Read the log printed after the message. Common causes: the server can't reach the database (IP restriction), or another process is using the </w:t>
-            </w:r>
-            <w:r>
-              <w:rPr>
                 <w:rFonts w:ascii="Consolas" w:cs="Consolas" w:eastAsia="Microsoft JhengHei" w:hAnsi="Consolas"/>
                 <w:color w:val="7A2E0E"/>
                 <w:sz w:val="19"/>
                 <w:szCs w:val="19"/>
               </w:rPr>
-              <w:t xml:space="preserve">PORT</w:t>
+              <w:t xml:space="preserve">.env</w:t>
             </w:r>
             <w:r>
               <w:rPr>
@@ -6338,7 +6330,7 @@
                 <w:sz w:val="20"/>
                 <w:szCs w:val="20"/>
               </w:rPr>
-              <w:t xml:space="preserve"> from </w:t>
+              <w:t xml:space="preserve"> was saved as UTF-16 (Windows PowerShell 5.1's </w:t>
             </w:r>
             <w:r>
               <w:rPr>
@@ -6347,7 +6339,7 @@
                 <w:sz w:val="19"/>
                 <w:szCs w:val="19"/>
               </w:rPr>
-              <w:t xml:space="preserve">.env</w:t>
+              <w:t xml:space="preserve">&gt;</w:t>
             </w:r>
             <w:r>
               <w:rPr>
@@ -6355,7 +6347,7 @@
                 <w:sz w:val="20"/>
                 <w:szCs w:val="20"/>
               </w:rPr>
-              <w:t xml:space="preserve">.</w:t>
+              <w:t xml:space="preserve"> does that). Save it as UTF-8 again, e.g. write it from WSL/bash.</w:t>
             </w:r>
           </w:p>
         </w:tc>
@@ -6363,7 +6355,7 @@
       <w:tr>
         <w:tc>
           <w:tcPr>
-            <w:tcW w:type="dxa" w:w="4364"/>
+            <w:tcW w:type="dxa" w:w="4450"/>
             <w:tcBorders>
               <w:top w:val="single" w:color="BFBFBF" w:sz="4"/>
               <w:left w:val="single" w:color="BFBFBF" w:sz="4"/>
@@ -6383,17 +6375,26 @@
             </w:pPr>
             <w:r>
               <w:rPr>
+                <w:rFonts w:ascii="Consolas" w:cs="Consolas" w:eastAsia="Microsoft JhengHei" w:hAnsi="Consolas"/>
+                <w:color w:val="7A2E0E"/>
+                <w:sz w:val="19"/>
+                <w:szCs w:val="19"/>
+              </w:rPr>
+              <w:t xml:space="preserve">Health check failed</w:t>
+            </w:r>
+            <w:r>
+              <w:rPr>
                 <w:rFonts w:ascii="Calibri" w:cs="Calibri" w:eastAsia="Microsoft JhengHei" w:hAnsi="Calibri"/>
                 <w:sz w:val="20"/>
                 <w:szCs w:val="20"/>
               </w:rPr>
-              <w:t xml:space="preserve">The page loads but shows no data</w:t>
+              <w:t xml:space="preserve">, then an automatic rollback</w:t>
             </w:r>
           </w:p>
         </w:tc>
         <w:tc>
           <w:tcPr>
-            <w:tcW w:type="dxa" w:w="4942"/>
+            <w:tcW w:type="dxa" w:w="4856"/>
             <w:tcBorders>
               <w:top w:val="single" w:color="BFBFBF" w:sz="4"/>
               <w:left w:val="single" w:color="BFBFBF" w:sz="4"/>
@@ -6413,12 +6414,20 @@
             </w:pPr>
             <w:r>
               <w:rPr>
+                <w:rFonts w:ascii="Calibri" w:cs="Calibri" w:eastAsia="Microsoft JhengHei" w:hAnsi="Calibri"/>
+                <w:sz w:val="20"/>
+                <w:szCs w:val="20"/>
+              </w:rPr>
+              <w:t xml:space="preserve">Read the log printed after the message. Common causes: the server can't reach the database (IP restriction), or another process is using the </w:t>
+            </w:r>
+            <w:r>
+              <w:rPr>
                 <w:rFonts w:ascii="Consolas" w:cs="Consolas" w:eastAsia="Microsoft JhengHei" w:hAnsi="Consolas"/>
                 <w:color w:val="7A2E0E"/>
                 <w:sz w:val="19"/>
                 <w:szCs w:val="19"/>
               </w:rPr>
-              <w:t xml:space="preserve">PUBLIC_URL</w:t>
+              <w:t xml:space="preserve">PORT</w:t>
             </w:r>
             <w:r>
               <w:rPr>
@@ -6426,7 +6435,24 @@
                 <w:sz w:val="20"/>
                 <w:szCs w:val="20"/>
               </w:rPr>
-              <w:t xml:space="preserve"> still points at an old address. Fix or delete it, then restart.</w:t>
+              <w:t xml:space="preserve"> from </w:t>
+            </w:r>
+            <w:r>
+              <w:rPr>
+                <w:rFonts w:ascii="Consolas" w:cs="Consolas" w:eastAsia="Microsoft JhengHei" w:hAnsi="Consolas"/>
+                <w:color w:val="7A2E0E"/>
+                <w:sz w:val="19"/>
+                <w:szCs w:val="19"/>
+              </w:rPr>
+              <w:t xml:space="preserve">.env</w:t>
+            </w:r>
+            <w:r>
+              <w:rPr>
+                <w:rFonts w:ascii="Calibri" w:cs="Calibri" w:eastAsia="Microsoft JhengHei" w:hAnsi="Calibri"/>
+                <w:sz w:val="20"/>
+                <w:szCs w:val="20"/>
+              </w:rPr>
+              <w:t xml:space="preserve">.</w:t>
             </w:r>
           </w:p>
         </w:tc>
@@ -6434,7 +6460,7 @@
       <w:tr>
         <w:tc>
           <w:tcPr>
-            <w:tcW w:type="dxa" w:w="4364"/>
+            <w:tcW w:type="dxa" w:w="4450"/>
             <w:tcBorders>
               <w:top w:val="single" w:color="BFBFBF" w:sz="4"/>
               <w:left w:val="single" w:color="BFBFBF" w:sz="4"/>
@@ -6458,22 +6484,13 @@
                 <w:sz w:val="20"/>
                 <w:szCs w:val="20"/>
               </w:rPr>
-              <w:t xml:space="preserve">Writes fail with </w:t>
-            </w:r>
-            <w:r>
-              <w:rPr>
-                <w:rFonts w:ascii="Consolas" w:cs="Consolas" w:eastAsia="Microsoft JhengHei" w:hAnsi="Consolas"/>
-                <w:color w:val="7A2E0E"/>
-                <w:sz w:val="19"/>
-                <w:szCs w:val="19"/>
-              </w:rPr>
-              <w:t xml:space="preserve">permission denied for schema sandbox</w:t>
+              <w:t xml:space="preserve">The page loads but shows no data</w:t>
             </w:r>
           </w:p>
         </w:tc>
         <w:tc>
           <w:tcPr>
-            <w:tcW w:type="dxa" w:w="4942"/>
+            <w:tcW w:type="dxa" w:w="4856"/>
             <w:tcBorders>
               <w:top w:val="single" w:color="BFBFBF" w:sz="4"/>
               <w:left w:val="single" w:color="BFBFBF" w:sz="4"/>
@@ -6493,11 +6510,20 @@
             </w:pPr>
             <w:r>
               <w:rPr>
+                <w:rFonts w:ascii="Consolas" w:cs="Consolas" w:eastAsia="Microsoft JhengHei" w:hAnsi="Consolas"/>
+                <w:color w:val="7A2E0E"/>
+                <w:sz w:val="19"/>
+                <w:szCs w:val="19"/>
+              </w:rPr>
+              <w:t xml:space="preserve">PUBLIC_URL</w:t>
+            </w:r>
+            <w:r>
+              <w:rPr>
                 <w:rFonts w:ascii="Calibri" w:cs="Calibri" w:eastAsia="Microsoft JhengHei" w:hAnsi="Calibri"/>
                 <w:sz w:val="20"/>
                 <w:szCs w:val="20"/>
               </w:rPr>
-              <w:t xml:space="preserve">A permission on the database's audit trigger. The DBA must grant it; it isn't a deployment problem.</w:t>
+              <w:t xml:space="preserve"> still points at an old address. Fix or delete it, then restart.</w:t>
             </w:r>
           </w:p>
         </w:tc>
@@ -6505,7 +6531,7 @@
       <w:tr>
         <w:tc>
           <w:tcPr>
-            <w:tcW w:type="dxa" w:w="4364"/>
+            <w:tcW w:type="dxa" w:w="4450"/>
             <w:tcBorders>
               <w:top w:val="single" w:color="BFBFBF" w:sz="4"/>
               <w:left w:val="single" w:color="BFBFBF" w:sz="4"/>
@@ -6529,22 +6555,22 @@
                 <w:sz w:val="20"/>
                 <w:szCs w:val="20"/>
               </w:rPr>
-              <w:t xml:space="preserve">Accented company names show as </w:t>
-            </w:r>
-            <w:r>
-              <w:rPr>
-                <w:rFonts w:ascii="Segoe UI" w:cs="Segoe UI" w:eastAsia="Segoe UI" w:hAnsi="Segoe UI"/>
+              <w:t xml:space="preserve">Writes fail with </w:t>
+            </w:r>
+            <w:r>
+              <w:rPr>
+                <w:rFonts w:ascii="Consolas" w:cs="Consolas" w:eastAsia="Microsoft JhengHei" w:hAnsi="Consolas"/>
                 <w:color w:val="7A2E0E"/>
                 <w:sz w:val="19"/>
                 <w:szCs w:val="19"/>
               </w:rPr>
-              <w:t xml:space="preserve">�</w:t>
+              <w:t xml:space="preserve">permission denied for schema sandbox</w:t>
             </w:r>
           </w:p>
         </w:tc>
         <w:tc>
           <w:tcPr>
-            <w:tcW w:type="dxa" w:w="4942"/>
+            <w:tcW w:type="dxa" w:w="4856"/>
             <w:tcBorders>
               <w:top w:val="single" w:color="BFBFBF" w:sz="4"/>
               <w:left w:val="single" w:color="BFBFBF" w:sz="4"/>
@@ -6568,24 +6594,7 @@
                 <w:sz w:val="20"/>
                 <w:szCs w:val="20"/>
               </w:rPr>
-              <w:t xml:space="preserve">The server's Node is v22.7.0. Upgrade it (</w:t>
-            </w:r>
-            <w:r>
-              <w:rPr>
-                <w:rFonts w:ascii="Consolas" w:cs="Consolas" w:eastAsia="Microsoft JhengHei" w:hAnsi="Consolas"/>
-                <w:color w:val="7A2E0E"/>
-                <w:sz w:val="19"/>
-                <w:szCs w:val="19"/>
-              </w:rPr>
-              <w:t xml:space="preserve">sudo n install 22</w:t>
-            </w:r>
-            <w:r>
-              <w:rPr>
-                <w:rFonts w:ascii="Calibri" w:cs="Calibri" w:eastAsia="Microsoft JhengHei" w:hAnsi="Calibri"/>
-                <w:sz w:val="20"/>
-                <w:szCs w:val="20"/>
-              </w:rPr>
-              <w:t xml:space="preserve">) and restart.</w:t>
+              <w:t xml:space="preserve">A permission on the database's audit trigger. The DBA must grant it; it isn't a deployment problem.</w:t>
             </w:r>
           </w:p>
         </w:tc>
@@ -6593,7 +6602,7 @@
       <w:tr>
         <w:tc>
           <w:tcPr>
-            <w:tcW w:type="dxa" w:w="4364"/>
+            <w:tcW w:type="dxa" w:w="4450"/>
             <w:tcBorders>
               <w:top w:val="single" w:color="BFBFBF" w:sz="4"/>
               <w:left w:val="single" w:color="BFBFBF" w:sz="4"/>
@@ -6617,13 +6626,101 @@
                 <w:sz w:val="20"/>
                 <w:szCs w:val="20"/>
               </w:rPr>
-              <w:t xml:space="preserve">The daily check doesn't run</w:t>
+              <w:t xml:space="preserve">Accented company names show as </w:t>
+            </w:r>
+            <w:r>
+              <w:rPr>
+                <w:rFonts w:ascii="Segoe UI" w:cs="Segoe UI" w:eastAsia="Segoe UI" w:hAnsi="Segoe UI"/>
+                <w:color w:val="7A2E0E"/>
+                <w:sz w:val="19"/>
+                <w:szCs w:val="19"/>
+              </w:rPr>
+              <w:t xml:space="preserve">�</w:t>
             </w:r>
           </w:p>
         </w:tc>
         <w:tc>
           <w:tcPr>
-            <w:tcW w:type="dxa" w:w="4942"/>
+            <w:tcW w:type="dxa" w:w="4856"/>
+            <w:tcBorders>
+              <w:top w:val="single" w:color="BFBFBF" w:sz="4"/>
+              <w:left w:val="single" w:color="BFBFBF" w:sz="4"/>
+              <w:bottom w:val="single" w:color="BFBFBF" w:sz="4"/>
+              <w:right w:val="single" w:color="BFBFBF" w:sz="4"/>
+            </w:tcBorders>
+            <w:tcMar>
+              <w:top w:type="dxa" w:w="60"/>
+              <w:left w:type="dxa" w:w="100"/>
+              <w:bottom w:type="dxa" w:w="60"/>
+              <w:right w:type="dxa" w:w="100"/>
+            </w:tcMar>
+          </w:tcPr>
+          <w:p>
+            <w:pPr>
+              <w:spacing w:after="0"/>
+            </w:pPr>
+            <w:r>
+              <w:rPr>
+                <w:rFonts w:ascii="Calibri" w:cs="Calibri" w:eastAsia="Microsoft JhengHei" w:hAnsi="Calibri"/>
+                <w:sz w:val="20"/>
+                <w:szCs w:val="20"/>
+              </w:rPr>
+              <w:t xml:space="preserve">The server's Node is v22.7.0. Upgrade it (</w:t>
+            </w:r>
+            <w:r>
+              <w:rPr>
+                <w:rFonts w:ascii="Consolas" w:cs="Consolas" w:eastAsia="Microsoft JhengHei" w:hAnsi="Consolas"/>
+                <w:color w:val="7A2E0E"/>
+                <w:sz w:val="19"/>
+                <w:szCs w:val="19"/>
+              </w:rPr>
+              <w:t xml:space="preserve">sudo n install 22</w:t>
+            </w:r>
+            <w:r>
+              <w:rPr>
+                <w:rFonts w:ascii="Calibri" w:cs="Calibri" w:eastAsia="Microsoft JhengHei" w:hAnsi="Calibri"/>
+                <w:sz w:val="20"/>
+                <w:szCs w:val="20"/>
+              </w:rPr>
+              <w:t xml:space="preserve">) and restart.</w:t>
+            </w:r>
+          </w:p>
+        </w:tc>
+      </w:tr>
+      <w:tr>
+        <w:tc>
+          <w:tcPr>
+            <w:tcW w:type="dxa" w:w="4450"/>
+            <w:tcBorders>
+              <w:top w:val="single" w:color="BFBFBF" w:sz="4"/>
+              <w:left w:val="single" w:color="BFBFBF" w:sz="4"/>
+              <w:bottom w:val="single" w:color="BFBFBF" w:sz="4"/>
+              <w:right w:val="single" w:color="BFBFBF" w:sz="4"/>
+            </w:tcBorders>
+            <w:tcMar>
+              <w:top w:type="dxa" w:w="60"/>
+              <w:left w:type="dxa" w:w="100"/>
+              <w:bottom w:type="dxa" w:w="60"/>
+              <w:right w:type="dxa" w:w="100"/>
+            </w:tcMar>
+          </w:tcPr>
+          <w:p>
+            <w:pPr>
+              <w:spacing w:after="0"/>
+            </w:pPr>
+            <w:r>
+              <w:rPr>
+                <w:rFonts w:ascii="Calibri" w:cs="Calibri" w:eastAsia="Microsoft JhengHei" w:hAnsi="Calibri"/>
+                <w:sz w:val="20"/>
+                <w:szCs w:val="20"/>
+              </w:rPr>
+              <w:t xml:space="preserve">The daily check doesn't run</w:t>
+            </w:r>
+          </w:p>
+        </w:tc>
+        <w:tc>
+          <w:tcPr>
+            <w:tcW w:type="dxa" w:w="4856"/>
             <w:tcBorders>
               <w:top w:val="single" w:color="BFBFBF" w:sz="4"/>
               <w:left w:val="single" w:color="BFBFBF" w:sz="4"/>

</xml_diff>

<commit_message>
Remove the frontend; the app is an API only for now
The old frontend (public/) was also purged from git history. server.js
now serves only /api/stocks, /api/monitor and a new GET /api/health,
which deploy/remote.sh uses as its health check instead of /config.js.
React and react-dom are uninstalled, npm run build no longer checks
public/ or React, and PUBLIC_URL is gone from .env.example. README,
CLAUDE.md / CLAUDE.zh.md and the Word deployment guides describe the
API-only state; a new frontend will be built with React + Tailwind CSS.

Co-Authored-By: Claude Opus 5.5 <noreply@anthropic.com>
</commit_message>
<xml_diff>
--- a/docs/Deployment_Guide_en.docx
+++ b/docs/Deployment_Guide_en.docx
@@ -36,7 +36,7 @@
         <w:rPr>
           <w:rFonts w:ascii="Calibri" w:cs="Calibri" w:eastAsia="Microsoft JhengHei" w:hAnsi="Calibri"/>
         </w:rPr>
-        <w:t xml:space="preserve">This guide explains how to deploy the site to a remote Linux server with the scripts in </w:t>
+        <w:t xml:space="preserve">This guide explains how to deploy the app to a remote Linux server with the scripts in </w:t>
       </w:r>
       <w:r>
         <w:rPr>
@@ -51,7 +51,7 @@
         <w:rPr>
           <w:rFonts w:ascii="Calibri" w:cs="Calibri" w:eastAsia="Microsoft JhengHei" w:hAnsi="Calibri"/>
         </w:rPr>
-        <w:t xml:space="preserve">. The app runs there as a systemd service.</w:t>
+        <w:t xml:space="preserve">. The app runs there as a systemd service. For now the app is an API only (the old frontend was removed; a new one will be built with React + Tailwind CSS).</w:t>
       </w:r>
     </w:p>
     <w:p>
@@ -389,7 +389,7 @@
           <w:sz w:val="19"/>
           <w:szCs w:val="19"/>
         </w:rPr>
-        <w:t xml:space="preserve">http://127.0.0.1:&lt;PORT&gt;/config.js</w:t>
+        <w:t xml:space="preserve">http://127.0.0.1:&lt;PORT&gt;/api/health</w:t>
       </w:r>
       <w:r>
         <w:rPr>
@@ -2117,7 +2117,7 @@
           <w:b/>
           <w:bCs/>
         </w:rPr>
-        <w:t xml:space="preserve">Don't upload your local </w:t>
+        <w:t xml:space="preserve">It's best not to upload your local </w:t>
       </w:r>
       <w:r>
         <w:rPr>
@@ -2142,22 +2142,7 @@
         <w:rPr>
           <w:rFonts w:ascii="Calibri" w:cs="Calibri" w:eastAsia="Microsoft JhengHei" w:hAnsi="Calibri"/>
         </w:rPr>
-        <w:t xml:space="preserve"> Its </w:t>
-      </w:r>
-      <w:r>
-        <w:rPr>
-          <w:rFonts w:ascii="Consolas" w:cs="Consolas" w:eastAsia="Microsoft JhengHei" w:hAnsi="Consolas"/>
-          <w:color w:val="7A2E0E"/>
-          <w:sz w:val="19"/>
-          <w:szCs w:val="19"/>
-        </w:rPr>
-        <w:t xml:space="preserve">PUBLIC_URL</w:t>
-      </w:r>
-      <w:r>
-        <w:rPr>
-          <w:rFonts w:ascii="Calibri" w:cs="Calibri" w:eastAsia="Microsoft JhengHei" w:hAnsi="Calibri"/>
-        </w:rPr>
-        <w:t xml:space="preserve"> is the WSL address. Make a copy and edit the copy:</w:t>
+        <w:t xml:space="preserve"> Make a copy and edit the copy:</w:t>
       </w:r>
     </w:p>
     <w:p>
@@ -2226,61 +2211,6 @@
           <w:sz w:val="19"/>
           <w:szCs w:val="19"/>
         </w:rPr>
-        <w:t xml:space="preserve">PUBLIC_URL</w:t>
-      </w:r>
-      <w:r>
-        <w:rPr>
-          <w:rFonts w:ascii="Calibri" w:cs="Calibri" w:eastAsia="Microsoft JhengHei" w:hAnsi="Calibri"/>
-        </w:rPr>
-        <w:t xml:space="preserve">: set it to the address browsers use to reach the server, e.g. </w:t>
-      </w:r>
-      <w:r>
-        <w:rPr>
-          <w:rFonts w:ascii="Consolas" w:cs="Consolas" w:eastAsia="Microsoft JhengHei" w:hAnsi="Consolas"/>
-          <w:color w:val="7A2E0E"/>
-          <w:sz w:val="19"/>
-          <w:szCs w:val="19"/>
-        </w:rPr>
-        <w:t xml:space="preserve">http://&lt;server-ip&gt;:3000</w:t>
-      </w:r>
-      <w:r>
-        <w:rPr>
-          <w:rFonts w:ascii="Calibri" w:cs="Calibri" w:eastAsia="Microsoft JhengHei" w:hAnsi="Calibri"/>
-        </w:rPr>
-        <w:t xml:space="preserve">. Or delete the line (recommended): the frontend then uses the relative path </w:t>
-      </w:r>
-      <w:r>
-        <w:rPr>
-          <w:rFonts w:ascii="Consolas" w:cs="Consolas" w:eastAsia="Microsoft JhengHei" w:hAnsi="Consolas"/>
-          <w:color w:val="7A2E0E"/>
-          <w:sz w:val="19"/>
-          <w:szCs w:val="19"/>
-        </w:rPr>
-        <w:t xml:space="preserve">/api</w:t>
-      </w:r>
-      <w:r>
-        <w:rPr>
-          <w:rFonts w:ascii="Calibri" w:cs="Calibri" w:eastAsia="Microsoft JhengHei" w:hAnsi="Calibri"/>
-        </w:rPr>
-        <w:t xml:space="preserve">, which works from any address.</w:t>
-      </w:r>
-    </w:p>
-    <w:p>
-      <w:pPr>
-        <w:pStyle w:val="ListParagraph"/>
-        <w:numPr>
-          <w:ilvl w:val="0"/>
-          <w:numId w:val="2"/>
-        </w:numPr>
-        <w:spacing w:after="60"/>
-      </w:pPr>
-      <w:r>
-        <w:rPr>
-          <w:rFonts w:ascii="Consolas" w:cs="Consolas" w:eastAsia="Microsoft JhengHei" w:hAnsi="Consolas"/>
-          <w:color w:val="7A2E0E"/>
-          <w:sz w:val="19"/>
-          <w:szCs w:val="19"/>
-        </w:rPr>
         <w:t xml:space="preserve">PORT</w:t>
       </w:r>
       <w:r>
@@ -2903,7 +2833,7 @@
         <w:rPr>
           <w:rFonts w:ascii="Calibri" w:cs="Calibri" w:eastAsia="Microsoft JhengHei" w:hAnsi="Calibri"/>
         </w:rPr>
-        <w:t xml:space="preserve"> to build the site. The frontend needs no bundling, so the build writes no files. Instead it is the pre-deploy check: Node is 22.8.0 or newer (and not v22.7.0), every JS file parses, and every dependency is installed. </w:t>
+        <w:t xml:space="preserve">. For now the app is an API only and there is nothing to compile, so the build writes no files. Instead it is the pre-deploy check: Node is 22.8.0 or newer (and not v22.7.0), every JS file parses, and every dependency is installed. </w:t>
       </w:r>
       <w:r>
         <w:rPr>
@@ -2969,7 +2899,7 @@
           <w:sz w:val="19"/>
           <w:szCs w:val="19"/>
         </w:rPr>
-        <w:t xml:space="preserve">Build check OK: Node v22..., 27 JS files, 6 dependencies</w:t>
+        <w:t xml:space="preserve">Build check OK: Node v22..., 25 JS files, 6 dependencies</w:t>
       </w:r>
       <w:r>
         <w:rPr>
@@ -3005,22 +2935,37 @@
         <w:rPr>
           <w:rFonts w:ascii="Calibri" w:cs="Calibri" w:eastAsia="Microsoft JhengHei" w:hAnsi="Calibri"/>
         </w:rPr>
-        <w:t xml:space="preserve">. Open </w:t>
-      </w:r>
-      <w:r>
-        <w:rPr>
-          <w:rFonts w:ascii="Consolas" w:cs="Consolas" w:eastAsia="Microsoft JhengHei" w:hAnsi="Consolas"/>
-          <w:color w:val="7A2E0E"/>
-          <w:sz w:val="19"/>
-          <w:szCs w:val="19"/>
-        </w:rPr>
-        <w:t xml:space="preserve">http://&lt;server-ip&gt;:3000</w:t>
-      </w:r>
-      <w:r>
-        <w:rPr>
-          <w:rFonts w:ascii="Calibri" w:cs="Calibri" w:eastAsia="Microsoft JhengHei" w:hAnsi="Calibri"/>
-        </w:rPr>
-        <w:t xml:space="preserve"> to check the site.</w:t>
+        <w:t xml:space="preserve">. Check it with </w:t>
+      </w:r>
+      <w:r>
+        <w:rPr>
+          <w:rFonts w:ascii="Consolas" w:cs="Consolas" w:eastAsia="Microsoft JhengHei" w:hAnsi="Consolas"/>
+          <w:color w:val="7A2E0E"/>
+          <w:sz w:val="19"/>
+          <w:szCs w:val="19"/>
+        </w:rPr>
+        <w:t xml:space="preserve">curl http://&lt;server-ip&gt;:3000/api/health</w:t>
+      </w:r>
+      <w:r>
+        <w:rPr>
+          <w:rFonts w:ascii="Calibri" w:cs="Calibri" w:eastAsia="Microsoft JhengHei" w:hAnsi="Calibri"/>
+        </w:rPr>
+        <w:t xml:space="preserve">, which answers </w:t>
+      </w:r>
+      <w:r>
+        <w:rPr>
+          <w:rFonts w:ascii="Consolas" w:cs="Consolas" w:eastAsia="Microsoft JhengHei" w:hAnsi="Consolas"/>
+          <w:color w:val="7A2E0E"/>
+          <w:sz w:val="19"/>
+          <w:szCs w:val="19"/>
+        </w:rPr>
+        <w:t xml:space="preserve">{"ok":true}</w:t>
+      </w:r>
+      <w:r>
+        <w:rPr>
+          <w:rFonts w:ascii="Calibri" w:cs="Calibri" w:eastAsia="Microsoft JhengHei" w:hAnsi="Calibri"/>
+        </w:rPr>
+        <w:t xml:space="preserve">.</w:t>
       </w:r>
     </w:p>
     <w:p>
@@ -5033,16 +4978,16 @@
         <w:rPr>
           <w:rFonts w:ascii="Calibri" w:cs="Calibri" w:eastAsia="Microsoft JhengHei" w:hAnsi="Calibri"/>
         </w:rPr>
-        <w:t xml:space="preserve"> committed in the repo, so its settings (especially </w:t>
-      </w:r>
-      <w:r>
-        <w:rPr>
-          <w:rFonts w:ascii="Consolas" w:cs="Consolas" w:eastAsia="Microsoft JhengHei" w:hAnsi="Consolas"/>
-          <w:color w:val="7A2E0E"/>
-          <w:sz w:val="19"/>
-          <w:szCs w:val="19"/>
-        </w:rPr>
-        <w:t xml:space="preserve">PUBLIC_URL</w:t>
+        <w:t xml:space="preserve"> committed in the repo, so its settings (especially the database connection and </w:t>
+      </w:r>
+      <w:r>
+        <w:rPr>
+          <w:rFonts w:ascii="Consolas" w:cs="Consolas" w:eastAsia="Microsoft JhengHei" w:hAnsi="Consolas"/>
+          <w:color w:val="7A2E0E"/>
+          <w:sz w:val="19"/>
+          <w:szCs w:val="19"/>
+        </w:rPr>
+        <w:t xml:space="preserve">PORT</w:t>
       </w:r>
       <w:r>
         <w:rPr>
@@ -5661,52 +5606,6 @@
           <w:rFonts w:ascii="Calibri" w:cs="Calibri" w:eastAsia="Microsoft JhengHei" w:hAnsi="Calibri"/>
         </w:rPr>
         <w:t xml:space="preserve"> so that only Nginx can connect to the app.</w:t>
-      </w:r>
-    </w:p>
-    <w:p>
-      <w:pPr>
-        <w:pStyle w:val="ListParagraph"/>
-        <w:numPr>
-          <w:ilvl w:val="0"/>
-          <w:numId w:val="2"/>
-        </w:numPr>
-        <w:spacing w:after="60"/>
-      </w:pPr>
-      <w:r>
-        <w:rPr>
-          <w:rFonts w:ascii="Calibri" w:cs="Calibri" w:eastAsia="Microsoft JhengHei" w:hAnsi="Calibri"/>
-        </w:rPr>
-        <w:t xml:space="preserve">Delete </w:t>
-      </w:r>
-      <w:r>
-        <w:rPr>
-          <w:rFonts w:ascii="Consolas" w:cs="Consolas" w:eastAsia="Microsoft JhengHei" w:hAnsi="Consolas"/>
-          <w:color w:val="7A2E0E"/>
-          <w:sz w:val="19"/>
-          <w:szCs w:val="19"/>
-        </w:rPr>
-        <w:t xml:space="preserve">PUBLIC_URL</w:t>
-      </w:r>
-      <w:r>
-        <w:rPr>
-          <w:rFonts w:ascii="Calibri" w:cs="Calibri" w:eastAsia="Microsoft JhengHei" w:hAnsi="Calibri"/>
-        </w:rPr>
-        <w:t xml:space="preserve">, or set it to </w:t>
-      </w:r>
-      <w:r>
-        <w:rPr>
-          <w:rFonts w:ascii="Consolas" w:cs="Consolas" w:eastAsia="Microsoft JhengHei" w:hAnsi="Consolas"/>
-          <w:color w:val="7A2E0E"/>
-          <w:sz w:val="19"/>
-          <w:szCs w:val="19"/>
-        </w:rPr>
-        <w:t xml:space="preserve">http://stock.example.com</w:t>
-      </w:r>
-      <w:r>
-        <w:rPr>
-          <w:rFonts w:ascii="Calibri" w:cs="Calibri" w:eastAsia="Microsoft JhengHei" w:hAnsi="Calibri"/>
-        </w:rPr>
-        <w:t xml:space="preserve">.</w:t>
       </w:r>
     </w:p>
     <w:p>
@@ -6453,77 +6352,6 @@
                 <w:szCs w:val="20"/>
               </w:rPr>
               <w:t xml:space="preserve">.</w:t>
-            </w:r>
-          </w:p>
-        </w:tc>
-      </w:tr>
-      <w:tr>
-        <w:tc>
-          <w:tcPr>
-            <w:tcW w:type="dxa" w:w="4450"/>
-            <w:tcBorders>
-              <w:top w:val="single" w:color="BFBFBF" w:sz="4"/>
-              <w:left w:val="single" w:color="BFBFBF" w:sz="4"/>
-              <w:bottom w:val="single" w:color="BFBFBF" w:sz="4"/>
-              <w:right w:val="single" w:color="BFBFBF" w:sz="4"/>
-            </w:tcBorders>
-            <w:tcMar>
-              <w:top w:type="dxa" w:w="60"/>
-              <w:left w:type="dxa" w:w="100"/>
-              <w:bottom w:type="dxa" w:w="60"/>
-              <w:right w:type="dxa" w:w="100"/>
-            </w:tcMar>
-          </w:tcPr>
-          <w:p>
-            <w:pPr>
-              <w:spacing w:after="0"/>
-            </w:pPr>
-            <w:r>
-              <w:rPr>
-                <w:rFonts w:ascii="Calibri" w:cs="Calibri" w:eastAsia="Microsoft JhengHei" w:hAnsi="Calibri"/>
-                <w:sz w:val="20"/>
-                <w:szCs w:val="20"/>
-              </w:rPr>
-              <w:t xml:space="preserve">The page loads but shows no data</w:t>
-            </w:r>
-          </w:p>
-        </w:tc>
-        <w:tc>
-          <w:tcPr>
-            <w:tcW w:type="dxa" w:w="4856"/>
-            <w:tcBorders>
-              <w:top w:val="single" w:color="BFBFBF" w:sz="4"/>
-              <w:left w:val="single" w:color="BFBFBF" w:sz="4"/>
-              <w:bottom w:val="single" w:color="BFBFBF" w:sz="4"/>
-              <w:right w:val="single" w:color="BFBFBF" w:sz="4"/>
-            </w:tcBorders>
-            <w:tcMar>
-              <w:top w:type="dxa" w:w="60"/>
-              <w:left w:type="dxa" w:w="100"/>
-              <w:bottom w:type="dxa" w:w="60"/>
-              <w:right w:type="dxa" w:w="100"/>
-            </w:tcMar>
-          </w:tcPr>
-          <w:p>
-            <w:pPr>
-              <w:spacing w:after="0"/>
-            </w:pPr>
-            <w:r>
-              <w:rPr>
-                <w:rFonts w:ascii="Consolas" w:cs="Consolas" w:eastAsia="Microsoft JhengHei" w:hAnsi="Consolas"/>
-                <w:color w:val="7A2E0E"/>
-                <w:sz w:val="19"/>
-                <w:szCs w:val="19"/>
-              </w:rPr>
-              <w:t xml:space="preserve">PUBLIC_URL</w:t>
-            </w:r>
-            <w:r>
-              <w:rPr>
-                <w:rFonts w:ascii="Calibri" w:cs="Calibri" w:eastAsia="Microsoft JhengHei" w:hAnsi="Calibri"/>
-                <w:sz w:val="20"/>
-                <w:szCs w:val="20"/>
-              </w:rPr>
-              <w:t xml:space="preserve"> still points at an old address. Fix or delete it, then restart.</w:t>
             </w:r>
           </w:p>
         </w:tc>

</xml_diff>

<commit_message>
Rebuild the frontend with create-react-app + Tailwind CSS
The old public/ pages and styles/ are removed. The web UI is now a
create-react-app project in client/ (React 19, React Router, Tailwind
CSS v3) with the same stock features. npm run build installs the
client's packages and builds it into client/build, which server.js
serves (SPA fallback; unknown /api paths answer a JSON 404).
Adds npm run dev:client (CRA dev server on 3001, proxies /api) and
npm test (Jest). Docs, deploy script comments and the four Word guides
are updated.

Co-Authored-By: Claude Opus 5.5 <noreply@anthropic.com>
</commit_message>
<xml_diff>
--- a/docs/Deployment_Guide_en.docx
+++ b/docs/Deployment_Guide_en.docx
@@ -24,7 +24,7 @@
           <w:sz w:val="22"/>
           <w:szCs w:val="22"/>
         </w:rPr>
-        <w:t xml:space="preserve">Updated: 2026-10-06</w:t>
+        <w:t xml:space="preserve">Updated: 2026-10-07</w:t>
       </w:r>
     </w:p>
     <w:p>
@@ -51,7 +51,7 @@
         <w:rPr>
           <w:rFonts w:ascii="Calibri" w:cs="Calibri" w:eastAsia="Microsoft JhengHei" w:hAnsi="Calibri"/>
         </w:rPr>
-        <w:t xml:space="preserve">. The app runs there as a systemd service. The app has an API and a React + Tailwind CSS web UI.</w:t>
+        <w:t xml:space="preserve">. The app runs there as a systemd service. The app has an API and a React (create-react-app) + Tailwind CSS web UI.</w:t>
       </w:r>
     </w:p>
     <w:p>
@@ -302,7 +302,7 @@
         <w:rPr>
           <w:rFonts w:ascii="Calibri" w:cs="Calibri" w:eastAsia="Microsoft JhengHei" w:hAnsi="Calibri"/>
         </w:rPr>
-        <w:t xml:space="preserve">, which compiles the web UI's Tailwind CSS. If that fails, the deploy stops before anything is switched.</w:t>
+        <w:t xml:space="preserve">, which installs the web UI's packages and builds the React app. If that fails, the deploy stops before anything is switched.</w:t>
       </w:r>
     </w:p>
     <w:p>
@@ -2833,22 +2833,52 @@
         <w:rPr>
           <w:rFonts w:ascii="Calibri" w:cs="Calibri" w:eastAsia="Microsoft JhengHei" w:hAnsi="Calibri"/>
         </w:rPr>
-        <w:t xml:space="preserve">: the Tailwind CLI compiles the web UI's CSS into </w:t>
-      </w:r>
-      <w:r>
-        <w:rPr>
-          <w:rFonts w:ascii="Consolas" w:cs="Consolas" w:eastAsia="Microsoft JhengHei" w:hAnsi="Consolas"/>
-          <w:color w:val="7A2E0E"/>
-          <w:sz w:val="19"/>
-          <w:szCs w:val="19"/>
-        </w:rPr>
-        <w:t xml:space="preserve">public/build/app.css</w:t>
-      </w:r>
-      <w:r>
-        <w:rPr>
-          <w:rFonts w:ascii="Calibri" w:cs="Calibri" w:eastAsia="Microsoft JhengHei" w:hAnsi="Calibri"/>
-        </w:rPr>
-        <w:t xml:space="preserve">. </w:t>
+        <w:t xml:space="preserve">: installs the web UI's packages in </w:t>
+      </w:r>
+      <w:r>
+        <w:rPr>
+          <w:rFonts w:ascii="Consolas" w:cs="Consolas" w:eastAsia="Microsoft JhengHei" w:hAnsi="Consolas"/>
+          <w:color w:val="7A2E0E"/>
+          <w:sz w:val="19"/>
+          <w:szCs w:val="19"/>
+        </w:rPr>
+        <w:t xml:space="preserve">client/</w:t>
+      </w:r>
+      <w:r>
+        <w:rPr>
+          <w:rFonts w:ascii="Calibri" w:cs="Calibri" w:eastAsia="Microsoft JhengHei" w:hAnsi="Calibri"/>
+        </w:rPr>
+        <w:t xml:space="preserve"> (</w:t>
+      </w:r>
+      <w:r>
+        <w:rPr>
+          <w:rFonts w:ascii="Consolas" w:cs="Consolas" w:eastAsia="Microsoft JhengHei" w:hAnsi="Consolas"/>
+          <w:color w:val="7A2E0E"/>
+          <w:sz w:val="19"/>
+          <w:szCs w:val="19"/>
+        </w:rPr>
+        <w:t xml:space="preserve">npm ci</w:t>
+      </w:r>
+      <w:r>
+        <w:rPr>
+          <w:rFonts w:ascii="Calibri" w:cs="Calibri" w:eastAsia="Microsoft JhengHei" w:hAnsi="Calibri"/>
+        </w:rPr>
+        <w:t xml:space="preserve">), then react-scripts builds the React app into </w:t>
+      </w:r>
+      <w:r>
+        <w:rPr>
+          <w:rFonts w:ascii="Consolas" w:cs="Consolas" w:eastAsia="Microsoft JhengHei" w:hAnsi="Consolas"/>
+          <w:color w:val="7A2E0E"/>
+          <w:sz w:val="19"/>
+          <w:szCs w:val="19"/>
+        </w:rPr>
+        <w:t xml:space="preserve">client/build</w:t>
+      </w:r>
+      <w:r>
+        <w:rPr>
+          <w:rFonts w:ascii="Calibri" w:cs="Calibri" w:eastAsia="Microsoft JhengHei" w:hAnsi="Calibri"/>
+        </w:rPr>
+        <w:t xml:space="preserve"> (about 1-2 minutes). </w:t>
       </w:r>
       <w:r>
         <w:rPr>
@@ -2905,16 +2935,16 @@
         <w:rPr>
           <w:rFonts w:ascii="Calibri" w:cs="Calibri" w:eastAsia="Microsoft JhengHei" w:hAnsi="Calibri"/>
         </w:rPr>
-        <w:t xml:space="preserve">A successful deploy prints Tailwind's </w:t>
-      </w:r>
-      <w:r>
-        <w:rPr>
-          <w:rFonts w:ascii="Consolas" w:cs="Consolas" w:eastAsia="Microsoft JhengHei" w:hAnsi="Consolas"/>
-          <w:color w:val="7A2E0E"/>
-          <w:sz w:val="19"/>
-          <w:szCs w:val="19"/>
-        </w:rPr>
-        <w:t xml:space="preserve">Done in ...ms</w:t>
+        <w:t xml:space="preserve">A successful deploy prints the React build's </w:t>
+      </w:r>
+      <w:r>
+        <w:rPr>
+          <w:rFonts w:ascii="Consolas" w:cs="Consolas" w:eastAsia="Microsoft JhengHei" w:hAnsi="Consolas"/>
+          <w:color w:val="7A2E0E"/>
+          <w:sz w:val="19"/>
+          <w:szCs w:val="19"/>
+        </w:rPr>
+        <w:t xml:space="preserve">Compiled successfully.</w:t>
       </w:r>
       <w:r>
         <w:rPr>
@@ -3853,13 +3883,28 @@
           <w:sz w:val="19"/>
           <w:szCs w:val="19"/>
         </w:rPr>
-        <w:t xml:space="preserve">Done in ...ms</w:t>
-      </w:r>
-      <w:r>
-        <w:rPr>
-          <w:rFonts w:ascii="Calibri" w:cs="Calibri" w:eastAsia="Microsoft JhengHei" w:hAnsi="Calibri"/>
-        </w:rPr>
-        <w:t xml:space="preserve"> (the CSS is compiled).</w:t>
+        <w:t xml:space="preserve">Compiled successfully.</w:t>
+      </w:r>
+      <w:r>
+        <w:rPr>
+          <w:rFonts w:ascii="Calibri" w:cs="Calibri" w:eastAsia="Microsoft JhengHei" w:hAnsi="Calibri"/>
+        </w:rPr>
+        <w:t xml:space="preserve"> (the web UI is built into </w:t>
+      </w:r>
+      <w:r>
+        <w:rPr>
+          <w:rFonts w:ascii="Consolas" w:cs="Consolas" w:eastAsia="Microsoft JhengHei" w:hAnsi="Consolas"/>
+          <w:color w:val="7A2E0E"/>
+          <w:sz w:val="19"/>
+          <w:szCs w:val="19"/>
+        </w:rPr>
+        <w:t xml:space="preserve">client/build</w:t>
+      </w:r>
+      <w:r>
+        <w:rPr>
+          <w:rFonts w:ascii="Calibri" w:cs="Calibri" w:eastAsia="Microsoft JhengHei" w:hAnsi="Calibri"/>
+        </w:rPr>
+        <w:t xml:space="preserve">).</w:t>
       </w:r>
     </w:p>
     <w:p>
@@ -6108,7 +6153,7 @@
                 <w:sz w:val="20"/>
                 <w:szCs w:val="20"/>
               </w:rPr>
-              <w:t xml:space="preserve">Read Tailwind's error; usually the packages aren't installed properly (run </w:t>
+              <w:t xml:space="preserve">Read the </w:t>
             </w:r>
             <w:r>
               <w:rPr>
@@ -6117,7 +6162,7 @@
                 <w:sz w:val="19"/>
                 <w:szCs w:val="19"/>
               </w:rPr>
-              <w:t xml:space="preserve">npm install</w:t>
+              <w:t xml:space="preserve">npm ci</w:t>
             </w:r>
             <w:r>
               <w:rPr>
@@ -6125,7 +6170,41 @@
                 <w:sz w:val="20"/>
                 <w:szCs w:val="20"/>
               </w:rPr>
-              <w:t xml:space="preserve"> again). The deploy stopped and the live release is unaffected.</w:t>
+              <w:t xml:space="preserve"> or react-scripts error. Common causes: no network access to download packages, too little memory (the build needs about 1 GB), or </w:t>
+            </w:r>
+            <w:r>
+              <w:rPr>
+                <w:rFonts w:ascii="Consolas" w:cs="Consolas" w:eastAsia="Microsoft JhengHei" w:hAnsi="Consolas"/>
+                <w:color w:val="7A2E0E"/>
+                <w:sz w:val="19"/>
+                <w:szCs w:val="19"/>
+              </w:rPr>
+              <w:t xml:space="preserve">client/package-lock.json</w:t>
+            </w:r>
+            <w:r>
+              <w:rPr>
+                <w:rFonts w:ascii="Calibri" w:cs="Calibri" w:eastAsia="Microsoft JhengHei" w:hAnsi="Calibri"/>
+                <w:sz w:val="20"/>
+                <w:szCs w:val="20"/>
+              </w:rPr>
+              <w:t xml:space="preserve"> out of sync with </w:t>
+            </w:r>
+            <w:r>
+              <w:rPr>
+                <w:rFonts w:ascii="Consolas" w:cs="Consolas" w:eastAsia="Microsoft JhengHei" w:hAnsi="Consolas"/>
+                <w:color w:val="7A2E0E"/>
+                <w:sz w:val="19"/>
+                <w:szCs w:val="19"/>
+              </w:rPr>
+              <w:t xml:space="preserve">client/package.json</w:t>
+            </w:r>
+            <w:r>
+              <w:rPr>
+                <w:rFonts w:ascii="Calibri" w:cs="Calibri" w:eastAsia="Microsoft JhengHei" w:hAnsi="Calibri"/>
+                <w:sz w:val="20"/>
+                <w:szCs w:val="20"/>
+              </w:rPr>
+              <w:t xml:space="preserve">. The deploy stopped and the live release is unaffected.</w:t>
             </w:r>
           </w:p>
         </w:tc>
@@ -6157,7 +6236,7 @@
                 <w:sz w:val="20"/>
                 <w:szCs w:val="20"/>
               </w:rPr>
-              <w:t xml:space="preserve">The page has no styling</w:t>
+              <w:t xml:space="preserve">The page says "The web UI is not built yet"</w:t>
             </w:r>
           </w:p>
         </w:tc>
@@ -6205,7 +6284,7 @@
                 <w:sz w:val="19"/>
                 <w:szCs w:val="19"/>
               </w:rPr>
-              <w:t xml:space="preserve">public/build/app.css</w:t>
+              <w:t xml:space="preserve">client/build</w:t>
             </w:r>
             <w:r>
               <w:rPr>

</xml_diff>

<commit_message>
Docs: login, OTC Markets rule, deployment notes
- System guides (en / zh-TW): 3.7 Login, 4.5 Login and sessions (bcrypt
  check, md5 session and its accepted trade-offs), login principle, .env
  rows (COOKIE_SECURE, TRUST_PROXY, LOGIN_EMAIL_ONLY), test.users SELECT,
  OTC Markets as a source and the OTC delisting rule, troubleshooting
  rows; daily-schedule sentence removed; 3.5 bullets bold lead-in only.
- Deployment guides (en / zh-TW): login note, MONITOR_DAILY_AT text
  replaced, GitHub Actions .env from Secrets, the site URL, merging in a
  worktree, Nginx X-Forwarded-Proto and why both headers matter.
- CLAUDE.md: the doc edits and the company_profiles deployment facts.

Co-Authored-By: Claude Opus 5.5 <noreply@anthropic.com>
</commit_message>
<xml_diff>
--- a/docs/Deployment_Guide_en.docx
+++ b/docs/Deployment_Guide_en.docx
@@ -24,7 +24,7 @@
           <w:sz w:val="22"/>
           <w:szCs w:val="22"/>
         </w:rPr>
-        <w:t xml:space="preserve">Updated: 2026-10-07</w:t>
+        <w:t xml:space="preserve">Updated: 2026-10-19</w:t>
       </w:r>
     </w:p>
     <w:p>
@@ -36,22 +36,7 @@
         <w:rPr>
           <w:rFonts w:ascii="Calibri" w:cs="Calibri" w:eastAsia="Microsoft JhengHei" w:hAnsi="Calibri"/>
         </w:rPr>
-        <w:t xml:space="preserve">This guide explains how to deploy the app to a remote Linux server with the scripts in </w:t>
-      </w:r>
-      <w:r>
-        <w:rPr>
-          <w:rFonts w:ascii="Consolas" w:cs="Consolas" w:eastAsia="Microsoft JhengHei" w:hAnsi="Consolas"/>
-          <w:color w:val="7A2E0E"/>
-          <w:sz w:val="19"/>
-          <w:szCs w:val="19"/>
-        </w:rPr>
-        <w:t xml:space="preserve">deploy/</w:t>
-      </w:r>
-      <w:r>
-        <w:rPr>
-          <w:rFonts w:ascii="Calibri" w:cs="Calibri" w:eastAsia="Microsoft JhengHei" w:hAnsi="Calibri"/>
-        </w:rPr>
-        <w:t xml:space="preserve">. The app runs there as a systemd service. The app has an API and a React (create-react-app) + Tailwind CSS web UI.</w:t>
+        <w:t xml:space="preserve">This guide explains how to deploy the app to a remote Linux server with the scripts in deploy/. The app runs there as a systemd service. The app has an API and a React (create-react-app) + Tailwind CSS web UI, and every page needs a login (accounts in the table test.users with role LABEL and status true).</w:t>
       </w:r>
     </w:p>
     <w:p>
@@ -1916,41 +1901,7 @@
                 <w:sz w:val="20"/>
                 <w:szCs w:val="20"/>
               </w:rPr>
-              <w:t xml:space="preserve">The service's time zone. </w:t>
-            </w:r>
-            <w:r>
-              <w:rPr>
-                <w:rFonts w:ascii="Consolas" w:cs="Consolas" w:eastAsia="Microsoft JhengHei" w:hAnsi="Consolas"/>
-                <w:color w:val="7A2E0E"/>
-                <w:sz w:val="19"/>
-                <w:szCs w:val="19"/>
-              </w:rPr>
-              <w:t xml:space="preserve">MONITOR_DAILY_AT</w:t>
-            </w:r>
-            <w:r>
-              <w:rPr>
-                <w:rFonts w:ascii="Calibri" w:cs="Calibri" w:eastAsia="Microsoft JhengHei" w:hAnsi="Calibri"/>
-                <w:sz w:val="20"/>
-                <w:szCs w:val="20"/>
-              </w:rPr>
-              <w:t xml:space="preserve"> in </w:t>
-            </w:r>
-            <w:r>
-              <w:rPr>
-                <w:rFonts w:ascii="Consolas" w:cs="Consolas" w:eastAsia="Microsoft JhengHei" w:hAnsi="Consolas"/>
-                <w:color w:val="7A2E0E"/>
-                <w:sz w:val="19"/>
-                <w:szCs w:val="19"/>
-              </w:rPr>
-              <w:t xml:space="preserve">.env</w:t>
-            </w:r>
-            <w:r>
-              <w:rPr>
-                <w:rFonts w:ascii="Calibri" w:cs="Calibri" w:eastAsia="Microsoft JhengHei" w:hAnsi="Calibri"/>
-                <w:sz w:val="20"/>
-                <w:szCs w:val="20"/>
-              </w:rPr>
-              <w:t xml:space="preserve"> uses this zone.</w:t>
+              <w:t xml:space="preserve">The service's time zone (times in the log).</w:t>
             </w:r>
           </w:p>
         </w:tc>
@@ -2281,42 +2232,7 @@
           <w:sz w:val="19"/>
           <w:szCs w:val="19"/>
         </w:rPr>
-        <w:t xml:space="preserve">MONITOR_DAILY_AT=03:00</w:t>
-      </w:r>
-      <w:r>
-        <w:rPr>
-          <w:rFonts w:ascii="Calibri" w:cs="Calibri" w:eastAsia="Microsoft JhengHei" w:hAnsi="Calibri"/>
-        </w:rPr>
-        <w:t xml:space="preserve">: runs the stock check every day and </w:t>
-      </w:r>
-      <w:r>
-        <w:rPr>
-          <w:rFonts w:ascii="Calibri" w:cs="Calibri" w:eastAsia="Microsoft JhengHei" w:hAnsi="Calibri"/>
-          <w:b/>
-          <w:bCs/>
-        </w:rPr>
-        <w:t xml:space="preserve">writes the results to the database</w:t>
-      </w:r>
-      <w:r>
-        <w:rPr>
-          <w:rFonts w:ascii="Calibri" w:cs="Calibri" w:eastAsia="Microsoft JhengHei" w:hAnsi="Calibri"/>
-        </w:rPr>
-        <w:t xml:space="preserve">. The time is in New York time (</w:t>
-      </w:r>
-      <w:r>
-        <w:rPr>
-          <w:rFonts w:ascii="Consolas" w:cs="Consolas" w:eastAsia="Microsoft JhengHei" w:hAnsi="Consolas"/>
-          <w:color w:val="7A2E0E"/>
-          <w:sz w:val="19"/>
-          <w:szCs w:val="19"/>
-        </w:rPr>
-        <w:t xml:space="preserve">APP_TZ</w:t>
-      </w:r>
-      <w:r>
-        <w:rPr>
-          <w:rFonts w:ascii="Calibri" w:cs="Calibri" w:eastAsia="Microsoft JhengHei" w:hAnsi="Calibri"/>
-        </w:rPr>
-        <w:t xml:space="preserve">): 03:00 New York is 15:00 Taipei time in summer (daylight saving) and 16:00 in winter. If your local (WSL) server is also running with this line, both servers will run the check on the same table at the same time. Keep the line on only one of them.</w:t>
+        <w:t xml:space="preserve">Login: nothing to set (no secret key). Leave LOGIN_EMAIL_ONLY unset or false on a server. Behind Nginx, the defaults of TRUST_PROXY and COOKIE_SECURE fit; see section 9. MONITOR_DAILY_AT is no longer used: the daily check was removed on 2026-10-16.</w:t>
       </w:r>
     </w:p>
     <w:p>
@@ -3276,7 +3192,7 @@
         <w:rPr>
           <w:rFonts w:ascii="Calibri" w:cs="Calibri" w:eastAsia="Microsoft JhengHei" w:hAnsi="Calibri"/>
         </w:rPr>
-        <w:t xml:space="preserve">A deploy restarts the service. The restart stops a stock check that is still running and drops the auto-fill retries scheduled after recent adds, because both exist only in memory. Don't deploy while a check is running, e.g. in the minutes after 03:00.</w:t>
+        <w:t xml:space="preserve">A deploy restarts the service. Logged-in users stay logged in. The restart ends a stock monitor preview that is still running and drops the auto-fill retries scheduled after recent adds, because both exist only in memory; avoid deploying while a preview runs.</w:t>
       </w:r>
     </w:p>
     <w:p>
@@ -4993,37 +4909,7 @@
         <w:rPr>
           <w:rFonts w:ascii="Calibri" w:cs="Calibri" w:eastAsia="Microsoft JhengHei" w:hAnsi="Calibri"/>
         </w:rPr>
-        <w:t xml:space="preserve">This flow uses the </w:t>
-      </w:r>
-      <w:r>
-        <w:rPr>
-          <w:rFonts w:ascii="Consolas" w:cs="Consolas" w:eastAsia="Microsoft JhengHei" w:hAnsi="Consolas"/>
-          <w:color w:val="7A2E0E"/>
-          <w:sz w:val="19"/>
-          <w:szCs w:val="19"/>
-        </w:rPr>
-        <w:t xml:space="preserve">.env</w:t>
-      </w:r>
-      <w:r>
-        <w:rPr>
-          <w:rFonts w:ascii="Calibri" w:cs="Calibri" w:eastAsia="Microsoft JhengHei" w:hAnsi="Calibri"/>
-        </w:rPr>
-        <w:t xml:space="preserve"> committed in the repo, so its settings (especially the database connection and </w:t>
-      </w:r>
-      <w:r>
-        <w:rPr>
-          <w:rFonts w:ascii="Consolas" w:cs="Consolas" w:eastAsia="Microsoft JhengHei" w:hAnsi="Consolas"/>
-          <w:color w:val="7A2E0E"/>
-          <w:sz w:val="19"/>
-          <w:szCs w:val="19"/>
-        </w:rPr>
-        <w:t xml:space="preserve">PORT</w:t>
-      </w:r>
-      <w:r>
-        <w:rPr>
-          <w:rFonts w:ascii="Calibri" w:cs="Calibri" w:eastAsia="Microsoft JhengHei" w:hAnsi="Calibri"/>
-        </w:rPr>
-        <w:t xml:space="preserve">) must fit that server.</w:t>
+        <w:t xml:space="preserve">The workflow writes .env on the server from the repo's GitHub Secrets and Variables (PG*, PORT, SEC_EDGAR_CONTACT), so they must fit that server. The login needs no extra secret: a SESSION_SECRET line left in the workflow is ignored.</w:t>
       </w:r>
     </w:p>
     <w:p>
@@ -5040,6 +4926,38 @@
           <w:rFonts w:ascii="Calibri" w:cs="Calibri" w:eastAsia="Microsoft JhengHei" w:hAnsi="Calibri"/>
         </w:rPr>
         <w:t xml:space="preserve">See the results at https://github.com/infocast-tw/company_profiles/actions.</w:t>
+      </w:r>
+    </w:p>
+    <w:p>
+      <w:pPr>
+        <w:pStyle w:val="ListParagraph"/>
+        <w:numPr>
+          <w:ilvl w:val="0"/>
+          <w:numId w:val="2"/>
+        </w:numPr>
+        <w:spacing w:after="60"/>
+      </w:pPr>
+      <w:r>
+        <w:rPr>
+          <w:rFonts w:ascii="Calibri" w:cs="Calibri" w:eastAsia="Microsoft JhengHei" w:hAnsi="Calibri"/>
+        </w:rPr>
+        <w:t xml:space="preserve">The site is https://company-profiler.levelfields.ai. Nginx on the VPS forwards it to the app in the container and must send X-Forwarded-For and X-Forwarded-Proto (see section 9). If the address shows Nginx's "Welcome to nginx!" page, Nginx's site configuration is missing on the VPS; the workflow doesn't manage Nginx.</w:t>
+      </w:r>
+    </w:p>
+    <w:p>
+      <w:pPr>
+        <w:pStyle w:val="ListParagraph"/>
+        <w:numPr>
+          <w:ilvl w:val="0"/>
+          <w:numId w:val="2"/>
+        </w:numPr>
+        <w:spacing w:after="60"/>
+      </w:pPr>
+      <w:r>
+        <w:rPr>
+          <w:rFonts w:ascii="Calibri" w:cs="Calibri" w:eastAsia="Microsoft JhengHei" w:hAnsi="Calibri"/>
+        </w:rPr>
+        <w:t xml:space="preserve">Merging main into the branch: do it in a separate git worktree, because the branch tracks a .env (checking it out overwrites your local .env). If .env conflicts with main's .env.example, keep the branch's settings (database, PORT); main's comment lines can be dropped.</w:t>
       </w:r>
     </w:p>
     <w:p>
@@ -5534,6 +5452,27 @@
           <w:sz w:val="18"/>
           <w:szCs w:val="18"/>
         </w:rPr>
+        <w:t xml:space="preserve">        proxy_set_header X-Forwarded-Proto $scheme;</w:t>
+      </w:r>
+    </w:p>
+    <w:p>
+      <w:pPr>
+        <w:keepNext/>
+        <w:keepLines/>
+        <w:pBdr>
+          <w:left w:val="single" w:color="D9D9D9" w:sz="4" w:space="6"/>
+          <w:right w:val="single" w:color="D9D9D9" w:sz="4" w:space="6"/>
+        </w:pBdr>
+        <w:shd w:fill="F2F2F2" w:color="auto" w:val="clear"/>
+        <w:spacing w:after="0" w:before="0" w:line="228"/>
+        <w:ind w:left="200" w:right="200"/>
+      </w:pPr>
+      <w:r>
+        <w:rPr>
+          <w:rFonts w:ascii="Consolas" w:cs="Consolas" w:eastAsia="Microsoft JhengHei" w:hAnsi="Consolas"/>
+          <w:sz w:val="18"/>
+          <w:szCs w:val="18"/>
+        </w:rPr>
         <w:t xml:space="preserve">        proxy_read_timeout 60s;   # adding a stock can take up to 20s of lookups</w:t>
       </w:r>
     </w:p>
@@ -5667,6 +5606,22 @@
           <w:rFonts w:ascii="Calibri" w:cs="Calibri" w:eastAsia="Microsoft JhengHei" w:hAnsi="Calibri"/>
         </w:rPr>
         <w:t xml:space="preserve">.</w:t>
+      </w:r>
+    </w:p>
+    <w:p>
+      <w:pPr>
+        <w:pStyle w:val="ListParagraph"/>
+        <w:numPr>
+          <w:ilvl w:val="0"/>
+          <w:numId w:val="2"/>
+        </w:numPr>
+        <w:spacing w:after="60"/>
+      </w:pPr>
+      <w:r>
+        <w:rPr>
+          <w:rFonts w:ascii="Calibri" w:cs="Calibri" w:eastAsia="Microsoft JhengHei" w:hAnsi="Calibri"/>
+        </w:rPr>
+        <w:t xml:space="preserve">Keep both X-Forwarded lines. The app counts failed logins per visitor IP: without X-Forwarded-For every visitor has Nginx's address, and one person's 10 failed logins lock everyone out for 15 minutes. X-Forwarded-Proto tells the app the page was opened over https, so the login cookie is marked Secure.</w:t>
       </w:r>
     </w:p>
     <w:p>
@@ -6676,7 +6631,7 @@
                 <w:sz w:val="20"/>
                 <w:szCs w:val="20"/>
               </w:rPr>
-              <w:t xml:space="preserve">The daily check doesn't run</w:t>
+              <w:t xml:space="preserve">Everyone gets "Too many failed logins" at once</w:t>
             </w:r>
           </w:p>
         </w:tc>
@@ -6707,16 +6662,62 @@
                 <w:sz w:val="19"/>
                 <w:szCs w:val="19"/>
               </w:rPr>
-              <w:t xml:space="preserve">MONITOR_DAILY_AT</w:t>
-            </w:r>
+              <w:t xml:space="preserve">Nginx doesn't send X-Forwarded-For, so every visitor has Nginx's address. Add the lines from section 9 and reload Nginx.</w:t>
+            </w:r>
+          </w:p>
+        </w:tc>
+      </w:tr>
+      <w:tr>
+        <w:tc>
+          <w:tcPr>
+            <w:tcW w:type="dxa" w:w="4364"/>
+            <w:tcBorders>
+              <w:top w:val="single" w:color="BFBFBF" w:sz="4"/>
+              <w:left w:val="single" w:color="BFBFBF" w:sz="4"/>
+              <w:bottom w:val="single" w:color="BFBFBF" w:sz="4"/>
+              <w:right w:val="single" w:color="BFBFBF" w:sz="4"/>
+            </w:tcBorders>
+            <w:tcMar>
+              <w:top w:type="dxa" w:w="60"/>
+              <w:left w:type="dxa" w:w="100"/>
+              <w:bottom w:type="dxa" w:w="60"/>
+              <w:right w:type="dxa" w:w="100"/>
+            </w:tcMar>
+          </w:tcPr>
+          <w:p>
+            <w:pPr>
+              <w:spacing w:after="0"/>
+            </w:pPr>
             <w:r>
               <w:rPr>
                 <w:rFonts w:ascii="Calibri" w:cs="Calibri" w:eastAsia="Microsoft JhengHei" w:hAnsi="Calibri"/>
                 <w:sz w:val="20"/>
                 <w:szCs w:val="20"/>
               </w:rPr>
-              <w:t xml:space="preserve"> isn't set, or you expected a different time zone (it uses </w:t>
-            </w:r>
+              <w:t xml:space="preserve">The address shows "Welcome to nginx!" and /api answers Nginx's 404</w:t>
+            </w:r>
+          </w:p>
+        </w:tc>
+        <w:tc>
+          <w:tcPr>
+            <w:tcW w:type="dxa" w:w="4942"/>
+            <w:tcBorders>
+              <w:top w:val="single" w:color="BFBFBF" w:sz="4"/>
+              <w:left w:val="single" w:color="BFBFBF" w:sz="4"/>
+              <w:bottom w:val="single" w:color="BFBFBF" w:sz="4"/>
+              <w:right w:val="single" w:color="BFBFBF" w:sz="4"/>
+            </w:tcBorders>
+            <w:tcMar>
+              <w:top w:type="dxa" w:w="60"/>
+              <w:left w:type="dxa" w:w="100"/>
+              <w:bottom w:type="dxa" w:w="60"/>
+              <w:right w:type="dxa" w:w="100"/>
+            </w:tcMar>
+          </w:tcPr>
+          <w:p>
+            <w:pPr>
+              <w:spacing w:after="0"/>
+            </w:pPr>
             <w:r>
               <w:rPr>
                 <w:rFonts w:ascii="Consolas" w:cs="Consolas" w:eastAsia="Microsoft JhengHei" w:hAnsi="Consolas"/>
@@ -6724,16 +6725,62 @@
                 <w:sz w:val="19"/>
                 <w:szCs w:val="19"/>
               </w:rPr>
-              <w:t xml:space="preserve">APP_TZ</w:t>
-            </w:r>
+              <w:t xml:space="preserve">Nginx's site configuration for the app is missing or disabled. Recreate it as in section 9 (proxy_pass to the app's address and PORT), then run nginx -t and reload Nginx.</w:t>
+            </w:r>
+          </w:p>
+        </w:tc>
+      </w:tr>
+      <w:tr>
+        <w:tc>
+          <w:tcPr>
+            <w:tcW w:type="dxa" w:w="4364"/>
+            <w:tcBorders>
+              <w:top w:val="single" w:color="BFBFBF" w:sz="4"/>
+              <w:left w:val="single" w:color="BFBFBF" w:sz="4"/>
+              <w:bottom w:val="single" w:color="BFBFBF" w:sz="4"/>
+              <w:right w:val="single" w:color="BFBFBF" w:sz="4"/>
+            </w:tcBorders>
+            <w:tcMar>
+              <w:top w:type="dxa" w:w="60"/>
+              <w:left w:type="dxa" w:w="100"/>
+              <w:bottom w:type="dxa" w:w="60"/>
+              <w:right w:type="dxa" w:w="100"/>
+            </w:tcMar>
+          </w:tcPr>
+          <w:p>
+            <w:pPr>
+              <w:spacing w:after="0"/>
+            </w:pPr>
             <w:r>
               <w:rPr>
                 <w:rFonts w:ascii="Calibri" w:cs="Calibri" w:eastAsia="Microsoft JhengHei" w:hAnsi="Calibri"/>
                 <w:sz w:val="20"/>
                 <w:szCs w:val="20"/>
               </w:rPr>
-              <w:t xml:space="preserve">). Look for </w:t>
-            </w:r>
+              <w:t xml:space="preserve">Login fails although the password is right</w:t>
+            </w:r>
+          </w:p>
+        </w:tc>
+        <w:tc>
+          <w:tcPr>
+            <w:tcW w:type="dxa" w:w="4942"/>
+            <w:tcBorders>
+              <w:top w:val="single" w:color="BFBFBF" w:sz="4"/>
+              <w:left w:val="single" w:color="BFBFBF" w:sz="4"/>
+              <w:bottom w:val="single" w:color="BFBFBF" w:sz="4"/>
+              <w:right w:val="single" w:color="BFBFBF" w:sz="4"/>
+            </w:tcBorders>
+            <w:tcMar>
+              <w:top w:type="dxa" w:w="60"/>
+              <w:left w:type="dxa" w:w="100"/>
+              <w:bottom w:type="dxa" w:w="60"/>
+              <w:right w:type="dxa" w:w="100"/>
+            </w:tcMar>
+          </w:tcPr>
+          <w:p>
+            <w:pPr>
+              <w:spacing w:after="0"/>
+            </w:pPr>
             <w:r>
               <w:rPr>
                 <w:rFonts w:ascii="Consolas" w:cs="Consolas" w:eastAsia="Microsoft JhengHei" w:hAnsi="Consolas"/>
@@ -6741,15 +6788,7 @@
                 <w:sz w:val="19"/>
                 <w:szCs w:val="19"/>
               </w:rPr>
-              <w:t xml:space="preserve">[monitor] daily check scheduled for ...</w:t>
-            </w:r>
-            <w:r>
-              <w:rPr>
-                <w:rFonts w:ascii="Calibri" w:cs="Calibri" w:eastAsia="Microsoft JhengHei" w:hAnsi="Calibri"/>
-                <w:sz w:val="20"/>
-                <w:szCs w:val="20"/>
-              </w:rPr>
-              <w:t xml:space="preserve"> in the log.</w:t>
+              <w:t xml:space="preserve">The account must be role LABEL with status true in test.users of the database the server's .env points to, which may differ from your local one.</w:t>
             </w:r>
           </w:p>
         </w:tc>

</xml_diff>